<commit_message>
Update Robotics Software and Programming report: revise submission date and enhance abstract for clarity
</commit_message>
<xml_diff>
--- a/Sem2/Robotics Software and Programming/Report.docx
+++ b/Sem2/Robotics Software and Programming/Report.docx
@@ -398,7 +398,43 @@
           <w:sz w:val="28"/>
           <w:szCs w:val="28"/>
         </w:rPr>
-        <w:t>23 / September / 2026</w:t>
+        <w:t>9</w:t>
+      </w:r>
+      <w:r>
+        <w:rPr>
+          <w:rFonts w:cs="Times New Roman"/>
+          <w:bCs/>
+          <w:sz w:val="28"/>
+          <w:szCs w:val="28"/>
+        </w:rPr>
+        <w:t xml:space="preserve"> / </w:t>
+      </w:r>
+      <w:r>
+        <w:rPr>
+          <w:rFonts w:cs="Times New Roman"/>
+          <w:bCs/>
+          <w:sz w:val="28"/>
+          <w:szCs w:val="28"/>
+        </w:rPr>
+        <w:t>October</w:t>
+      </w:r>
+      <w:r>
+        <w:rPr>
+          <w:rFonts w:cs="Times New Roman"/>
+          <w:bCs/>
+          <w:sz w:val="28"/>
+          <w:szCs w:val="28"/>
+        </w:rPr>
+        <w:t xml:space="preserve"> </w:t>
+      </w:r>
+      <w:r>
+        <w:rPr>
+          <w:rFonts w:cs="Times New Roman"/>
+          <w:bCs/>
+          <w:sz w:val="28"/>
+          <w:szCs w:val="28"/>
+        </w:rPr>
+        <w:t>/ 2026</w:t>
       </w:r>
     </w:p>
     <w:p>
@@ -1083,8 +1119,8 @@
         <w:tblLook w:val="04A0" w:firstRow="1" w:lastRow="0" w:firstColumn="1" w:lastColumn="0" w:noHBand="0" w:noVBand="1"/>
       </w:tblPr>
       <w:tblGrid>
-        <w:gridCol w:w="4409"/>
-        <w:gridCol w:w="4540"/>
+        <w:gridCol w:w="4663"/>
+        <w:gridCol w:w="4286"/>
       </w:tblGrid>
       <w:tr>
         <w:trPr>
@@ -1302,7 +1338,21 @@
                 <w:rFonts w:cs="Times New Roman"/>
                 <w:bCs/>
               </w:rPr>
-              <w:t>23 / September / 2026</w:t>
+              <w:t xml:space="preserve">23 / </w:t>
+            </w:r>
+            <w:r>
+              <w:rPr>
+                <w:rFonts w:cs="Times New Roman"/>
+                <w:bCs/>
+              </w:rPr>
+              <w:t>October</w:t>
+            </w:r>
+            <w:r>
+              <w:rPr>
+                <w:rFonts w:cs="Times New Roman"/>
+                <w:bCs/>
+              </w:rPr>
+              <w:t xml:space="preserve"> / 2026</w:t>
             </w:r>
           </w:p>
         </w:tc>
@@ -1445,19 +1495,7 @@
         <w:rPr>
           <w:rStyle w:val="Hyperlink"/>
         </w:rPr>
-        <w:t>https://github.com/Amaan9136/bsbi-assignments/tree/main/Sem2/Robotics%20Software%20and%20Programming/task</w:t>
-      </w:r>
-      <w:r>
-        <w:rPr>
-          <w:rStyle w:val="Hyperlink"/>
-        </w:rPr>
-        <w:t>2</w:t>
-      </w:r>
-      <w:r>
-        <w:rPr>
-          <w:rStyle w:val="Hyperlink"/>
-        </w:rPr>
-        <w:t>-code</w:t>
+        <w:t>https://github.com/Amaan9136/bsbi-assignments/tree/main/Sem2/Robotics%20Software%20and%20Programming/task2-code</w:t>
       </w:r>
       <w:r>
         <w:rPr>
@@ -3677,21 +3715,7 @@
             <w:rStyle w:val="Hyperlink"/>
             <w:noProof/>
           </w:rPr>
-          <w:t>Table 2: ROS2 node architect</w:t>
-        </w:r>
-        <w:r>
-          <w:rPr>
-            <w:rStyle w:val="Hyperlink"/>
-            <w:noProof/>
-          </w:rPr>
-          <w:t>u</w:t>
-        </w:r>
-        <w:r>
-          <w:rPr>
-            <w:rStyle w:val="Hyperlink"/>
-            <w:noProof/>
-          </w:rPr>
-          <w:t>re.</w:t>
+          <w:t>Table 2: ROS2 node architecture.</w:t>
         </w:r>
         <w:r>
           <w:rPr>
@@ -4191,7 +4215,21 @@
           <w:rFonts w:cs="Times New Roman"/>
           <w:u w:val="dotted"/>
         </w:rPr>
-        <w:t>23 / September / 2026</w:t>
+        <w:t xml:space="preserve">23 / </w:t>
+      </w:r>
+      <w:r>
+        <w:rPr>
+          <w:rFonts w:cs="Times New Roman"/>
+          <w:u w:val="dotted"/>
+        </w:rPr>
+        <w:t xml:space="preserve">October </w:t>
+      </w:r>
+      <w:r>
+        <w:rPr>
+          <w:rFonts w:cs="Times New Roman"/>
+          <w:u w:val="dotted"/>
+        </w:rPr>
+        <w:t>/ 2026</w:t>
       </w:r>
     </w:p>
     <w:p>
@@ -4234,6 +4272,279 @@
         <w:spacing w:after="180" w:line="360" w:lineRule="auto"/>
         <w:rPr>
           <w:rFonts w:eastAsia="Times New Roman" w:cs="Times New Roman"/>
+          <w:color w:val="000000"/>
+          <w:kern w:val="0"/>
+          <w:lang w:eastAsia="en-GB"/>
+          <w14:ligatures w14:val="none"/>
+        </w:rPr>
+      </w:pPr>
+      <w:r>
+        <w:rPr>
+          <w:rFonts w:eastAsia="Times New Roman" w:cs="Times New Roman"/>
+          <w:color w:val="000000"/>
+          <w:kern w:val="0"/>
+          <w:lang w:eastAsia="en-GB"/>
+          <w14:ligatures w14:val="none"/>
+        </w:rPr>
+        <w:t xml:space="preserve">This report covers two exercises for the Robotics Software and Programming module. Task 1 is a </w:t>
+      </w:r>
+      <w:proofErr w:type="spellStart"/>
+      <w:r>
+        <w:rPr>
+          <w:rFonts w:eastAsia="Times New Roman" w:cs="Times New Roman"/>
+          <w:color w:val="000000"/>
+          <w:kern w:val="0"/>
+          <w:lang w:eastAsia="en-GB"/>
+          <w14:ligatures w14:val="none"/>
+        </w:rPr>
+        <w:t>PyBullet</w:t>
+      </w:r>
+      <w:proofErr w:type="spellEnd"/>
+      <w:r>
+        <w:rPr>
+          <w:rFonts w:eastAsia="Times New Roman" w:cs="Times New Roman"/>
+          <w:color w:val="000000"/>
+          <w:kern w:val="0"/>
+          <w:lang w:eastAsia="en-GB"/>
+          <w14:ligatures w14:val="none"/>
+        </w:rPr>
+        <w:t xml:space="preserve"> simulation of an inspection and light-warehousing room with five URDF object categories, fourteen objects, a two-wheel robot and six camera viewpoints. A dictionary called </w:t>
+      </w:r>
+      <w:proofErr w:type="spellStart"/>
+      <w:r>
+        <w:rPr>
+          <w:rFonts w:eastAsia="Times New Roman" w:cs="Times New Roman"/>
+          <w:color w:val="000000"/>
+          <w:kern w:val="0"/>
+          <w:lang w:eastAsia="en-GB"/>
+          <w14:ligatures w14:val="none"/>
+        </w:rPr>
+        <w:t>semantic_db</w:t>
+      </w:r>
+      <w:proofErr w:type="spellEnd"/>
+      <w:r>
+        <w:rPr>
+          <w:rFonts w:eastAsia="Times New Roman" w:cs="Times New Roman"/>
+          <w:color w:val="000000"/>
+          <w:kern w:val="0"/>
+          <w:lang w:eastAsia="en-GB"/>
+          <w14:ligatures w14:val="none"/>
+        </w:rPr>
+        <w:t xml:space="preserve"> stores each object's role and supports role lookups and nearest-target queries. Task 2 is a TurtleBot3 patrol robot in ROS2 with a six-state finite state machine. It runs in a custom Gazebo warehouse world with eight pallet obstacles and four checkpoints, one of which is the charging dock. The robot plans a route, avoids obstacles using LIDAR and odometry, and takes keyboard commands. A monitoring node logs state transitions and mission metrics. The mission reached MISSION_COMPLETE on TheConstruct.ai in </w:t>
+      </w:r>
+      <w:proofErr w:type="spellStart"/>
+      <w:r>
+        <w:rPr>
+          <w:rFonts w:eastAsia="Times New Roman" w:cs="Times New Roman"/>
+          <w:color w:val="000000"/>
+          <w:kern w:val="0"/>
+          <w:lang w:eastAsia="en-GB"/>
+          <w14:ligatures w14:val="none"/>
+        </w:rPr>
+        <w:t>Rosject</w:t>
+      </w:r>
+      <w:proofErr w:type="spellEnd"/>
+      <w:r>
+        <w:rPr>
+          <w:rFonts w:eastAsia="Times New Roman" w:cs="Times New Roman"/>
+          <w:color w:val="000000"/>
+          <w:kern w:val="0"/>
+          <w:lang w:eastAsia="en-GB"/>
+          <w14:ligatures w14:val="none"/>
+        </w:rPr>
+        <w:t xml:space="preserve"> </w:t>
+      </w:r>
+      <w:proofErr w:type="spellStart"/>
+      <w:r>
+        <w:rPr>
+          <w:rFonts w:eastAsia="Times New Roman" w:cs="Times New Roman"/>
+          <w:color w:val="000000"/>
+          <w:kern w:val="0"/>
+          <w:lang w:eastAsia="en-GB"/>
+          <w14:ligatures w14:val="none"/>
+        </w:rPr>
+        <w:t>XctZpczWOA</w:t>
+      </w:r>
+      <w:proofErr w:type="spellEnd"/>
+      <w:r>
+        <w:rPr>
+          <w:rFonts w:eastAsia="Times New Roman" w:cs="Times New Roman"/>
+          <w:color w:val="000000"/>
+          <w:kern w:val="0"/>
+          <w:lang w:eastAsia="en-GB"/>
+          <w14:ligatures w14:val="none"/>
+        </w:rPr>
+        <w:t>, and a local ROS2 Jazzy and Gazebo Harmonic workspace was used for extra checks.</w:t>
+      </w:r>
+      <w:bookmarkStart w:id="2" w:name="introduction"/>
+      <w:bookmarkEnd w:id="1"/>
+      <w:r>
+        <w:rPr>
+          <w:rFonts w:eastAsia="Times New Roman" w:cs="Times New Roman"/>
+          <w:color w:val="000000"/>
+          <w:kern w:val="0"/>
+          <w:lang w:eastAsia="en-GB"/>
+          <w14:ligatures w14:val="none"/>
+        </w:rPr>
+        <w:br w:type="page"/>
+      </w:r>
+    </w:p>
+    <w:p>
+      <w:pPr>
+        <w:pStyle w:val="Heading1"/>
+      </w:pPr>
+      <w:bookmarkStart w:id="3" w:name="_Toc241707425"/>
+      <w:r>
+        <w:lastRenderedPageBreak/>
+        <w:t>I</w:t>
+      </w:r>
+      <w:r>
+        <w:t>ntroduction</w:t>
+      </w:r>
+      <w:bookmarkEnd w:id="3"/>
+    </w:p>
+    <w:p>
+      <w:pPr>
+        <w:spacing w:after="180" w:line="360" w:lineRule="auto"/>
+        <w:rPr>
+          <w:rFonts w:eastAsia="Times New Roman" w:cs="Times New Roman"/>
+          <w:color w:val="000000"/>
+          <w:kern w:val="0"/>
+          <w:lang w:eastAsia="en-GB"/>
+          <w14:ligatures w14:val="none"/>
+        </w:rPr>
+      </w:pPr>
+      <w:r>
+        <w:rPr>
+          <w:rFonts w:eastAsia="Times New Roman" w:cs="Times New Roman"/>
+          <w:color w:val="000000"/>
+          <w:kern w:val="0"/>
+          <w:lang w:eastAsia="en-GB"/>
+          <w14:ligatures w14:val="none"/>
+        </w:rPr>
+        <w:t xml:space="preserve">The module asks us to design, build and test robot software in simulation, </w:t>
+      </w:r>
+      <w:r>
+        <w:rPr>
+          <w:rFonts w:eastAsia="Times New Roman" w:cs="Times New Roman"/>
+          <w:color w:val="000000"/>
+          <w:kern w:val="0"/>
+          <w:lang w:eastAsia="en-GB"/>
+          <w14:ligatures w14:val="none"/>
+        </w:rPr>
+        <w:t>with no physical hardware</w:t>
+      </w:r>
+      <w:r>
+        <w:rPr>
+          <w:rFonts w:eastAsia="Times New Roman" w:cs="Times New Roman"/>
+          <w:color w:val="000000"/>
+          <w:kern w:val="0"/>
+          <w:lang w:eastAsia="en-GB"/>
+          <w14:ligatures w14:val="none"/>
+        </w:rPr>
+        <w:t xml:space="preserve">. </w:t>
+      </w:r>
+      <w:r>
+        <w:rPr>
+          <w:rFonts w:eastAsia="Times New Roman" w:cs="Times New Roman"/>
+          <w:color w:val="000000"/>
+          <w:kern w:val="0"/>
+          <w:lang w:eastAsia="en-GB"/>
+          <w14:ligatures w14:val="none"/>
+        </w:rPr>
+        <w:t xml:space="preserve">The brief, Dynamic Robotics Simulation and Autonomous System Design, sets out </w:t>
+      </w:r>
+      <w:r>
+        <w:rPr>
+          <w:rFonts w:eastAsia="Times New Roman" w:cs="Times New Roman"/>
+          <w:color w:val="000000"/>
+          <w:kern w:val="0"/>
+          <w:lang w:eastAsia="en-GB"/>
+          <w14:ligatures w14:val="none"/>
+        </w:rPr>
+        <w:t xml:space="preserve">two stages of increasing complexity. The first is an interactive </w:t>
+      </w:r>
+      <w:proofErr w:type="spellStart"/>
+      <w:r>
+        <w:rPr>
+          <w:rFonts w:eastAsia="Times New Roman" w:cs="Times New Roman"/>
+          <w:color w:val="000000"/>
+          <w:kern w:val="0"/>
+          <w:lang w:eastAsia="en-GB"/>
+          <w14:ligatures w14:val="none"/>
+        </w:rPr>
+        <w:t>PyBullet</w:t>
+      </w:r>
+      <w:proofErr w:type="spellEnd"/>
+      <w:r>
+        <w:rPr>
+          <w:rFonts w:eastAsia="Times New Roman" w:cs="Times New Roman"/>
+          <w:color w:val="000000"/>
+          <w:kern w:val="0"/>
+          <w:lang w:eastAsia="en-GB"/>
+          <w14:ligatures w14:val="none"/>
+        </w:rPr>
+        <w:t xml:space="preserve"> environment with object-level semantics. The second is a ROS2-based autonomous system</w:t>
+      </w:r>
+      <w:r>
+        <w:rPr>
+          <w:rFonts w:eastAsia="Times New Roman" w:cs="Times New Roman"/>
+          <w:color w:val="000000"/>
+          <w:kern w:val="0"/>
+          <w:lang w:eastAsia="en-GB"/>
+          <w14:ligatures w14:val="none"/>
+        </w:rPr>
+        <w:t xml:space="preserve"> with sensing, navigation, human interaction and self-monitoring. </w:t>
+      </w:r>
+      <w:r>
+        <w:rPr>
+          <w:rFonts w:eastAsia="Times New Roman" w:cs="Times New Roman"/>
+          <w:color w:val="000000"/>
+          <w:kern w:val="0"/>
+          <w:lang w:eastAsia="en-GB"/>
+          <w14:ligatures w14:val="none"/>
+        </w:rPr>
+        <w:t>The two stages use different tools, but the guidelines ask for one report, so both are covered here using the BSBI template.</w:t>
+      </w:r>
+    </w:p>
+    <w:p>
+      <w:pPr>
+        <w:spacing w:after="180" w:line="360" w:lineRule="auto"/>
+        <w:rPr>
+          <w:rFonts w:eastAsia="Times New Roman" w:cs="Times New Roman"/>
+          <w:color w:val="000000"/>
+          <w:kern w:val="0"/>
+          <w:lang w:eastAsia="en-GB"/>
+          <w14:ligatures w14:val="none"/>
+        </w:rPr>
+      </w:pPr>
+      <w:r>
+        <w:rPr>
+          <w:rFonts w:eastAsia="Times New Roman" w:cs="Times New Roman"/>
+          <w:color w:val="000000"/>
+          <w:kern w:val="0"/>
+          <w:lang w:eastAsia="en-GB"/>
+          <w14:ligatures w14:val="none"/>
+        </w:rPr>
+        <w:t>In Task 1, every object in the simulated room gets a role (obstacle, target, landmark, shelf or charger) that is stored and can be looked up in code. Task 2 applies the idea to a moving robot that reads LIDAR and odometry, switches between behaviour states, and reports what it did and why</w:t>
+      </w:r>
+      <w:r>
+        <w:rPr>
+          <w:rFonts w:eastAsia="Times New Roman" w:cs="Times New Roman"/>
+          <w:color w:val="000000"/>
+          <w:kern w:val="0"/>
+          <w:lang w:eastAsia="en-GB"/>
+          <w14:ligatures w14:val="none"/>
+        </w:rPr>
+        <w:t>.</w:t>
+      </w:r>
+    </w:p>
+    <w:p>
+      <w:pPr>
+        <w:spacing w:after="160"/>
+        <w:jc w:val="left"/>
+        <w:rPr>
+          <w:rFonts w:eastAsia="Times New Roman" w:cs="Times New Roman"/>
           <w:b/>
           <w:bCs/>
           <w:color w:val="000000"/>
@@ -4244,126 +4555,8 @@
           <w14:ligatures w14:val="none"/>
         </w:rPr>
       </w:pPr>
-      <w:r>
-        <w:rPr>
-          <w:rFonts w:eastAsia="Times New Roman" w:cs="Times New Roman"/>
-          <w:color w:val="000000"/>
-          <w:kern w:val="0"/>
-          <w:lang w:eastAsia="en-GB"/>
-          <w14:ligatures w14:val="none"/>
-        </w:rPr>
-        <w:t xml:space="preserve">This report covers two practical exercises for the Robotics Software and Programming module. Task 1 is a </w:t>
-      </w:r>
-      <w:proofErr w:type="spellStart"/>
-      <w:r>
-        <w:rPr>
-          <w:rFonts w:eastAsia="Times New Roman" w:cs="Times New Roman"/>
-          <w:color w:val="000000"/>
-          <w:kern w:val="0"/>
-          <w:lang w:eastAsia="en-GB"/>
-          <w14:ligatures w14:val="none"/>
-        </w:rPr>
-        <w:t>PyBullet</w:t>
-      </w:r>
-      <w:proofErr w:type="spellEnd"/>
-      <w:r>
-        <w:rPr>
-          <w:rFonts w:eastAsia="Times New Roman" w:cs="Times New Roman"/>
-          <w:color w:val="000000"/>
-          <w:kern w:val="0"/>
-          <w:lang w:eastAsia="en-GB"/>
-          <w14:ligatures w14:val="none"/>
-        </w:rPr>
-        <w:t xml:space="preserve"> simulation of a small inspection and light-warehousing room. It uses five custom URDF object categories, a two-wheel robot, fourteen placed objects and six camera viewpoints. A dictionary called </w:t>
-      </w:r>
-      <w:proofErr w:type="spellStart"/>
-      <w:r>
-        <w:rPr>
-          <w:rFonts w:eastAsia="Times New Roman" w:cs="Times New Roman"/>
-          <w:color w:val="000000"/>
-          <w:kern w:val="0"/>
-          <w:lang w:eastAsia="en-GB"/>
-          <w14:ligatures w14:val="none"/>
-        </w:rPr>
-        <w:t>semantic_db</w:t>
-      </w:r>
-      <w:proofErr w:type="spellEnd"/>
-      <w:r>
-        <w:rPr>
-          <w:rFonts w:eastAsia="Times New Roman" w:cs="Times New Roman"/>
-          <w:color w:val="000000"/>
-          <w:kern w:val="0"/>
-          <w:lang w:eastAsia="en-GB"/>
-          <w14:ligatures w14:val="none"/>
-        </w:rPr>
-        <w:t xml:space="preserve"> stores each object's role and supports role lookup and nearest-target queries. Task 2 is a TurtleBot3 patrol robot in ROS2 with a six-state finite state machine. It runs in a custom Gazebo warehouse world with eight pallet obstacles and four checkpoints, one of which is the charging dock. The robot uses path planning, </w:t>
-      </w:r>
-      <w:r>
-        <w:rPr>
-          <w:rFonts w:eastAsia="Times New Roman" w:cs="Times New Roman"/>
-          <w:color w:val="000000"/>
-          <w:kern w:val="0"/>
-          <w:lang w:eastAsia="en-GB"/>
-          <w14:ligatures w14:val="none"/>
-        </w:rPr>
-        <w:t>LIDAR and odometry-based obstacle avoidance, and a keyboard interaction node</w:t>
-      </w:r>
-      <w:r>
-        <w:rPr>
-          <w:rFonts w:eastAsia="Times New Roman" w:cs="Times New Roman"/>
-          <w:color w:val="000000"/>
-          <w:kern w:val="0"/>
-          <w:lang w:eastAsia="en-GB"/>
-          <w14:ligatures w14:val="none"/>
-        </w:rPr>
-        <w:t xml:space="preserve">. A monitoring node logs state transitions and mission metrics. Task 2 was run to MISSION_COMPLETE on TheConstruct.ai in </w:t>
-      </w:r>
-      <w:proofErr w:type="spellStart"/>
-      <w:r>
-        <w:rPr>
-          <w:rFonts w:eastAsia="Times New Roman" w:cs="Times New Roman"/>
-          <w:color w:val="000000"/>
-          <w:kern w:val="0"/>
-          <w:lang w:eastAsia="en-GB"/>
-          <w14:ligatures w14:val="none"/>
-        </w:rPr>
-        <w:t>Rosject</w:t>
-      </w:r>
-      <w:proofErr w:type="spellEnd"/>
-      <w:r>
-        <w:rPr>
-          <w:rFonts w:eastAsia="Times New Roman" w:cs="Times New Roman"/>
-          <w:color w:val="000000"/>
-          <w:kern w:val="0"/>
-          <w:lang w:eastAsia="en-GB"/>
-          <w14:ligatures w14:val="none"/>
-        </w:rPr>
-        <w:t xml:space="preserve"> </w:t>
-      </w:r>
-      <w:proofErr w:type="spellStart"/>
-      <w:r>
-        <w:rPr>
-          <w:rFonts w:eastAsia="Times New Roman" w:cs="Times New Roman"/>
-          <w:color w:val="000000"/>
-          <w:kern w:val="0"/>
-          <w:lang w:eastAsia="en-GB"/>
-          <w14:ligatures w14:val="none"/>
-        </w:rPr>
-        <w:t>XctZpczWOA</w:t>
-      </w:r>
-      <w:proofErr w:type="spellEnd"/>
-      <w:r>
-        <w:rPr>
-          <w:rFonts w:eastAsia="Times New Roman" w:cs="Times New Roman"/>
-          <w:color w:val="000000"/>
-          <w:kern w:val="0"/>
-          <w:lang w:eastAsia="en-GB"/>
-          <w14:ligatures w14:val="none"/>
-        </w:rPr>
-        <w:t>. A local ROS2 Jazzy and Gazebo Harmonic workspace was used for extra checks.</w:t>
-      </w:r>
-      <w:bookmarkStart w:id="2" w:name="introduction"/>
-      <w:bookmarkEnd w:id="1"/>
+      <w:bookmarkStart w:id="4" w:name="X8f500a1b17ce880a56c76a82243d9dad512dc6d"/>
+      <w:bookmarkEnd w:id="2"/>
       <w:r>
         <w:rPr>
           <w:rFonts w:eastAsia="Times New Roman" w:cs="Times New Roman"/>
@@ -4383,186 +4576,6 @@
       <w:pPr>
         <w:pStyle w:val="Heading1"/>
       </w:pPr>
-      <w:bookmarkStart w:id="3" w:name="_Toc241707425"/>
-      <w:r>
-        <w:lastRenderedPageBreak/>
-        <w:t>Introduction</w:t>
-      </w:r>
-      <w:bookmarkEnd w:id="3"/>
-    </w:p>
-    <w:p>
-      <w:pPr>
-        <w:spacing w:after="180" w:line="360" w:lineRule="auto"/>
-        <w:rPr>
-          <w:rFonts w:eastAsia="Times New Roman" w:cs="Times New Roman"/>
-          <w:color w:val="000000"/>
-          <w:kern w:val="0"/>
-          <w:lang w:eastAsia="en-GB"/>
-          <w14:ligatures w14:val="none"/>
-        </w:rPr>
-      </w:pPr>
-      <w:r>
-        <w:rPr>
-          <w:rFonts w:eastAsia="Times New Roman" w:cs="Times New Roman"/>
-          <w:color w:val="000000"/>
-          <w:kern w:val="0"/>
-          <w:lang w:eastAsia="en-GB"/>
-          <w14:ligatures w14:val="none"/>
-        </w:rPr>
-        <w:t xml:space="preserve">The module asks us to design, build and test robot software in simulation, </w:t>
-      </w:r>
-      <w:r>
-        <w:rPr>
-          <w:rFonts w:eastAsia="Times New Roman" w:cs="Times New Roman"/>
-          <w:color w:val="000000"/>
-          <w:kern w:val="0"/>
-          <w:lang w:eastAsia="en-GB"/>
-          <w14:ligatures w14:val="none"/>
-        </w:rPr>
-        <w:t>with no physical hardware</w:t>
-      </w:r>
-      <w:r>
-        <w:rPr>
-          <w:rFonts w:eastAsia="Times New Roman" w:cs="Times New Roman"/>
-          <w:color w:val="000000"/>
-          <w:kern w:val="0"/>
-          <w:lang w:eastAsia="en-GB"/>
-          <w14:ligatures w14:val="none"/>
-        </w:rPr>
-        <w:t xml:space="preserve">. </w:t>
-      </w:r>
-      <w:r>
-        <w:rPr>
-          <w:rFonts w:eastAsia="Times New Roman" w:cs="Times New Roman"/>
-          <w:color w:val="000000"/>
-          <w:kern w:val="0"/>
-          <w:lang w:eastAsia="en-GB"/>
-          <w14:ligatures w14:val="none"/>
-        </w:rPr>
-        <w:t xml:space="preserve">The brief, Dynamic Robotics Simulation and Autonomous System Design, sets out </w:t>
-      </w:r>
-      <w:r>
-        <w:rPr>
-          <w:rFonts w:eastAsia="Times New Roman" w:cs="Times New Roman"/>
-          <w:color w:val="000000"/>
-          <w:kern w:val="0"/>
-          <w:lang w:eastAsia="en-GB"/>
-          <w14:ligatures w14:val="none"/>
-        </w:rPr>
-        <w:t xml:space="preserve">two stages of increasing complexity. The first is an interactive </w:t>
-      </w:r>
-      <w:proofErr w:type="spellStart"/>
-      <w:r>
-        <w:rPr>
-          <w:rFonts w:eastAsia="Times New Roman" w:cs="Times New Roman"/>
-          <w:color w:val="000000"/>
-          <w:kern w:val="0"/>
-          <w:lang w:eastAsia="en-GB"/>
-          <w14:ligatures w14:val="none"/>
-        </w:rPr>
-        <w:t>PyBullet</w:t>
-      </w:r>
-      <w:proofErr w:type="spellEnd"/>
-      <w:r>
-        <w:rPr>
-          <w:rFonts w:eastAsia="Times New Roman" w:cs="Times New Roman"/>
-          <w:color w:val="000000"/>
-          <w:kern w:val="0"/>
-          <w:lang w:eastAsia="en-GB"/>
-          <w14:ligatures w14:val="none"/>
-        </w:rPr>
-        <w:t xml:space="preserve"> environment with object-level semantics. The second is a ROS2-based autonomous system</w:t>
-      </w:r>
-      <w:r>
-        <w:rPr>
-          <w:rFonts w:eastAsia="Times New Roman" w:cs="Times New Roman"/>
-          <w:color w:val="000000"/>
-          <w:kern w:val="0"/>
-          <w:lang w:eastAsia="en-GB"/>
-          <w14:ligatures w14:val="none"/>
-        </w:rPr>
-        <w:t xml:space="preserve"> with sensing, navigation, human interaction and self-monitoring. </w:t>
-      </w:r>
-      <w:r>
-        <w:rPr>
-          <w:rFonts w:eastAsia="Times New Roman" w:cs="Times New Roman"/>
-          <w:color w:val="000000"/>
-          <w:kern w:val="0"/>
-          <w:lang w:eastAsia="en-GB"/>
-          <w14:ligatures w14:val="none"/>
-        </w:rPr>
-        <w:t>The two stages use different tools, but the guidelines ask for one report, so both are covered here using the BSBI template.</w:t>
-      </w:r>
-    </w:p>
-    <w:p>
-      <w:pPr>
-        <w:spacing w:after="180" w:line="360" w:lineRule="auto"/>
-        <w:rPr>
-          <w:rFonts w:eastAsia="Times New Roman" w:cs="Times New Roman"/>
-          <w:color w:val="000000"/>
-          <w:kern w:val="0"/>
-          <w:lang w:eastAsia="en-GB"/>
-          <w14:ligatures w14:val="none"/>
-        </w:rPr>
-      </w:pPr>
-      <w:r>
-        <w:rPr>
-          <w:rFonts w:eastAsia="Times New Roman" w:cs="Times New Roman"/>
-          <w:color w:val="000000"/>
-          <w:kern w:val="0"/>
-          <w:lang w:eastAsia="en-GB"/>
-          <w14:ligatures w14:val="none"/>
-        </w:rPr>
-        <w:t>In Task 1, every object in the simulated room gets a role (obstacle, target, landmark, shelf or charger) that is stored and can be looked up in code. Task 2 applies the idea to a moving robot that reads LIDAR and odometry, switches between behaviour states, and reports what it did and why</w:t>
-      </w:r>
-      <w:r>
-        <w:rPr>
-          <w:rFonts w:eastAsia="Times New Roman" w:cs="Times New Roman"/>
-          <w:color w:val="000000"/>
-          <w:kern w:val="0"/>
-          <w:lang w:eastAsia="en-GB"/>
-          <w14:ligatures w14:val="none"/>
-        </w:rPr>
-        <w:t>.</w:t>
-      </w:r>
-    </w:p>
-    <w:p>
-      <w:pPr>
-        <w:spacing w:after="160"/>
-        <w:jc w:val="left"/>
-        <w:rPr>
-          <w:rFonts w:eastAsia="Times New Roman" w:cs="Times New Roman"/>
-          <w:b/>
-          <w:bCs/>
-          <w:color w:val="000000"/>
-          <w:kern w:val="0"/>
-          <w:sz w:val="32"/>
-          <w:szCs w:val="32"/>
-          <w:lang w:eastAsia="en-GB"/>
-          <w14:ligatures w14:val="none"/>
-        </w:rPr>
-      </w:pPr>
-      <w:bookmarkStart w:id="4" w:name="X8f500a1b17ce880a56c76a82243d9dad512dc6d"/>
-      <w:bookmarkEnd w:id="2"/>
-      <w:r>
-        <w:rPr>
-          <w:rFonts w:eastAsia="Times New Roman" w:cs="Times New Roman"/>
-          <w:b/>
-          <w:bCs/>
-          <w:color w:val="000000"/>
-          <w:kern w:val="0"/>
-          <w:sz w:val="32"/>
-          <w:szCs w:val="32"/>
-          <w:lang w:eastAsia="en-GB"/>
-          <w14:ligatures w14:val="none"/>
-        </w:rPr>
-        <w:br w:type="page"/>
-      </w:r>
-    </w:p>
-    <w:p>
-      <w:pPr>
-        <w:pStyle w:val="Heading1"/>
-      </w:pPr>
       <w:bookmarkStart w:id="5" w:name="_Toc241707426"/>
       <w:r>
         <w:lastRenderedPageBreak/>
@@ -4630,17 +4643,59 @@
           <w:lang w:eastAsia="en-GB"/>
           <w14:ligatures w14:val="none"/>
         </w:rPr>
-        <w:t xml:space="preserve"> scene where code could look up the role of each object as well as its position. I sketched the room on paper before writing any code. It was a six by four metre space with a single entrance</w:t>
-      </w:r>
-      <w:r>
-        <w:rPr>
-          <w:rFonts w:eastAsia="Times New Roman" w:cs="Times New Roman"/>
-          <w:color w:val="000000"/>
-          <w:kern w:val="0"/>
-          <w:lang w:eastAsia="en-GB"/>
-          <w14:ligatures w14:val="none"/>
-        </w:rPr>
-        <w:t>, a central aisle, storage shelving along the back wall, a charging dock near the entrance, and reference landmarks at each corner.</w:t>
+        <w:t xml:space="preserve"> scene where code could look up each object's role as well as its position</w:t>
+      </w:r>
+      <w:r>
+        <w:rPr>
+          <w:rFonts w:eastAsia="Times New Roman" w:cs="Times New Roman"/>
+          <w:color w:val="000000"/>
+          <w:kern w:val="0"/>
+          <w:lang w:eastAsia="en-GB"/>
+          <w14:ligatures w14:val="none"/>
+        </w:rPr>
+        <w:t xml:space="preserve">. I sketched the room on paper before writing any code. It was a six by four metre space with </w:t>
+      </w:r>
+      <w:r>
+        <w:rPr>
+          <w:rFonts w:eastAsia="Times New Roman" w:cs="Times New Roman"/>
+          <w:color w:val="000000"/>
+          <w:kern w:val="0"/>
+          <w:lang w:eastAsia="en-GB"/>
+          <w14:ligatures w14:val="none"/>
+        </w:rPr>
+        <w:t>one entrance, a central aisle, shelving along the back wall, a charging dock near the entrance and a landmark at each corner. I then turned the sketch into URDF categories and coordinates.</w:t>
+      </w:r>
+    </w:p>
+    <w:p>
+      <w:pPr>
+        <w:spacing w:after="180" w:line="360" w:lineRule="auto"/>
+        <w:rPr>
+          <w:rFonts w:eastAsia="Times New Roman" w:cs="Times New Roman"/>
+          <w:color w:val="000000"/>
+          <w:kern w:val="0"/>
+          <w:lang w:eastAsia="en-GB"/>
+          <w14:ligatures w14:val="none"/>
+        </w:rPr>
+      </w:pPr>
+      <w:r>
+        <w:rPr>
+          <w:rFonts w:eastAsia="Times New Roman" w:cs="Times New Roman"/>
+          <w:color w:val="000000"/>
+          <w:kern w:val="0"/>
+          <w:lang w:eastAsia="en-GB"/>
+          <w14:ligatures w14:val="none"/>
+        </w:rPr>
+        <w:t xml:space="preserve">The finished scene has fourteen objects in five URDF categories, </w:t>
+      </w:r>
+      <w:r>
+        <w:rPr>
+          <w:rFonts w:eastAsia="Times New Roman" w:cs="Times New Roman"/>
+          <w:color w:val="000000"/>
+          <w:kern w:val="0"/>
+          <w:lang w:eastAsia="en-GB"/>
+          <w14:ligatures w14:val="none"/>
+        </w:rPr>
+        <w:t>which is</w:t>
       </w:r>
       <w:r>
         <w:rPr>
@@ -4660,91 +4715,27 @@
           <w:lang w:eastAsia="en-GB"/>
           <w14:ligatures w14:val="none"/>
         </w:rPr>
-        <w:t>I then turned the sketch into URDF categories and coordinates, so</w:t>
-      </w:r>
-      <w:r>
-        <w:rPr>
-          <w:rFonts w:eastAsia="Times New Roman" w:cs="Times New Roman"/>
-          <w:color w:val="000000"/>
-          <w:kern w:val="0"/>
-          <w:lang w:eastAsia="en-GB"/>
-          <w14:ligatures w14:val="none"/>
-        </w:rPr>
-        <w:t xml:space="preserve"> </w:t>
-      </w:r>
-      <w:r>
-        <w:rPr>
-          <w:rFonts w:eastAsia="Times New Roman" w:cs="Times New Roman"/>
-          <w:color w:val="000000"/>
-          <w:kern w:val="0"/>
-          <w:lang w:eastAsia="en-GB"/>
-          <w14:ligatures w14:val="none"/>
-        </w:rPr>
-        <w:t>every object sits where I placed it.</w:t>
-      </w:r>
-    </w:p>
-    <w:p>
-      <w:pPr>
-        <w:spacing w:after="180" w:line="360" w:lineRule="auto"/>
-        <w:rPr>
-          <w:rFonts w:eastAsia="Times New Roman" w:cs="Times New Roman"/>
-          <w:color w:val="000000"/>
-          <w:kern w:val="0"/>
-          <w:lang w:eastAsia="en-GB"/>
-          <w14:ligatures w14:val="none"/>
-        </w:rPr>
-      </w:pPr>
-      <w:r>
-        <w:rPr>
-          <w:rFonts w:eastAsia="Times New Roman" w:cs="Times New Roman"/>
-          <w:color w:val="000000"/>
-          <w:kern w:val="0"/>
-          <w:lang w:eastAsia="en-GB"/>
-          <w14:ligatures w14:val="none"/>
-        </w:rPr>
-        <w:t xml:space="preserve">The finished scene has fourteen objects in five URDF categories, </w:t>
-      </w:r>
-      <w:r>
-        <w:rPr>
-          <w:rFonts w:eastAsia="Times New Roman" w:cs="Times New Roman"/>
-          <w:color w:val="000000"/>
-          <w:kern w:val="0"/>
-          <w:lang w:eastAsia="en-GB"/>
-          <w14:ligatures w14:val="none"/>
-        </w:rPr>
-        <w:t>which is above the brief's minimum of eight objects and four models. It also has a two-wheel robot that I moved between camera renders to show movement. All objects are URDF boxes and cylinders with no imported meshes, so the notebook is self-contained</w:t>
-      </w:r>
-      <w:r>
-        <w:rPr>
-          <w:rFonts w:eastAsia="Times New Roman" w:cs="Times New Roman"/>
-          <w:color w:val="000000"/>
-          <w:kern w:val="0"/>
-          <w:lang w:eastAsia="en-GB"/>
-          <w14:ligatures w14:val="none"/>
-        </w:rPr>
-        <w:t xml:space="preserve">. I considered richer datasets such as </w:t>
-      </w:r>
-      <w:proofErr w:type="spellStart"/>
-      <w:r>
-        <w:rPr>
-          <w:rFonts w:eastAsia="Times New Roman" w:cs="Times New Roman"/>
-          <w:color w:val="000000"/>
-          <w:kern w:val="0"/>
-          <w:lang w:eastAsia="en-GB"/>
-          <w14:ligatures w14:val="none"/>
-        </w:rPr>
-        <w:t>SceneNet</w:t>
-      </w:r>
-      <w:proofErr w:type="spellEnd"/>
-      <w:r>
-        <w:rPr>
-          <w:rFonts w:eastAsia="Times New Roman" w:cs="Times New Roman"/>
-          <w:color w:val="000000"/>
-          <w:kern w:val="0"/>
-          <w:lang w:eastAsia="en-GB"/>
-          <w14:ligatures w14:val="none"/>
-        </w:rPr>
-        <w:t xml:space="preserve"> RGB-D (McCormac et al., 2017) but left them for future work.</w:t>
+        <w:t>above the brief's minimum of eight objects and four models. A two-wheel robot is moved between camera renders to show movement.</w:t>
+      </w:r>
+      <w:r>
+        <w:rPr>
+          <w:rFonts w:eastAsia="Times New Roman" w:cs="Times New Roman"/>
+          <w:color w:val="000000"/>
+          <w:kern w:val="0"/>
+          <w:lang w:eastAsia="en-GB"/>
+          <w14:ligatures w14:val="none"/>
+        </w:rPr>
+        <w:t xml:space="preserve"> All objects are URDF boxes and cylinders with no imported meshes, so the notebook is self-contained</w:t>
+      </w:r>
+      <w:r>
+        <w:rPr>
+          <w:rFonts w:eastAsia="Times New Roman" w:cs="Times New Roman"/>
+          <w:color w:val="000000"/>
+          <w:kern w:val="0"/>
+          <w:lang w:eastAsia="en-GB"/>
+          <w14:ligatures w14:val="none"/>
+        </w:rPr>
+        <w:t>.</w:t>
       </w:r>
     </w:p>
     <w:p>
@@ -4778,7 +4769,17 @@
           <w:lang w:eastAsia="en-GB"/>
           <w14:ligatures w14:val="none"/>
         </w:rPr>
-        <w:t>Three areas of work informed Task 1. These were simulators, semantic representation and labelled scenes.</w:t>
+        <w:t>Three areas of work informed Task 1, covering simulators, semantic representation and labelled scenes</w:t>
+      </w:r>
+      <w:r>
+        <w:rPr>
+          <w:rFonts w:eastAsia="Times New Roman" w:cs="Times New Roman"/>
+          <w:color w:val="000000"/>
+          <w:kern w:val="0"/>
+          <w:lang w:eastAsia="en-GB"/>
+          <w14:ligatures w14:val="none"/>
+        </w:rPr>
+        <w:t>.</w:t>
       </w:r>
     </w:p>
     <w:p>
@@ -4881,57 +4882,49 @@
         </w:rPr>
         <w:t xml:space="preserve">. </w:t>
       </w:r>
-      <w:r>
-        <w:rPr>
-          <w:rFonts w:eastAsia="Times New Roman" w:cs="Times New Roman"/>
-          <w:color w:val="000000"/>
-          <w:kern w:val="0"/>
-          <w:lang w:eastAsia="en-GB"/>
-          <w14:ligatures w14:val="none"/>
-        </w:rPr>
-        <w:t>Collins et al. (2021) review simulators across robotics.</w:t>
-      </w:r>
-      <w:r>
-        <w:rPr>
-          <w:rFonts w:eastAsia="Times New Roman" w:cs="Times New Roman"/>
-          <w:color w:val="000000"/>
-          <w:kern w:val="0"/>
-          <w:lang w:eastAsia="en-GB"/>
-          <w14:ligatures w14:val="none"/>
-        </w:rPr>
-        <w:t xml:space="preserve"> </w:t>
-      </w:r>
-      <w:r>
-        <w:rPr>
-          <w:rFonts w:eastAsia="Times New Roman" w:cs="Times New Roman"/>
-          <w:color w:val="000000"/>
-          <w:kern w:val="0"/>
-          <w:lang w:eastAsia="en-GB"/>
-          <w14:ligatures w14:val="none"/>
-        </w:rPr>
-        <w:t xml:space="preserve">Task 1 needs only scene building and rendering, so </w:t>
-      </w:r>
-      <w:proofErr w:type="spellStart"/>
-      <w:r>
-        <w:rPr>
-          <w:rFonts w:eastAsia="Times New Roman" w:cs="Times New Roman"/>
-          <w:color w:val="000000"/>
-          <w:kern w:val="0"/>
-          <w:lang w:eastAsia="en-GB"/>
-          <w14:ligatures w14:val="none"/>
-        </w:rPr>
-        <w:t>PyBullet's</w:t>
-      </w:r>
-      <w:proofErr w:type="spellEnd"/>
-      <w:r>
-        <w:rPr>
-          <w:rFonts w:eastAsia="Times New Roman" w:cs="Times New Roman"/>
-          <w:color w:val="000000"/>
-          <w:kern w:val="0"/>
-          <w:lang w:eastAsia="en-GB"/>
-          <w14:ligatures w14:val="none"/>
-        </w:rPr>
-        <w:t xml:space="preserve"> light setup was enough.</w:t>
+      <w:proofErr w:type="spellStart"/>
+      <w:r>
+        <w:rPr>
+          <w:rFonts w:eastAsia="Times New Roman" w:cs="Times New Roman"/>
+          <w:color w:val="000000"/>
+          <w:kern w:val="0"/>
+          <w:lang w:eastAsia="en-GB"/>
+          <w14:ligatures w14:val="none"/>
+        </w:rPr>
+        <w:t>Collins</w:t>
+      </w:r>
+      <w:proofErr w:type="spellEnd"/>
+      <w:r>
+        <w:rPr>
+          <w:rFonts w:eastAsia="Times New Roman" w:cs="Times New Roman"/>
+          <w:color w:val="000000"/>
+          <w:kern w:val="0"/>
+          <w:lang w:eastAsia="en-GB"/>
+          <w14:ligatures w14:val="none"/>
+        </w:rPr>
+        <w:t xml:space="preserve"> et al. (2021) review physics simulators used in robotics. Task 1 only needs scene building and rendering, so </w:t>
+      </w:r>
+      <w:proofErr w:type="spellStart"/>
+      <w:r>
+        <w:rPr>
+          <w:rFonts w:eastAsia="Times New Roman" w:cs="Times New Roman"/>
+          <w:color w:val="000000"/>
+          <w:kern w:val="0"/>
+          <w:lang w:eastAsia="en-GB"/>
+          <w14:ligatures w14:val="none"/>
+        </w:rPr>
+        <w:t>PyBullet</w:t>
+      </w:r>
+      <w:proofErr w:type="spellEnd"/>
+      <w:r>
+        <w:rPr>
+          <w:rFonts w:eastAsia="Times New Roman" w:cs="Times New Roman"/>
+          <w:color w:val="000000"/>
+          <w:kern w:val="0"/>
+          <w:lang w:eastAsia="en-GB"/>
+          <w14:ligatures w14:val="none"/>
+        </w:rPr>
+        <w:t xml:space="preserve"> was enough.</w:t>
       </w:r>
     </w:p>
     <w:p>
@@ -5020,7 +5013,17 @@
           <w:lang w:eastAsia="en-GB"/>
           <w14:ligatures w14:val="none"/>
         </w:rPr>
-        <w:t>The registry I built is a very simple version of that idea. I assign the labels by hand, so code can ask what an object is as well as where it is.</w:t>
+        <w:t>The registry in Task 1 is a very simple version of that idea.</w:t>
+      </w:r>
+      <w:r>
+        <w:rPr>
+          <w:rFonts w:eastAsia="Times New Roman" w:cs="Times New Roman"/>
+          <w:color w:val="000000"/>
+          <w:kern w:val="0"/>
+          <w:lang w:eastAsia="en-GB"/>
+          <w14:ligatures w14:val="none"/>
+        </w:rPr>
+        <w:t xml:space="preserve"> I assign the labels by hand, so code can ask what an object is as well as where it is.</w:t>
       </w:r>
     </w:p>
     <w:p>
@@ -5087,29 +5090,7 @@
           <w:lang w:eastAsia="en-GB"/>
           <w14:ligatures w14:val="none"/>
         </w:rPr>
-        <w:t xml:space="preserve">Task 1 is a much smaller, hand-made scene that trades realism for full control over the labels. </w:t>
-      </w:r>
-    </w:p>
-    <w:p>
-      <w:pPr>
-        <w:spacing w:before="120" w:after="180" w:line="360" w:lineRule="auto"/>
-        <w:rPr>
-          <w:rFonts w:eastAsia="Times New Roman" w:cs="Times New Roman"/>
-          <w:color w:val="000000"/>
-          <w:kern w:val="0"/>
-          <w:lang w:eastAsia="en-GB"/>
-          <w14:ligatures w14:val="none"/>
-        </w:rPr>
-      </w:pPr>
-      <w:r>
-        <w:rPr>
-          <w:rFonts w:eastAsia="Times New Roman" w:cs="Times New Roman"/>
-          <w:color w:val="000000"/>
-          <w:kern w:val="0"/>
-          <w:lang w:eastAsia="en-GB"/>
-          <w14:ligatures w14:val="none"/>
-        </w:rPr>
-        <w:t>Because I assign the labels, Task 1 shows how role queries work and does not test perception (Section 3.6).</w:t>
+        <w:t>Task 1 is a much smaller hand-made scene that gives up realism in return for full control over the labels.</w:t>
       </w:r>
     </w:p>
     <w:p>
@@ -5142,7 +5123,17 @@
           <w:lang w:eastAsia="en-GB"/>
           <w14:ligatures w14:val="none"/>
         </w:rPr>
-        <w:t xml:space="preserve">The notebook (Task1_PyBullet_Object_Semantics.ipynb) has nine executable cells. The setup cell imports </w:t>
+        <w:t xml:space="preserve">The notebook (Task1_PyBullet_Object_Semantics.ipynb) </w:t>
+      </w:r>
+      <w:r>
+        <w:rPr>
+          <w:rFonts w:eastAsia="Times New Roman" w:cs="Times New Roman"/>
+          <w:color w:val="000000"/>
+          <w:kern w:val="0"/>
+          <w:lang w:eastAsia="en-GB"/>
+          <w14:ligatures w14:val="none"/>
+        </w:rPr>
+        <w:t xml:space="preserve">has nine executable cells and is written in Python 3. The setup cell imports </w:t>
       </w:r>
       <w:proofErr w:type="spellStart"/>
       <w:r>
@@ -5230,7 +5221,29 @@
           <w:lang w:eastAsia="en-GB"/>
           <w14:ligatures w14:val="none"/>
         </w:rPr>
-        <w:t xml:space="preserve"> if it is missing, </w:t>
+        <w:t xml:space="preserve"> if it is missing. The generation cell writes six URDF files, one each for the obstacle (crate), target zone, landmark, shelf and charging dock, plus the two-wheel robot with a box chassis and two cylindrical wheels. The environment cell connects to </w:t>
+      </w:r>
+      <w:proofErr w:type="spellStart"/>
+      <w:r>
+        <w:rPr>
+          <w:rFonts w:eastAsia="Times New Roman" w:cs="Times New Roman"/>
+          <w:color w:val="000000"/>
+          <w:kern w:val="0"/>
+          <w:lang w:eastAsia="en-GB"/>
+          <w14:ligatures w14:val="none"/>
+        </w:rPr>
+        <w:t>PyBullet</w:t>
+      </w:r>
+      <w:proofErr w:type="spellEnd"/>
+      <w:r>
+        <w:rPr>
+          <w:rFonts w:eastAsia="Times New Roman" w:cs="Times New Roman"/>
+          <w:color w:val="000000"/>
+          <w:kern w:val="0"/>
+          <w:lang w:eastAsia="en-GB"/>
+          <w14:ligatures w14:val="none"/>
+        </w:rPr>
+        <w:t xml:space="preserve"> in </w:t>
       </w:r>
       <w:r>
         <w:rPr>
@@ -5241,51 +5254,7 @@
           <w14:ligatures w14:val="none"/>
         </w:rPr>
         <w:lastRenderedPageBreak/>
-        <w:t xml:space="preserve">so the notebook runs in Google </w:t>
-      </w:r>
-      <w:proofErr w:type="spellStart"/>
-      <w:r>
-        <w:rPr>
-          <w:rFonts w:eastAsia="Times New Roman" w:cs="Times New Roman"/>
-          <w:color w:val="000000"/>
-          <w:kern w:val="0"/>
-          <w:lang w:eastAsia="en-GB"/>
-          <w14:ligatures w14:val="none"/>
-        </w:rPr>
-        <w:t>Colab</w:t>
-      </w:r>
-      <w:proofErr w:type="spellEnd"/>
-      <w:r>
-        <w:rPr>
-          <w:rFonts w:eastAsia="Times New Roman" w:cs="Times New Roman"/>
-          <w:color w:val="000000"/>
-          <w:kern w:val="0"/>
-          <w:lang w:eastAsia="en-GB"/>
-          <w14:ligatures w14:val="none"/>
-        </w:rPr>
-        <w:t xml:space="preserve"> or locally. The generation cell writes six URDF files to disk. These are an obstacle (crate), a target zone, a landmark, a shelf, a charging dock and a two-wheel robot with a box chassis and two cylindrical wheels. The environment cell connects to </w:t>
-      </w:r>
-      <w:proofErr w:type="spellStart"/>
-      <w:r>
-        <w:rPr>
-          <w:rFonts w:eastAsia="Times New Roman" w:cs="Times New Roman"/>
-          <w:color w:val="000000"/>
-          <w:kern w:val="0"/>
-          <w:lang w:eastAsia="en-GB"/>
-          <w14:ligatures w14:val="none"/>
-        </w:rPr>
-        <w:t>PyBullet</w:t>
-      </w:r>
-      <w:proofErr w:type="spellEnd"/>
-      <w:r>
-        <w:rPr>
-          <w:rFonts w:eastAsia="Times New Roman" w:cs="Times New Roman"/>
-          <w:color w:val="000000"/>
-          <w:kern w:val="0"/>
-          <w:lang w:eastAsia="en-GB"/>
-          <w14:ligatures w14:val="none"/>
-        </w:rPr>
-        <w:t xml:space="preserve"> in DIRECT mode and loads a ground plane from the bundled </w:t>
+        <w:t xml:space="preserve">DIRECT mode, loads a ground plane from </w:t>
       </w:r>
       <w:proofErr w:type="spellStart"/>
       <w:r>
@@ -5307,7 +5276,17 @@
           <w:lang w:eastAsia="en-GB"/>
           <w14:ligatures w14:val="none"/>
         </w:rPr>
-        <w:t xml:space="preserve"> assets. It then places the fourteen objects and the robot at the coordinates from my floor sketch. These are four crate obstacles flanking the aisle, three target zones (pickup, an off-aisle inspection point and drop-off), four corner landmarks, two back-wall shelves and one charging dock. Figure 1 shows the pipeline.</w:t>
+        <w:t xml:space="preserve"> and places the fourteen objects and the robot at the coordinates from my floor sketch. There are four crate obstacles flanking the aisle</w:t>
+      </w:r>
+      <w:r>
+        <w:rPr>
+          <w:rFonts w:eastAsia="Times New Roman" w:cs="Times New Roman"/>
+          <w:color w:val="000000"/>
+          <w:kern w:val="0"/>
+          <w:lang w:eastAsia="en-GB"/>
+          <w14:ligatures w14:val="none"/>
+        </w:rPr>
+        <w:t>, three target zones (pickup, an off-aisle inspection point and drop-off), four corner landmarks, two back-wall shelves and one charging dock. Figure 1 shows the pipeline.</w:t>
       </w:r>
     </w:p>
     <w:p>
@@ -5631,18 +5610,7 @@
           <w:lang w:eastAsia="en-GB"/>
           <w14:ligatures w14:val="none"/>
         </w:rPr>
-        <w:t xml:space="preserve">, 2023). The brief requires three, and I rendered six as </w:t>
-      </w:r>
-      <w:r>
-        <w:rPr>
-          <w:rFonts w:eastAsia="Times New Roman" w:cs="Times New Roman"/>
-          <w:color w:val="000000"/>
-          <w:kern w:val="0"/>
-          <w:lang w:eastAsia="en-GB"/>
-          <w14:ligatures w14:val="none"/>
-        </w:rPr>
-        <w:lastRenderedPageBreak/>
-        <w:t xml:space="preserve">an extension. Only the robot moves between renders and every other object stays fixed. </w:t>
+        <w:t xml:space="preserve">, 2023). The brief requires three, and I rendered six as an extension. Only the robot moves between renders and every other object stays fixed. </w:t>
       </w:r>
       <w:proofErr w:type="spellStart"/>
       <w:r>
@@ -5748,6 +5716,7 @@
       </w:pPr>
       <w:bookmarkStart w:id="12" w:name="_Toc241777727"/>
       <w:r>
+        <w:lastRenderedPageBreak/>
         <w:t xml:space="preserve">Table </w:t>
       </w:r>
       <w:r>
@@ -5773,11 +5742,19 @@
       </w:r>
       <w:proofErr w:type="spellStart"/>
       <w:r>
-        <w:t>print_object_roles</w:t>
-      </w:r>
-      <w:proofErr w:type="spellEnd"/>
-      <w:r>
-        <w:t>() (14 objects, excluding the robot).</w:t>
+        <w:t>print_object_</w:t>
+      </w:r>
+      <w:proofErr w:type="gramStart"/>
+      <w:r>
+        <w:t>roles</w:t>
+      </w:r>
+      <w:proofErr w:type="spellEnd"/>
+      <w:r>
+        <w:t>(</w:t>
+      </w:r>
+      <w:proofErr w:type="gramEnd"/>
+      <w:r>
+        <w:t>) (14 objects, excluding the robot).</w:t>
       </w:r>
       <w:bookmarkEnd w:id="12"/>
     </w:p>
@@ -7212,7 +7189,6 @@
         <w:pStyle w:val="Code"/>
       </w:pPr>
       <w:r>
-        <w:lastRenderedPageBreak/>
         <w:t>OBSTACLE_URDF = """&lt;?xml version="1.0"?&gt;</w:t>
       </w:r>
     </w:p>
@@ -7305,17 +7281,27 @@
       </w:r>
       <w:proofErr w:type="spellStart"/>
       <w:r>
-        <w:t>write_urdf</w:t>
-      </w:r>
-      <w:proofErr w:type="spellEnd"/>
-      <w:r>
-        <w:t>("</w:t>
-      </w:r>
-      <w:proofErr w:type="spellStart"/>
+        <w:t>write_</w:t>
+      </w:r>
+      <w:proofErr w:type="gramStart"/>
+      <w:r>
+        <w:t>urdf</w:t>
+      </w:r>
+      <w:proofErr w:type="spellEnd"/>
+      <w:r>
+        <w:t>(</w:t>
+      </w:r>
+      <w:proofErr w:type="gramEnd"/>
+      <w:r>
+        <w:t>"</w:t>
+      </w:r>
+      <w:proofErr w:type="spellStart"/>
+      <w:proofErr w:type="gramStart"/>
       <w:r>
         <w:t>obstacle.urdf</w:t>
       </w:r>
       <w:proofErr w:type="spellEnd"/>
+      <w:proofErr w:type="gramEnd"/>
       <w:r>
         <w:t>", OBSTACLE_URDF)</w:t>
       </w:r>
@@ -7407,6 +7393,7 @@
       </w:pPr>
       <w:proofErr w:type="spellStart"/>
       <w:r>
+        <w:lastRenderedPageBreak/>
         <w:t>semantic_db</w:t>
       </w:r>
       <w:proofErr w:type="spellEnd"/>
@@ -7523,10 +7510,12 @@
         <w:t xml:space="preserve">, _ = </w:t>
       </w:r>
       <w:proofErr w:type="spellStart"/>
+      <w:proofErr w:type="gramStart"/>
       <w:r>
         <w:t>p.getBasePositionAndOrientation</w:t>
       </w:r>
       <w:proofErr w:type="spellEnd"/>
+      <w:proofErr w:type="gramEnd"/>
       <w:r>
         <w:t>(</w:t>
       </w:r>
@@ -7611,10 +7600,12 @@
         <w:t xml:space="preserve"> = </w:t>
       </w:r>
       <w:proofErr w:type="spellStart"/>
+      <w:proofErr w:type="gramStart"/>
       <w:r>
         <w:t>math.dist</w:t>
       </w:r>
       <w:proofErr w:type="spellEnd"/>
+      <w:proofErr w:type="gramEnd"/>
       <w:r>
         <w:t>(</w:t>
       </w:r>
@@ -7712,7 +7703,23 @@
       </w:r>
       <w:proofErr w:type="spellEnd"/>
       <w:r>
-        <w:t>": best[0], "position": best[1],</w:t>
+        <w:t xml:space="preserve">": </w:t>
+      </w:r>
+      <w:proofErr w:type="gramStart"/>
+      <w:r>
+        <w:t>best[</w:t>
+      </w:r>
+      <w:proofErr w:type="gramEnd"/>
+      <w:r>
+        <w:t xml:space="preserve">0], "position": </w:t>
+      </w:r>
+      <w:proofErr w:type="gramStart"/>
+      <w:r>
+        <w:t>best[</w:t>
+      </w:r>
+      <w:proofErr w:type="gramEnd"/>
+      <w:r>
+        <w:t>1],</w:t>
       </w:r>
     </w:p>
     <w:p>
@@ -7775,13 +7782,18 @@
       </w:r>
       <w:proofErr w:type="spellStart"/>
       <w:r>
-        <w:t>render_view</w:t>
+        <w:t>render_</w:t>
+      </w:r>
+      <w:proofErr w:type="gramStart"/>
+      <w:r>
+        <w:t>view</w:t>
       </w:r>
       <w:proofErr w:type="spellEnd"/>
       <w:r>
         <w:t>(</w:t>
       </w:r>
       <w:proofErr w:type="spellStart"/>
+      <w:proofErr w:type="gramEnd"/>
       <w:r>
         <w:t>camera_eye</w:t>
       </w:r>
@@ -7802,8 +7814,13 @@
         <w:t>up_vector</w:t>
       </w:r>
       <w:proofErr w:type="spellEnd"/>
-      <w:r>
-        <w:t>=(0, 0, 1)):</w:t>
+      <w:proofErr w:type="gramStart"/>
+      <w:r>
+        <w:t>=(</w:t>
+      </w:r>
+      <w:proofErr w:type="gramEnd"/>
+      <w:r>
+        <w:t>0, 0, 1)):</w:t>
       </w:r>
     </w:p>
     <w:p>
@@ -7814,10 +7831,12 @@
         <w:t xml:space="preserve">    view = </w:t>
       </w:r>
       <w:proofErr w:type="spellStart"/>
+      <w:proofErr w:type="gramStart"/>
       <w:r>
         <w:t>p.computeViewMatrix</w:t>
       </w:r>
       <w:proofErr w:type="spellEnd"/>
+      <w:proofErr w:type="gramEnd"/>
       <w:r>
         <w:t>(</w:t>
       </w:r>
@@ -7862,10 +7881,12 @@
         <w:t xml:space="preserve"> = </w:t>
       </w:r>
       <w:proofErr w:type="spellStart"/>
+      <w:proofErr w:type="gramStart"/>
       <w:r>
         <w:t>p.computeProjectionMatrixFOV</w:t>
       </w:r>
       <w:proofErr w:type="spellEnd"/>
+      <w:proofErr w:type="gramEnd"/>
       <w:r>
         <w:t>(</w:t>
       </w:r>
@@ -7926,10 +7947,12 @@
         <w:t xml:space="preserve">, _, _ = </w:t>
       </w:r>
       <w:proofErr w:type="spellStart"/>
+      <w:proofErr w:type="gramStart"/>
       <w:r>
         <w:t>p.getCameraImage</w:t>
       </w:r>
       <w:proofErr w:type="spellEnd"/>
+      <w:proofErr w:type="gramEnd"/>
       <w:r>
         <w:t>(</w:t>
       </w:r>
@@ -7974,10 +7997,12 @@
         <w:t xml:space="preserve">    return </w:t>
       </w:r>
       <w:proofErr w:type="spellStart"/>
+      <w:proofErr w:type="gramStart"/>
       <w:r>
         <w:t>np.reshape</w:t>
       </w:r>
       <w:proofErr w:type="spellEnd"/>
+      <w:proofErr w:type="gramEnd"/>
       <w:r>
         <w:t>(</w:t>
       </w:r>
@@ -7987,7 +8012,15 @@
       </w:r>
       <w:proofErr w:type="spellEnd"/>
       <w:r>
-        <w:t>, (IMG_HEIGHT, IMG_WIDTH, 4))[:, :, :3]</w:t>
+        <w:t>, (IMG_HEIGHT, IMG_WIDTH, 4</w:t>
+      </w:r>
+      <w:proofErr w:type="gramStart"/>
+      <w:r>
+        <w:t>))[:,</w:t>
+      </w:r>
+      <w:proofErr w:type="gramEnd"/>
+      <w:r>
+        <w:t xml:space="preserve"> :, :3]</w:t>
       </w:r>
     </w:p>
     <w:p>
@@ -8204,19 +8237,7 @@
             <w:lang w:eastAsia="en-GB"/>
             <w14:ligatures w14:val="none"/>
           </w:rPr>
-          <w:t>https://colab.research.google.com/github/Amaan9136/bsbi-</w:t>
-        </w:r>
-        <w:r>
-          <w:rPr>
-            <w:rStyle w:val="Hyperlink"/>
-            <w:rFonts w:eastAsia="Times New Roman" w:cs="Times New Roman"/>
-            <w:kern w:val="0"/>
-            <w:sz w:val="22"/>
-            <w:lang w:eastAsia="en-GB"/>
-            <w14:ligatures w14:val="none"/>
-          </w:rPr>
-          <w:lastRenderedPageBreak/>
-          <w:t>assignments/blob/main/Sem2/Robotics%20Software%20and%20Programming/task1-code/Task1_PyBullet_Object_Semantics.ipynb</w:t>
+          <w:t>https://colab.research.google.com/github/Amaan9136/bsbi-assignments/blob/main/Sem2/Robotics%20Software%20and%20Programming/task1-code/Task1_PyBullet_Object_Semantics.ipynb</w:t>
         </w:r>
       </w:hyperlink>
       <w:r>
@@ -8276,6 +8297,7 @@
           <w:lang w:eastAsia="en-GB"/>
           <w14:ligatures w14:val="none"/>
         </w:rPr>
+        <w:lastRenderedPageBreak/>
         <w:drawing>
           <wp:inline distT="0" distB="0" distL="0" distR="0" wp14:anchorId="389F5184" wp14:editId="53070D84">
             <wp:extent cx="5905500" cy="3596640"/>
@@ -8499,7 +8521,59 @@
           <w:lang w:eastAsia="en-GB"/>
           <w14:ligatures w14:val="none"/>
         </w:rPr>
-        <w:t xml:space="preserve">The hardest part was keeping the camera framing consistent while the robot moved. My first version worked out each camera position from the robot's pose. The framing kept shifting, and in one configuration the robot left the frame completely. I changed the cameras to fixed </w:t>
+        <w:t xml:space="preserve">The hardest part was keeping the camera framing consistent while the robot moved. My first version worked out each camera position from the robot's pose. The framing kept shifting, and in one configuration the robot left the frame completely. I changed the cameras to fixed positions based on the room bounds and moved only the robot between renders. </w:t>
+      </w:r>
+      <w:r>
+        <w:rPr>
+          <w:rFonts w:eastAsia="Times New Roman" w:cs="Times New Roman"/>
+          <w:color w:val="000000"/>
+          <w:kern w:val="0"/>
+          <w:lang w:eastAsia="en-GB"/>
+          <w14:ligatures w14:val="none"/>
+        </w:rPr>
+        <w:t>I started with the three views the brief requires, then increased them to six so the objects could be checked from more angles.</w:t>
+      </w:r>
+      <w:r>
+        <w:rPr>
+          <w:rFonts w:eastAsia="Times New Roman" w:cs="Times New Roman"/>
+          <w:color w:val="000000"/>
+          <w:kern w:val="0"/>
+          <w:lang w:eastAsia="en-GB"/>
+          <w14:ligatures w14:val="none"/>
+        </w:rPr>
+        <w:t xml:space="preserve"> </w:t>
+      </w:r>
+      <w:r>
+        <w:rPr>
+          <w:rFonts w:eastAsia="Times New Roman" w:cs="Times New Roman"/>
+          <w:color w:val="000000"/>
+          <w:kern w:val="0"/>
+          <w:lang w:eastAsia="en-GB"/>
+          <w14:ligatures w14:val="none"/>
+        </w:rPr>
+        <w:t>I also tried assigning roles by matching URDF filenames to role strings when the objects were loaded. I rejected this because it was more error-prone. Passing the role explicitly in SCENE_LAYOUT keeps every role in one place where it is easy to check.</w:t>
+      </w:r>
+    </w:p>
+    <w:p>
+      <w:pPr>
+        <w:spacing w:after="180" w:line="360" w:lineRule="auto"/>
+        <w:rPr>
+          <w:rFonts w:eastAsia="Times New Roman" w:cs="Times New Roman"/>
+          <w:color w:val="000000"/>
+          <w:kern w:val="0"/>
+          <w:lang w:eastAsia="en-GB"/>
+          <w14:ligatures w14:val="none"/>
+        </w:rPr>
+      </w:pPr>
+      <w:r>
+        <w:rPr>
+          <w:rFonts w:eastAsia="Times New Roman" w:cs="Times New Roman"/>
+          <w:color w:val="000000"/>
+          <w:kern w:val="0"/>
+          <w:lang w:eastAsia="en-GB"/>
+          <w14:ligatures w14:val="none"/>
+        </w:rPr>
+        <w:t xml:space="preserve">The main limitation is that I set the labels by hand. The robot cannot recognise a role from how an object looks. The brief asks for an interpretable environment and not a perception system, </w:t>
       </w:r>
       <w:r>
         <w:rPr>
@@ -8510,59 +8584,7 @@
           <w14:ligatures w14:val="none"/>
         </w:rPr>
         <w:lastRenderedPageBreak/>
-        <w:t xml:space="preserve">positions based on the room bounds and moved only the robot between renders. </w:t>
-      </w:r>
-      <w:r>
-        <w:rPr>
-          <w:rFonts w:eastAsia="Times New Roman" w:cs="Times New Roman"/>
-          <w:color w:val="000000"/>
-          <w:kern w:val="0"/>
-          <w:lang w:eastAsia="en-GB"/>
-          <w14:ligatures w14:val="none"/>
-        </w:rPr>
-        <w:t>I started with the three views the brief requires, then increased them to six so the objects could be checked from more angles.</w:t>
-      </w:r>
-      <w:r>
-        <w:rPr>
-          <w:rFonts w:eastAsia="Times New Roman" w:cs="Times New Roman"/>
-          <w:color w:val="000000"/>
-          <w:kern w:val="0"/>
-          <w:lang w:eastAsia="en-GB"/>
-          <w14:ligatures w14:val="none"/>
-        </w:rPr>
-        <w:t xml:space="preserve"> </w:t>
-      </w:r>
-      <w:r>
-        <w:rPr>
-          <w:rFonts w:eastAsia="Times New Roman" w:cs="Times New Roman"/>
-          <w:color w:val="000000"/>
-          <w:kern w:val="0"/>
-          <w:lang w:eastAsia="en-GB"/>
-          <w14:ligatures w14:val="none"/>
-        </w:rPr>
-        <w:t>I also tried assigning roles by matching URDF filenames to role strings when the objects were loaded. I rejected this because it was more error-prone. Passing the role explicitly in SCENE_LAYOUT keeps every role in one place where it is easy to check.</w:t>
-      </w:r>
-    </w:p>
-    <w:p>
-      <w:pPr>
-        <w:spacing w:after="180" w:line="360" w:lineRule="auto"/>
-        <w:rPr>
-          <w:rFonts w:eastAsia="Times New Roman" w:cs="Times New Roman"/>
-          <w:color w:val="000000"/>
-          <w:kern w:val="0"/>
-          <w:lang w:eastAsia="en-GB"/>
-          <w14:ligatures w14:val="none"/>
-        </w:rPr>
-      </w:pPr>
-      <w:r>
-        <w:rPr>
-          <w:rFonts w:eastAsia="Times New Roman" w:cs="Times New Roman"/>
-          <w:color w:val="000000"/>
-          <w:kern w:val="0"/>
-          <w:lang w:eastAsia="en-GB"/>
-          <w14:ligatures w14:val="none"/>
-        </w:rPr>
-        <w:t xml:space="preserve">The main limitation is that I set the labels by hand. The robot cannot recognise a role from how an object looks. The brief asks for an interpretable environment and not a perception system, so this was acceptable for Task 1. An improvement would be to train a lightweight classifier on </w:t>
+        <w:t xml:space="preserve">so this was acceptable for Task 1. An improvement would be to train a lightweight classifier on </w:t>
       </w:r>
       <w:proofErr w:type="spellStart"/>
       <w:r>
@@ -8877,7 +8899,29 @@
           <w:lang w:eastAsia="en-GB"/>
           <w14:ligatures w14:val="none"/>
         </w:rPr>
-        <w:t>, is a walled bay of 7 m by 7 m. It comes as a Classic .world for TheConstruct.ai and a Harmonic .</w:t>
+        <w:t xml:space="preserve">, is a walled bay of 7 m by 7 m. It comes as a </w:t>
+      </w:r>
+      <w:proofErr w:type="gramStart"/>
+      <w:r>
+        <w:rPr>
+          <w:rFonts w:eastAsia="Times New Roman" w:cs="Times New Roman"/>
+          <w:color w:val="000000"/>
+          <w:kern w:val="0"/>
+          <w:lang w:eastAsia="en-GB"/>
+          <w14:ligatures w14:val="none"/>
+        </w:rPr>
+        <w:t>Classic .world</w:t>
+      </w:r>
+      <w:proofErr w:type="gramEnd"/>
+      <w:r>
+        <w:rPr>
+          <w:rFonts w:eastAsia="Times New Roman" w:cs="Times New Roman"/>
+          <w:color w:val="000000"/>
+          <w:kern w:val="0"/>
+          <w:lang w:eastAsia="en-GB"/>
+          <w14:ligatures w14:val="none"/>
+        </w:rPr>
+        <w:t xml:space="preserve"> for TheConstruct.ai and a Harmonic .</w:t>
       </w:r>
       <w:proofErr w:type="spellStart"/>
       <w:r>
@@ -9032,7 +9076,27 @@
           <w:lang w:eastAsia="en-GB"/>
           <w14:ligatures w14:val="none"/>
         </w:rPr>
-        <w:t>, 2011; Borenstein and Koren, 1991). My escape-heading probe is a much simpler relative of that idea. The package contains four ROS2 nodes</w:t>
+        <w:t xml:space="preserve">, 2011; Borenstein and Koren, 1991). </w:t>
+      </w:r>
+      <w:r>
+        <w:rPr>
+          <w:rFonts w:eastAsia="Times New Roman" w:cs="Times New Roman"/>
+          <w:color w:val="000000"/>
+          <w:kern w:val="0"/>
+          <w:lang w:eastAsia="en-GB"/>
+          <w14:ligatures w14:val="none"/>
+        </w:rPr>
+        <w:t>My escape-heading probe is a much simpler relative of that idea</w:t>
+      </w:r>
+      <w:r>
+        <w:rPr>
+          <w:rFonts w:eastAsia="Times New Roman" w:cs="Times New Roman"/>
+          <w:color w:val="000000"/>
+          <w:kern w:val="0"/>
+          <w:lang w:eastAsia="en-GB"/>
+          <w14:ligatures w14:val="none"/>
+        </w:rPr>
+        <w:t>.</w:t>
       </w:r>
     </w:p>
     <w:p>
@@ -9489,7 +9553,23 @@
                 <w:sz w:val="22"/>
                 <w:szCs w:val="22"/>
               </w:rPr>
-              <w:t>/scan, /</w:t>
+              <w:t>/</w:t>
+            </w:r>
+            <w:proofErr w:type="gramStart"/>
+            <w:r>
+              <w:rPr>
+                <w:sz w:val="22"/>
+                <w:szCs w:val="22"/>
+              </w:rPr>
+              <w:t>scan</w:t>
+            </w:r>
+            <w:proofErr w:type="gramEnd"/>
+            <w:r>
+              <w:rPr>
+                <w:sz w:val="22"/>
+                <w:szCs w:val="22"/>
+              </w:rPr>
+              <w:t>, /</w:t>
             </w:r>
             <w:proofErr w:type="spellStart"/>
             <w:r>
@@ -9539,12 +9619,21 @@
               <w:t>/</w:t>
             </w:r>
             <w:proofErr w:type="spellStart"/>
-            <w:r>
-              <w:rPr>
-                <w:sz w:val="22"/>
-                <w:szCs w:val="22"/>
-              </w:rPr>
-              <w:t>cmd_vel</w:t>
+            <w:proofErr w:type="gramStart"/>
+            <w:r>
+              <w:rPr>
+                <w:sz w:val="22"/>
+                <w:szCs w:val="22"/>
+              </w:rPr>
+              <w:t>cmd</w:t>
+            </w:r>
+            <w:proofErr w:type="gramEnd"/>
+            <w:r>
+              <w:rPr>
+                <w:sz w:val="22"/>
+                <w:szCs w:val="22"/>
+              </w:rPr>
+              <w:t>_vel</w:t>
             </w:r>
             <w:proofErr w:type="spellEnd"/>
             <w:r>
@@ -9653,12 +9742,21 @@
               <w:t>/</w:t>
             </w:r>
             <w:proofErr w:type="spellStart"/>
-            <w:r>
-              <w:rPr>
-                <w:sz w:val="22"/>
-                <w:szCs w:val="22"/>
-              </w:rPr>
-              <w:t>mission_state</w:t>
+            <w:proofErr w:type="gramStart"/>
+            <w:r>
+              <w:rPr>
+                <w:sz w:val="22"/>
+                <w:szCs w:val="22"/>
+              </w:rPr>
+              <w:t>mission</w:t>
+            </w:r>
+            <w:proofErr w:type="gramEnd"/>
+            <w:r>
+              <w:rPr>
+                <w:sz w:val="22"/>
+                <w:szCs w:val="22"/>
+              </w:rPr>
+              <w:t>_state</w:t>
             </w:r>
             <w:proofErr w:type="spellEnd"/>
             <w:r>
@@ -9796,12 +9894,21 @@
               <w:t>/</w:t>
             </w:r>
             <w:proofErr w:type="spellStart"/>
-            <w:r>
-              <w:rPr>
-                <w:sz w:val="22"/>
-                <w:szCs w:val="22"/>
-              </w:rPr>
-              <w:t>hri_command</w:t>
+            <w:proofErr w:type="gramStart"/>
+            <w:r>
+              <w:rPr>
+                <w:sz w:val="22"/>
+                <w:szCs w:val="22"/>
+              </w:rPr>
+              <w:t>hri</w:t>
+            </w:r>
+            <w:proofErr w:type="gramEnd"/>
+            <w:r>
+              <w:rPr>
+                <w:sz w:val="22"/>
+                <w:szCs w:val="22"/>
+              </w:rPr>
+              <w:t>_command</w:t>
             </w:r>
             <w:proofErr w:type="spellEnd"/>
             <w:r>
@@ -9840,7 +9947,23 @@
                 <w:sz w:val="22"/>
                 <w:szCs w:val="22"/>
               </w:rPr>
-              <w:t>Single-key HRI: s start, p pause, x stop, v toggle path, q quit</w:t>
+              <w:t xml:space="preserve">Single-key HRI: s start, p </w:t>
+            </w:r>
+            <w:proofErr w:type="gramStart"/>
+            <w:r>
+              <w:rPr>
+                <w:sz w:val="22"/>
+                <w:szCs w:val="22"/>
+              </w:rPr>
+              <w:t>pause</w:t>
+            </w:r>
+            <w:proofErr w:type="gramEnd"/>
+            <w:r>
+              <w:rPr>
+                <w:sz w:val="22"/>
+                <w:szCs w:val="22"/>
+              </w:rPr>
+              <w:t>, x stop, v toggle path, q quit</w:t>
             </w:r>
           </w:p>
         </w:tc>
@@ -9894,12 +10017,21 @@
               <w:t>/</w:t>
             </w:r>
             <w:proofErr w:type="spellStart"/>
-            <w:r>
-              <w:rPr>
-                <w:sz w:val="22"/>
-                <w:szCs w:val="22"/>
-              </w:rPr>
-              <w:t>planned_path</w:t>
+            <w:proofErr w:type="gramStart"/>
+            <w:r>
+              <w:rPr>
+                <w:sz w:val="22"/>
+                <w:szCs w:val="22"/>
+              </w:rPr>
+              <w:t>planned</w:t>
+            </w:r>
+            <w:proofErr w:type="gramEnd"/>
+            <w:r>
+              <w:rPr>
+                <w:sz w:val="22"/>
+                <w:szCs w:val="22"/>
+              </w:rPr>
+              <w:t>_path</w:t>
             </w:r>
             <w:proofErr w:type="spellEnd"/>
             <w:r>
@@ -10781,37 +10913,7 @@
           <w:lang w:eastAsia="en-GB"/>
           <w14:ligatures w14:val="none"/>
         </w:rPr>
-        <w:t xml:space="preserve">I made two design decisions that need explaining. First, obstacle avoidance has three phases (REVERSE, ORIENT and COMMIT). The robot probes escape headings at eleven angles per side using LIDAR and scores each by goal alignment. Among headings with similar alignment it takes the one with more open space. It accepts a heading only with at least 0.21 m of clear runway, which is the robot's half-width (0.11 m) </w:t>
-      </w:r>
-      <w:r>
-        <w:rPr>
-          <w:rFonts w:eastAsia="Times New Roman" w:cs="Times New Roman"/>
-          <w:color w:val="000000"/>
-          <w:kern w:val="0"/>
-          <w:lang w:eastAsia="en-GB"/>
-          <w14:ligatures w14:val="none"/>
-        </w:rPr>
-        <w:t>plus a 0.05 m lateral margin and a further 0.05 m.</w:t>
-      </w:r>
-      <w:r>
-        <w:rPr>
-          <w:rFonts w:eastAsia="Times New Roman" w:cs="Times New Roman"/>
-          <w:color w:val="000000"/>
-          <w:kern w:val="0"/>
-          <w:lang w:eastAsia="en-GB"/>
-          <w14:ligatures w14:val="none"/>
-        </w:rPr>
-        <w:t xml:space="preserve"> </w:t>
-      </w:r>
-      <w:r>
-        <w:rPr>
-          <w:rFonts w:eastAsia="Times New Roman" w:cs="Times New Roman"/>
-          <w:color w:val="000000"/>
-          <w:kern w:val="0"/>
-          <w:lang w:eastAsia="en-GB"/>
-          <w14:ligatures w14:val="none"/>
-        </w:rPr>
-        <w:t xml:space="preserve">An odometry stall check runs alongside. If the robot moves less than 0.05 m in one second of commanded forward motion, it counts as blocked whatever the LIDAR says. After ten failed avoidance attempts the mission aborts to IDLE and needs a new start command. Second, in the Jazzy and Harmonic build the velocity commands are </w:t>
+        <w:t xml:space="preserve">I made two design decisions. First, obstacle avoidance has three phases (REVERSE, ORIENT and COMMIT). The robot probes escape headings at eleven angles per side using LIDAR and scores each by how well it lines up with the goal. Among similar scores it takes the heading with more open space. A heading is accepted only with at least 0.21 m of clear runway, which is the robot's half-width (0.11 m) plus a 0.05 m lateral margin and a further 0.05 m. An odometry stall check runs alongside. If the robot moves less than 0.05 m in one second of commanded forward motion, it counts as blocked whatever the LIDAR says. After ten failed attempts the mission aborts to IDLE. Second, in the Jazzy and Harmonic build the velocity commands are </w:t>
       </w:r>
       <w:proofErr w:type="spellStart"/>
       <w:r>
@@ -10877,7 +10979,7 @@
           <w:lang w:eastAsia="en-GB"/>
           <w14:ligatures w14:val="none"/>
         </w:rPr>
-        <w:t xml:space="preserve"> as plain Twist. The type mismatch stopped the robot moving until that bridge was removed.</w:t>
+        <w:t xml:space="preserve"> as plain Twist, and the mismatch stopped the robot moving until I removed that bridge.</w:t>
       </w:r>
     </w:p>
     <w:p>
@@ -10955,17 +11057,7 @@
           <w:lang w:eastAsia="en-GB"/>
           <w14:ligatures w14:val="none"/>
         </w:rPr>
-        <w:t xml:space="preserve">. On every state change it logs the transition with a timestamp and adds the elapsed time to the previous state. </w:t>
-      </w:r>
-      <w:r>
-        <w:rPr>
-          <w:rFonts w:eastAsia="Times New Roman" w:cs="Times New Roman"/>
-          <w:color w:val="000000"/>
-          <w:kern w:val="0"/>
-          <w:lang w:eastAsia="en-GB"/>
-          <w14:ligatures w14:val="none"/>
-        </w:rPr>
-        <w:t xml:space="preserve">Each time the robot enters AVOID_OBSTACLE it logs "Obstacle detected -&gt; switching to </w:t>
+        <w:t xml:space="preserve">. On every state change it logs the transition with a timestamp and adds the elapsed time to the previous state. Each entry into AVOID_OBSTACLE logs "Obstacle detected -&gt; switching to </w:t>
       </w:r>
       <w:proofErr w:type="spellStart"/>
       <w:r>
@@ -10987,7 +11079,7 @@
           <w:lang w:eastAsia="en-GB"/>
           <w14:ligatures w14:val="none"/>
         </w:rPr>
-        <w:t xml:space="preserve">" and increments an obstacle-encounter counter. </w:t>
+        <w:t xml:space="preserve">" and increments an obstacle-encounter counter, which stands in for the brief's collisions metric since the robot avoids contact. </w:t>
       </w:r>
       <w:proofErr w:type="spellStart"/>
       <w:r>
@@ -11009,27 +11101,7 @@
           <w:lang w:eastAsia="en-GB"/>
           <w14:ligatures w14:val="none"/>
         </w:rPr>
-        <w:t xml:space="preserve"> adds its own messages, such as "Reached Checkpoint 1 - East Aisle", and an error message when it gives up after ten attempts</w:t>
-      </w:r>
-      <w:r>
-        <w:rPr>
-          <w:rFonts w:eastAsia="Times New Roman" w:cs="Times New Roman"/>
-          <w:color w:val="000000"/>
-          <w:kern w:val="0"/>
-          <w:lang w:eastAsia="en-GB"/>
-          <w14:ligatures w14:val="none"/>
-        </w:rPr>
-        <w:t xml:space="preserve">. </w:t>
-      </w:r>
-      <w:r>
-        <w:rPr>
-          <w:rFonts w:eastAsia="Times New Roman" w:cs="Times New Roman"/>
-          <w:color w:val="000000"/>
-          <w:kern w:val="0"/>
-          <w:lang w:eastAsia="en-GB"/>
-          <w14:ligatures w14:val="none"/>
-        </w:rPr>
-        <w:t xml:space="preserve">The code comments note that this counter stands in for the brief's collisions metric, since the robot avoids contact. Odometry feeds a running distance total. A five-second timer prints a summary during the mission, and a final summary is printed on MISSION_COMPLETE. Times use the system clock, so they are wall-clock seconds. </w:t>
+        <w:t xml:space="preserve"> also logs messages such as "Reached Checkpoint 1 - East Aisle". Odometry feeds a running distance total. A five-second timer prints a summary during the mission, and a final one is printed on MISSION_COMPLETE. Times use the system clock, so they are wall-clock seconds. </w:t>
       </w:r>
       <w:proofErr w:type="spellStart"/>
       <w:r>
@@ -11051,40 +11123,7 @@
           <w:lang w:eastAsia="en-GB"/>
           <w14:ligatures w14:val="none"/>
         </w:rPr>
-        <w:t xml:space="preserve"> listens on /</w:t>
-      </w:r>
-      <w:proofErr w:type="spellStart"/>
-      <w:r>
-        <w:rPr>
-          <w:rFonts w:eastAsia="Times New Roman" w:cs="Times New Roman"/>
-          <w:color w:val="000000"/>
-          <w:kern w:val="0"/>
-          <w:lang w:eastAsia="en-GB"/>
-          <w14:ligatures w14:val="none"/>
-        </w:rPr>
-        <w:t>planned_path</w:t>
-      </w:r>
-      <w:proofErr w:type="spellEnd"/>
-      <w:r>
-        <w:rPr>
-          <w:rFonts w:eastAsia="Times New Roman" w:cs="Times New Roman"/>
-          <w:color w:val="000000"/>
-          <w:kern w:val="0"/>
-          <w:lang w:eastAsia="en-GB"/>
-          <w14:ligatures w14:val="none"/>
-        </w:rPr>
-        <w:t xml:space="preserve">. When told to show the path, it spawns thin static box entities along the route </w:t>
-      </w:r>
-      <w:r>
-        <w:rPr>
-          <w:rFonts w:eastAsia="Times New Roman" w:cs="Times New Roman"/>
-          <w:color w:val="000000"/>
-          <w:kern w:val="0"/>
-          <w:lang w:eastAsia="en-GB"/>
-          <w14:ligatures w14:val="none"/>
-        </w:rPr>
-        <w:lastRenderedPageBreak/>
-        <w:t xml:space="preserve">through the Gazebo </w:t>
+        <w:t xml:space="preserve"> spawns thin static box entities along the route through the Gazebo </w:t>
       </w:r>
       <w:proofErr w:type="spellStart"/>
       <w:r>
@@ -11106,7 +11145,7 @@
           <w:lang w:eastAsia="en-GB"/>
           <w14:ligatures w14:val="none"/>
         </w:rPr>
-        <w:t xml:space="preserve"> service. The 'v' key or a native GUI panel toggles the line without changing the plan.</w:t>
+        <w:t xml:space="preserve"> service, and the 'v' key or a native GUI panel toggles the line without changing the plan.</w:t>
       </w:r>
     </w:p>
     <w:p>
@@ -11117,6 +11156,7 @@
       <w:bookmarkStart w:id="31" w:name="execution-and-testing-1"/>
       <w:bookmarkEnd w:id="25"/>
       <w:r>
+        <w:lastRenderedPageBreak/>
         <w:t>4.3 Execution and Testing</w:t>
       </w:r>
       <w:bookmarkEnd w:id="30"/>
@@ -11447,49 +11487,7 @@
           <w:lang w:eastAsia="en-GB"/>
           <w14:ligatures w14:val="none"/>
         </w:rPr>
-        <w:t xml:space="preserve"> workspace.</w:t>
-      </w:r>
-      <w:r>
-        <w:rPr>
-          <w:rFonts w:eastAsia="Times New Roman" w:cs="Times New Roman"/>
-          <w:color w:val="000000"/>
-          <w:kern w:val="0"/>
-          <w:lang w:eastAsia="en-GB"/>
-          <w14:ligatures w14:val="none"/>
-        </w:rPr>
-        <w:t xml:space="preserve"> </w:t>
-      </w:r>
-      <w:r>
-        <w:rPr>
-          <w:rFonts w:eastAsia="Times New Roman" w:cs="Times New Roman"/>
-          <w:color w:val="000000"/>
-          <w:kern w:val="0"/>
-          <w:lang w:eastAsia="en-GB"/>
-          <w14:ligatures w14:val="none"/>
-        </w:rPr>
-        <w:t xml:space="preserve">The file explorer shows the </w:t>
-      </w:r>
-      <w:proofErr w:type="spellStart"/>
-      <w:r>
-        <w:rPr>
-          <w:rFonts w:eastAsia="Times New Roman" w:cs="Times New Roman"/>
-          <w:color w:val="000000"/>
-          <w:kern w:val="0"/>
-          <w:lang w:eastAsia="en-GB"/>
-          <w14:ligatures w14:val="none"/>
-        </w:rPr>
-        <w:t>Rosject</w:t>
-      </w:r>
-      <w:proofErr w:type="spellEnd"/>
-      <w:r>
-        <w:rPr>
-          <w:rFonts w:eastAsia="Times New Roman" w:cs="Times New Roman"/>
-          <w:color w:val="000000"/>
-          <w:kern w:val="0"/>
-          <w:lang w:eastAsia="en-GB"/>
-          <w14:ligatures w14:val="none"/>
-        </w:rPr>
-        <w:t xml:space="preserve"> name </w:t>
+        <w:t xml:space="preserve"> workspace. The file explorer shows the name </w:t>
       </w:r>
       <w:proofErr w:type="spellStart"/>
       <w:r>
@@ -11511,7 +11509,7 @@
           <w:lang w:eastAsia="en-GB"/>
           <w14:ligatures w14:val="none"/>
         </w:rPr>
-        <w:t xml:space="preserve">, and mission_controller.py is open in the code editor. The Simulation panel shows the warehouse world with the robot, eight pallets and four checkpoints. A shell is printing </w:t>
+        <w:t xml:space="preserve">, mission_controller.py is open in the code editor and the Simulation panel shows the warehouse world. A shell is printing </w:t>
       </w:r>
       <w:proofErr w:type="spellStart"/>
       <w:r>
@@ -14917,7 +14915,27 @@
           <w:lang w:eastAsia="en-GB"/>
           <w14:ligatures w14:val="none"/>
         </w:rPr>
-        <w:t>Macenski, S., Martin, F., White, R. and Gines Clavero, J. (2020) ‘The Marathon 2: A Navigation System.’ In: Proceedings of the IEEE/RSJ International Conference on Intelligent Robots and Systems (IROS). Las Vegas, 24-30 October 2020: 2718-2725</w:t>
+        <w:t>Macenski, S., Martin, F., White, R. and Gin</w:t>
+      </w:r>
+      <w:r>
+        <w:rPr>
+          <w:rFonts w:eastAsia="Times New Roman" w:cs="Times New Roman"/>
+          <w:color w:val="000000"/>
+          <w:kern w:val="0"/>
+          <w:lang w:eastAsia="en-GB"/>
+          <w14:ligatures w14:val="none"/>
+        </w:rPr>
+        <w:t>é</w:t>
+      </w:r>
+      <w:r>
+        <w:rPr>
+          <w:rFonts w:eastAsia="Times New Roman" w:cs="Times New Roman"/>
+          <w:color w:val="000000"/>
+          <w:kern w:val="0"/>
+          <w:lang w:eastAsia="en-GB"/>
+          <w14:ligatures w14:val="none"/>
+        </w:rPr>
+        <w:t>s Clavero, J. (2020) ‘The Marathon 2: A Navigation System.’ In: Proceedings of the IEEE/RSJ International Conference on Intelligent Robots and Systems (IROS). Las Vegas, 24-30 October 2020: 2718-2725</w:t>
       </w:r>
     </w:p>
     <w:p>
@@ -16343,6 +16361,7 @@
   <w:style w:type="character" w:default="1" w:styleId="DefaultParagraphFont">
     <w:name w:val="Default Paragraph Font"/>
     <w:uiPriority w:val="1"/>
+    <w:semiHidden/>
     <w:unhideWhenUsed/>
   </w:style>
   <w:style w:type="table" w:default="1" w:styleId="TableNormal">

</xml_diff>

<commit_message>
Update Robotics Software and Programming Report: Adjust submission date, refine word count, enhance source code links, and correct table of contents. Revise abstract and introduction for clarity, and improve task descriptions. Modify figures and tables for consistency, and ensure accurate logging of mission metrics in Task 2. Address grammar and formatting issues throughout the document.
</commit_message>
<xml_diff>
--- a/Sem2/Robotics Software and Programming/Report.docx
+++ b/Sem2/Robotics Software and Programming/Report.docx
@@ -554,8 +554,8 @@
         <w:tblLook w:val="04A0" w:firstRow="1" w:lastRow="0" w:firstColumn="1" w:lastColumn="0" w:noHBand="0" w:noVBand="1"/>
       </w:tblPr>
       <w:tblGrid>
-        <w:gridCol w:w="7809"/>
-        <w:gridCol w:w="1201"/>
+        <w:gridCol w:w="5611"/>
+        <w:gridCol w:w="3399"/>
       </w:tblGrid>
       <w:tr>
         <w:trPr>
@@ -669,16 +669,24 @@
             <w:pPr>
               <w:jc w:val="left"/>
               <w:rPr>
+                <w:rFonts w:eastAsiaTheme="majorEastAsia"/>
+                <w:color w:val="000000" w:themeColor="text1"/>
+                <w:lang w:val="en-US"/>
+              </w:rPr>
+            </w:pPr>
+            <w:r>
+              <w:rPr>
                 <w:rFonts w:eastAsiaTheme="majorEastAsia" w:cs="Times New Roman"/>
                 <w:color w:val="000000" w:themeColor="text1"/>
               </w:rPr>
-            </w:pPr>
+              <w:t>Word count</w:t>
+            </w:r>
             <w:r>
               <w:rPr>
                 <w:rFonts w:eastAsiaTheme="majorEastAsia" w:cs="Times New Roman"/>
                 <w:color w:val="000000" w:themeColor="text1"/>
               </w:rPr>
-              <w:t>Word count</w:t>
+              <w:t xml:space="preserve"> </w:t>
             </w:r>
           </w:p>
         </w:tc>
@@ -713,7 +721,49 @@
                 <w:rFonts w:eastAsiaTheme="majorEastAsia" w:cs="Times New Roman"/>
                 <w:color w:val="000000" w:themeColor="text1"/>
               </w:rPr>
-              <w:t>3,286</w:t>
+              <w:t>3,</w:t>
+            </w:r>
+            <w:r>
+              <w:rPr>
+                <w:rFonts w:eastAsiaTheme="majorEastAsia" w:cs="Times New Roman"/>
+                <w:color w:val="000000" w:themeColor="text1"/>
+              </w:rPr>
+              <w:t>137</w:t>
+            </w:r>
+            <w:r>
+              <w:rPr>
+                <w:rFonts w:eastAsiaTheme="majorEastAsia" w:cs="Times New Roman"/>
+                <w:color w:val="000000" w:themeColor="text1"/>
+              </w:rPr>
+              <w:t xml:space="preserve"> (M</w:t>
+            </w:r>
+            <w:r>
+              <w:rPr>
+                <w:rFonts w:eastAsiaTheme="majorEastAsia" w:cs="Times New Roman"/>
+                <w:color w:val="000000" w:themeColor="text1"/>
+              </w:rPr>
+              <w:t>ain body including headings and code</w:t>
+            </w:r>
+            <w:r>
+              <w:rPr>
+                <w:rFonts w:eastAsiaTheme="majorEastAsia" w:cs="Times New Roman"/>
+                <w:color w:val="000000" w:themeColor="text1"/>
+              </w:rPr>
+              <w:t xml:space="preserve">, </w:t>
+            </w:r>
+            <w:r>
+              <w:rPr>
+                <w:rFonts w:eastAsiaTheme="majorEastAsia" w:cs="Times New Roman"/>
+                <w:color w:val="000000" w:themeColor="text1"/>
+              </w:rPr>
+              <w:t>excluding captions and tables</w:t>
+            </w:r>
+            <w:r>
+              <w:rPr>
+                <w:rFonts w:eastAsiaTheme="majorEastAsia" w:cs="Times New Roman"/>
+                <w:color w:val="000000" w:themeColor="text1"/>
+              </w:rPr>
+              <w:t>)</w:t>
             </w:r>
           </w:p>
         </w:tc>
@@ -1119,8 +1169,8 @@
         <w:tblLook w:val="04A0" w:firstRow="1" w:lastRow="0" w:firstColumn="1" w:lastColumn="0" w:noHBand="0" w:noVBand="1"/>
       </w:tblPr>
       <w:tblGrid>
-        <w:gridCol w:w="4663"/>
-        <w:gridCol w:w="4286"/>
+        <w:gridCol w:w="4793"/>
+        <w:gridCol w:w="4156"/>
       </w:tblGrid>
       <w:tr>
         <w:trPr>
@@ -1338,7 +1388,14 @@
                 <w:rFonts w:cs="Times New Roman"/>
                 <w:bCs/>
               </w:rPr>
-              <w:t xml:space="preserve">23 / </w:t>
+              <w:t>9</w:t>
+            </w:r>
+            <w:r>
+              <w:rPr>
+                <w:rFonts w:cs="Times New Roman"/>
+                <w:bCs/>
+              </w:rPr>
+              <w:t xml:space="preserve"> / </w:t>
             </w:r>
             <w:r>
               <w:rPr>
@@ -1580,7 +1637,7 @@
             </w:rPr>
             <w:fldChar w:fldCharType="separate"/>
           </w:r>
-          <w:hyperlink w:anchor="_Toc241707424" w:history="1">
+          <w:hyperlink w:anchor="_Toc241936871" w:history="1">
             <w:r>
               <w:rPr>
                 <w:rStyle w:val="Hyperlink"/>
@@ -1607,7 +1664,7 @@
                 <w:noProof/>
                 <w:webHidden/>
               </w:rPr>
-              <w:instrText xml:space="preserve"> PAGEREF _Toc241707424 \h </w:instrText>
+              <w:instrText xml:space="preserve"> PAGEREF _Toc241936871 \h </w:instrText>
             </w:r>
             <w:r>
               <w:rPr>
@@ -1647,7 +1704,7 @@
               <w:lang w:val="en-US"/>
             </w:rPr>
           </w:pPr>
-          <w:hyperlink w:anchor="_Toc241707425" w:history="1">
+          <w:hyperlink w:anchor="_Toc241936872" w:history="1">
             <w:r>
               <w:rPr>
                 <w:rStyle w:val="Hyperlink"/>
@@ -1674,7 +1731,7 @@
                 <w:noProof/>
                 <w:webHidden/>
               </w:rPr>
-              <w:instrText xml:space="preserve"> PAGEREF _Toc241707425 \h </w:instrText>
+              <w:instrText xml:space="preserve"> PAGEREF _Toc241936872 \h </w:instrText>
             </w:r>
             <w:r>
               <w:rPr>
@@ -1714,7 +1771,7 @@
               <w:lang w:val="en-US"/>
             </w:rPr>
           </w:pPr>
-          <w:hyperlink w:anchor="_Toc241707426" w:history="1">
+          <w:hyperlink w:anchor="_Toc241936873" w:history="1">
             <w:r>
               <w:rPr>
                 <w:rStyle w:val="Hyperlink"/>
@@ -1741,7 +1798,7 @@
                 <w:noProof/>
                 <w:webHidden/>
               </w:rPr>
-              <w:instrText xml:space="preserve"> PAGEREF _Toc241707426 \h </w:instrText>
+              <w:instrText xml:space="preserve"> PAGEREF _Toc241936873 \h </w:instrText>
             </w:r>
             <w:r>
               <w:rPr>
@@ -1781,7 +1838,7 @@
               <w:lang w:val="en-US"/>
             </w:rPr>
           </w:pPr>
-          <w:hyperlink w:anchor="_Toc241707427" w:history="1">
+          <w:hyperlink w:anchor="_Toc241936874" w:history="1">
             <w:r>
               <w:rPr>
                 <w:rStyle w:val="Hyperlink"/>
@@ -1808,7 +1865,7 @@
                 <w:noProof/>
                 <w:webHidden/>
               </w:rPr>
-              <w:instrText xml:space="preserve"> PAGEREF _Toc241707427 \h </w:instrText>
+              <w:instrText xml:space="preserve"> PAGEREF _Toc241936874 \h </w:instrText>
             </w:r>
             <w:r>
               <w:rPr>
@@ -1848,7 +1905,7 @@
               <w:lang w:val="en-US"/>
             </w:rPr>
           </w:pPr>
-          <w:hyperlink w:anchor="_Toc241707428" w:history="1">
+          <w:hyperlink w:anchor="_Toc241936875" w:history="1">
             <w:r>
               <w:rPr>
                 <w:rStyle w:val="Hyperlink"/>
@@ -1875,7 +1932,7 @@
                 <w:noProof/>
                 <w:webHidden/>
               </w:rPr>
-              <w:instrText xml:space="preserve"> PAGEREF _Toc241707428 \h </w:instrText>
+              <w:instrText xml:space="preserve"> PAGEREF _Toc241936875 \h </w:instrText>
             </w:r>
             <w:r>
               <w:rPr>
@@ -1915,7 +1972,7 @@
               <w:lang w:val="en-US"/>
             </w:rPr>
           </w:pPr>
-          <w:hyperlink w:anchor="_Toc241707429" w:history="1">
+          <w:hyperlink w:anchor="_Toc241936876" w:history="1">
             <w:r>
               <w:rPr>
                 <w:rStyle w:val="Hyperlink"/>
@@ -1942,7 +1999,7 @@
                 <w:noProof/>
                 <w:webHidden/>
               </w:rPr>
-              <w:instrText xml:space="preserve"> PAGEREF _Toc241707429 \h </w:instrText>
+              <w:instrText xml:space="preserve"> PAGEREF _Toc241936876 \h </w:instrText>
             </w:r>
             <w:r>
               <w:rPr>
@@ -1962,7 +2019,7 @@
                 <w:noProof/>
                 <w:webHidden/>
               </w:rPr>
-              <w:t>9</w:t>
+              <w:t>8</w:t>
             </w:r>
             <w:r>
               <w:rPr>
@@ -1982,7 +2039,7 @@
               <w:lang w:val="en-US"/>
             </w:rPr>
           </w:pPr>
-          <w:hyperlink w:anchor="_Toc241707430" w:history="1">
+          <w:hyperlink w:anchor="_Toc241936877" w:history="1">
             <w:r>
               <w:rPr>
                 <w:rStyle w:val="Hyperlink"/>
@@ -2010,7 +2067,7 @@
                 <w:noProof/>
                 <w:webHidden/>
               </w:rPr>
-              <w:instrText xml:space="preserve"> PAGEREF _Toc241707430 \h </w:instrText>
+              <w:instrText xml:space="preserve"> PAGEREF _Toc241936877 \h </w:instrText>
             </w:r>
             <w:r>
               <w:rPr>
@@ -2050,7 +2107,7 @@
               <w:lang w:val="en-US"/>
             </w:rPr>
           </w:pPr>
-          <w:hyperlink w:anchor="_Toc241707431" w:history="1">
+          <w:hyperlink w:anchor="_Toc241936878" w:history="1">
             <w:r>
               <w:rPr>
                 <w:rStyle w:val="Hyperlink"/>
@@ -2077,7 +2134,7 @@
                 <w:noProof/>
                 <w:webHidden/>
               </w:rPr>
-              <w:instrText xml:space="preserve"> PAGEREF _Toc241707431 \h </w:instrText>
+              <w:instrText xml:space="preserve"> PAGEREF _Toc241936878 \h </w:instrText>
             </w:r>
             <w:r>
               <w:rPr>
@@ -2117,7 +2174,7 @@
               <w:lang w:val="en-US"/>
             </w:rPr>
           </w:pPr>
-          <w:hyperlink w:anchor="_Toc241707432" w:history="1">
+          <w:hyperlink w:anchor="_Toc241936879" w:history="1">
             <w:r>
               <w:rPr>
                 <w:rStyle w:val="Hyperlink"/>
@@ -2144,7 +2201,7 @@
                 <w:noProof/>
                 <w:webHidden/>
               </w:rPr>
-              <w:instrText xml:space="preserve"> PAGEREF _Toc241707432 \h </w:instrText>
+              <w:instrText xml:space="preserve"> PAGEREF _Toc241936879 \h </w:instrText>
             </w:r>
             <w:r>
               <w:rPr>
@@ -2184,7 +2241,7 @@
               <w:lang w:val="en-US"/>
             </w:rPr>
           </w:pPr>
-          <w:hyperlink w:anchor="_Toc241707433" w:history="1">
+          <w:hyperlink w:anchor="_Toc241936880" w:history="1">
             <w:r>
               <w:rPr>
                 <w:rStyle w:val="Hyperlink"/>
@@ -2211,7 +2268,7 @@
                 <w:noProof/>
                 <w:webHidden/>
               </w:rPr>
-              <w:instrText xml:space="preserve"> PAGEREF _Toc241707433 \h </w:instrText>
+              <w:instrText xml:space="preserve"> PAGEREF _Toc241936880 \h </w:instrText>
             </w:r>
             <w:r>
               <w:rPr>
@@ -2251,7 +2308,7 @@
               <w:lang w:val="en-US"/>
             </w:rPr>
           </w:pPr>
-          <w:hyperlink w:anchor="_Toc241707434" w:history="1">
+          <w:hyperlink w:anchor="_Toc241936881" w:history="1">
             <w:r>
               <w:rPr>
                 <w:rStyle w:val="Hyperlink"/>
@@ -2278,7 +2335,7 @@
                 <w:noProof/>
                 <w:webHidden/>
               </w:rPr>
-              <w:instrText xml:space="preserve"> PAGEREF _Toc241707434 \h </w:instrText>
+              <w:instrText xml:space="preserve"> PAGEREF _Toc241936881 \h </w:instrText>
             </w:r>
             <w:r>
               <w:rPr>
@@ -2318,7 +2375,7 @@
               <w:lang w:val="en-US"/>
             </w:rPr>
           </w:pPr>
-          <w:hyperlink w:anchor="_Toc241707435" w:history="1">
+          <w:hyperlink w:anchor="_Toc241936882" w:history="1">
             <w:r>
               <w:rPr>
                 <w:rStyle w:val="Hyperlink"/>
@@ -2345,7 +2402,7 @@
                 <w:noProof/>
                 <w:webHidden/>
               </w:rPr>
-              <w:instrText xml:space="preserve"> PAGEREF _Toc241707435 \h </w:instrText>
+              <w:instrText xml:space="preserve"> PAGEREF _Toc241936882 \h </w:instrText>
             </w:r>
             <w:r>
               <w:rPr>
@@ -2385,7 +2442,7 @@
               <w:lang w:val="en-US"/>
             </w:rPr>
           </w:pPr>
-          <w:hyperlink w:anchor="_Toc241707436" w:history="1">
+          <w:hyperlink w:anchor="_Toc241936883" w:history="1">
             <w:r>
               <w:rPr>
                 <w:rStyle w:val="Hyperlink"/>
@@ -2412,7 +2469,7 @@
                 <w:noProof/>
                 <w:webHidden/>
               </w:rPr>
-              <w:instrText xml:space="preserve"> PAGEREF _Toc241707436 \h </w:instrText>
+              <w:instrText xml:space="preserve"> PAGEREF _Toc241936883 \h </w:instrText>
             </w:r>
             <w:r>
               <w:rPr>
@@ -2432,7 +2489,7 @@
                 <w:noProof/>
                 <w:webHidden/>
               </w:rPr>
-              <w:t>17</w:t>
+              <w:t>18</w:t>
             </w:r>
             <w:r>
               <w:rPr>
@@ -2452,7 +2509,7 @@
               <w:lang w:val="en-US"/>
             </w:rPr>
           </w:pPr>
-          <w:hyperlink w:anchor="_Toc241707437" w:history="1">
+          <w:hyperlink w:anchor="_Toc241936884" w:history="1">
             <w:r>
               <w:rPr>
                 <w:rStyle w:val="Hyperlink"/>
@@ -2479,7 +2536,7 @@
                 <w:noProof/>
                 <w:webHidden/>
               </w:rPr>
-              <w:instrText xml:space="preserve"> PAGEREF _Toc241707437 \h </w:instrText>
+              <w:instrText xml:space="preserve"> PAGEREF _Toc241936884 \h </w:instrText>
             </w:r>
             <w:r>
               <w:rPr>
@@ -2499,7 +2556,7 @@
                 <w:noProof/>
                 <w:webHidden/>
               </w:rPr>
-              <w:t>21</w:t>
+              <w:t>22</w:t>
             </w:r>
             <w:r>
               <w:rPr>
@@ -2519,7 +2576,7 @@
               <w:lang w:val="en-US"/>
             </w:rPr>
           </w:pPr>
-          <w:hyperlink w:anchor="_Toc241707438" w:history="1">
+          <w:hyperlink w:anchor="_Toc241936885" w:history="1">
             <w:r>
               <w:rPr>
                 <w:rStyle w:val="Hyperlink"/>
@@ -2546,7 +2603,7 @@
                 <w:noProof/>
                 <w:webHidden/>
               </w:rPr>
-              <w:instrText xml:space="preserve"> PAGEREF _Toc241707438 \h </w:instrText>
+              <w:instrText xml:space="preserve"> PAGEREF _Toc241936885 \h </w:instrText>
             </w:r>
             <w:r>
               <w:rPr>
@@ -2586,7 +2643,7 @@
               <w:lang w:val="en-US"/>
             </w:rPr>
           </w:pPr>
-          <w:hyperlink w:anchor="_Toc241707439" w:history="1">
+          <w:hyperlink w:anchor="_Toc241936886" w:history="1">
             <w:r>
               <w:rPr>
                 <w:rStyle w:val="Hyperlink"/>
@@ -2613,7 +2670,7 @@
                 <w:noProof/>
                 <w:webHidden/>
               </w:rPr>
-              <w:instrText xml:space="preserve"> PAGEREF _Toc241707439 \h </w:instrText>
+              <w:instrText xml:space="preserve"> PAGEREF _Toc241936886 \h </w:instrText>
             </w:r>
             <w:r>
               <w:rPr>
@@ -2653,7 +2710,7 @@
               <w:lang w:val="en-US"/>
             </w:rPr>
           </w:pPr>
-          <w:hyperlink w:anchor="_Toc241707440" w:history="1">
+          <w:hyperlink w:anchor="_Toc241936887" w:history="1">
             <w:r>
               <w:rPr>
                 <w:rStyle w:val="Hyperlink"/>
@@ -2680,7 +2737,7 @@
                 <w:noProof/>
                 <w:webHidden/>
               </w:rPr>
-              <w:instrText xml:space="preserve"> PAGEREF _Toc241707440 \h </w:instrText>
+              <w:instrText xml:space="preserve"> PAGEREF _Toc241936887 \h </w:instrText>
             </w:r>
             <w:r>
               <w:rPr>
@@ -2720,7 +2777,7 @@
               <w:lang w:val="en-US"/>
             </w:rPr>
           </w:pPr>
-          <w:hyperlink w:anchor="_Toc241707441" w:history="1">
+          <w:hyperlink w:anchor="_Toc241936888" w:history="1">
             <w:r>
               <w:rPr>
                 <w:rStyle w:val="Hyperlink"/>
@@ -2747,7 +2804,7 @@
                 <w:noProof/>
                 <w:webHidden/>
               </w:rPr>
-              <w:instrText xml:space="preserve"> PAGEREF _Toc241707441 \h </w:instrText>
+              <w:instrText xml:space="preserve"> PAGEREF _Toc241936888 \h </w:instrText>
             </w:r>
             <w:r>
               <w:rPr>
@@ -3279,7 +3336,7 @@
             <w:noProof/>
             <w:webHidden/>
           </w:rPr>
-          <w:t>18</w:t>
+          <w:t>19</w:t>
         </w:r>
         <w:r>
           <w:rPr>
@@ -3421,7 +3478,7 @@
             <w:noProof/>
             <w:webHidden/>
           </w:rPr>
-          <w:t>19</w:t>
+          <w:t>20</w:t>
         </w:r>
         <w:r>
           <w:rPr>
@@ -3563,7 +3620,7 @@
             <w:noProof/>
             <w:webHidden/>
           </w:rPr>
-          <w:t>21</w:t>
+          <w:t>22</w:t>
         </w:r>
         <w:r>
           <w:rPr>
@@ -4215,20 +4272,27 @@
           <w:rFonts w:cs="Times New Roman"/>
           <w:u w:val="dotted"/>
         </w:rPr>
-        <w:t xml:space="preserve">23 / </w:t>
+        <w:t>9</w:t>
       </w:r>
       <w:r>
         <w:rPr>
           <w:rFonts w:cs="Times New Roman"/>
           <w:u w:val="dotted"/>
         </w:rPr>
-        <w:t xml:space="preserve">October </w:t>
+        <w:t xml:space="preserve"> / </w:t>
       </w:r>
       <w:r>
         <w:rPr>
           <w:rFonts w:cs="Times New Roman"/>
           <w:u w:val="dotted"/>
         </w:rPr>
+        <w:t xml:space="preserve">October </w:t>
+      </w:r>
+      <w:r>
+        <w:rPr>
+          <w:rFonts w:cs="Times New Roman"/>
+          <w:u w:val="dotted"/>
+        </w:rPr>
         <w:t>/ 2026</w:t>
       </w:r>
     </w:p>
@@ -4259,7 +4323,7 @@
       <w:pPr>
         <w:pStyle w:val="Heading1"/>
       </w:pPr>
-      <w:bookmarkStart w:id="0" w:name="_Toc241707424"/>
+      <w:bookmarkStart w:id="0" w:name="_Toc241936871"/>
       <w:bookmarkStart w:id="1" w:name="abstract"/>
       <w:r>
         <w:lastRenderedPageBreak/>
@@ -4308,7 +4372,17 @@
           <w:lang w:eastAsia="en-GB"/>
           <w14:ligatures w14:val="none"/>
         </w:rPr>
-        <w:t xml:space="preserve"> simulation of an inspection and light-warehousing room with five URDF object categories, fourteen objects, a two-wheel robot and six camera viewpoints. A dictionary called </w:t>
+        <w:t xml:space="preserve"> simulation of an inspection and light-warehousing room with five URDF object categories, fourteen objects, a two-wheel robot and six camera viewpoints. </w:t>
+      </w:r>
+      <w:r>
+        <w:rPr>
+          <w:rFonts w:eastAsia="Times New Roman" w:cs="Times New Roman"/>
+          <w:color w:val="000000"/>
+          <w:kern w:val="0"/>
+          <w:lang w:eastAsia="en-GB"/>
+          <w14:ligatures w14:val="none"/>
+        </w:rPr>
+        <w:t xml:space="preserve">A dictionary called </w:t>
       </w:r>
       <w:proofErr w:type="spellStart"/>
       <w:r>
@@ -4330,7 +4404,67 @@
           <w:lang w:eastAsia="en-GB"/>
           <w14:ligatures w14:val="none"/>
         </w:rPr>
-        <w:t xml:space="preserve"> stores each object's role and supports role lookups and nearest-target queries. Task 2 is a TurtleBot3 patrol robot in ROS2 with a six-state finite state machine. It runs in a custom Gazebo warehouse world with eight pallet obstacles and four checkpoints, one of which is the charging dock. The robot plans a route, avoids obstacles using LIDAR and odometry, and takes keyboard commands. A monitoring node logs state transitions and mission metrics. The mission reached MISSION_COMPLETE on TheConstruct.ai in </w:t>
+        <w:t xml:space="preserve"> stores each object's role for lookups</w:t>
+      </w:r>
+      <w:r>
+        <w:rPr>
+          <w:rFonts w:eastAsia="Times New Roman" w:cs="Times New Roman"/>
+          <w:color w:val="000000"/>
+          <w:kern w:val="0"/>
+          <w:lang w:eastAsia="en-GB"/>
+          <w14:ligatures w14:val="none"/>
+        </w:rPr>
+        <w:t xml:space="preserve">. Task 2 is a TurtleBot3 patrol robot in ROS2 with a six-state finite state machine. </w:t>
+      </w:r>
+      <w:r>
+        <w:rPr>
+          <w:rFonts w:eastAsia="Times New Roman" w:cs="Times New Roman"/>
+          <w:color w:val="000000"/>
+          <w:kern w:val="0"/>
+          <w:lang w:eastAsia="en-GB"/>
+          <w14:ligatures w14:val="none"/>
+        </w:rPr>
+        <w:t xml:space="preserve">The </w:t>
+      </w:r>
+      <w:r>
+        <w:rPr>
+          <w:rFonts w:eastAsia="Times New Roman" w:cs="Times New Roman"/>
+          <w:color w:val="000000"/>
+          <w:kern w:val="0"/>
+          <w:lang w:eastAsia="en-GB"/>
+          <w14:ligatures w14:val="none"/>
+        </w:rPr>
+        <w:t>world is a custom Gazebo warehouse with eight pallet obstacles and four checkpoints. One checkpoint is the charging dock</w:t>
+      </w:r>
+      <w:r>
+        <w:rPr>
+          <w:rFonts w:eastAsia="Times New Roman" w:cs="Times New Roman"/>
+          <w:color w:val="000000"/>
+          <w:kern w:val="0"/>
+          <w:lang w:eastAsia="en-GB"/>
+          <w14:ligatures w14:val="none"/>
+        </w:rPr>
+        <w:t xml:space="preserve">. </w:t>
+      </w:r>
+      <w:r>
+        <w:rPr>
+          <w:rFonts w:eastAsia="Times New Roman" w:cs="Times New Roman"/>
+          <w:color w:val="000000"/>
+          <w:kern w:val="0"/>
+          <w:lang w:eastAsia="en-GB"/>
+          <w14:ligatures w14:val="none"/>
+        </w:rPr>
+        <w:t>The robot plans its route first. It uses LIDAR and odometry to avoid obstacles and follows keyboard commands</w:t>
+      </w:r>
+      <w:r>
+        <w:rPr>
+          <w:rFonts w:eastAsia="Times New Roman" w:cs="Times New Roman"/>
+          <w:color w:val="000000"/>
+          <w:kern w:val="0"/>
+          <w:lang w:eastAsia="en-GB"/>
+          <w14:ligatures w14:val="none"/>
+        </w:rPr>
+        <w:t xml:space="preserve">. A monitoring node logs state transitions and mission metrics. The mission reached MISSION_COMPLETE on TheConstruct.ai in </w:t>
       </w:r>
       <w:proofErr w:type="spellStart"/>
       <w:r>
@@ -4393,7 +4527,7 @@
       <w:pPr>
         <w:pStyle w:val="Heading1"/>
       </w:pPr>
-      <w:bookmarkStart w:id="3" w:name="_Toc241707425"/>
+      <w:bookmarkStart w:id="3" w:name="_Toc241936872"/>
       <w:r>
         <w:lastRenderedPageBreak/>
         <w:t>I</w:t>
@@ -4462,7 +4596,17 @@
           <w:lang w:eastAsia="en-GB"/>
           <w14:ligatures w14:val="none"/>
         </w:rPr>
-        <w:t xml:space="preserve">two stages of increasing complexity. The first is an interactive </w:t>
+        <w:t xml:space="preserve">two stages of increasing complexity. </w:t>
+      </w:r>
+      <w:r>
+        <w:rPr>
+          <w:rFonts w:eastAsia="Times New Roman" w:cs="Times New Roman"/>
+          <w:color w:val="000000"/>
+          <w:kern w:val="0"/>
+          <w:lang w:eastAsia="en-GB"/>
+          <w14:ligatures w14:val="none"/>
+        </w:rPr>
+        <w:t xml:space="preserve">Task 1 is a </w:t>
       </w:r>
       <w:proofErr w:type="spellStart"/>
       <w:r>
@@ -4484,27 +4628,57 @@
           <w:lang w:eastAsia="en-GB"/>
           <w14:ligatures w14:val="none"/>
         </w:rPr>
-        <w:t xml:space="preserve"> environment with object-level semantics. The second is a ROS2-based autonomous system</w:t>
-      </w:r>
-      <w:r>
-        <w:rPr>
-          <w:rFonts w:eastAsia="Times New Roman" w:cs="Times New Roman"/>
-          <w:color w:val="000000"/>
-          <w:kern w:val="0"/>
-          <w:lang w:eastAsia="en-GB"/>
-          <w14:ligatures w14:val="none"/>
-        </w:rPr>
-        <w:t xml:space="preserve"> with sensing, navigation, human interaction and self-monitoring. </w:t>
-      </w:r>
-      <w:r>
-        <w:rPr>
-          <w:rFonts w:eastAsia="Times New Roman" w:cs="Times New Roman"/>
-          <w:color w:val="000000"/>
-          <w:kern w:val="0"/>
-          <w:lang w:eastAsia="en-GB"/>
-          <w14:ligatures w14:val="none"/>
-        </w:rPr>
-        <w:t>The two stages use different tools, but the guidelines ask for one report, so both are covered here using the BSBI template.</w:t>
+        <w:t xml:space="preserve"> room where every object has a role</w:t>
+      </w:r>
+      <w:r>
+        <w:rPr>
+          <w:rFonts w:eastAsia="Times New Roman" w:cs="Times New Roman"/>
+          <w:color w:val="000000"/>
+          <w:kern w:val="0"/>
+          <w:lang w:eastAsia="en-GB"/>
+          <w14:ligatures w14:val="none"/>
+        </w:rPr>
+        <w:t xml:space="preserve">. </w:t>
+      </w:r>
+      <w:r>
+        <w:rPr>
+          <w:rFonts w:eastAsia="Times New Roman" w:cs="Times New Roman"/>
+          <w:color w:val="000000"/>
+          <w:kern w:val="0"/>
+          <w:lang w:eastAsia="en-GB"/>
+          <w14:ligatures w14:val="none"/>
+        </w:rPr>
+        <w:t>Task 2 is a ROS2 robot that senses its surroundings, navigates, takes keyboard input and logs its own performance</w:t>
+      </w:r>
+      <w:r>
+        <w:rPr>
+          <w:rFonts w:eastAsia="Times New Roman" w:cs="Times New Roman"/>
+          <w:color w:val="000000"/>
+          <w:kern w:val="0"/>
+          <w:lang w:eastAsia="en-GB"/>
+          <w14:ligatures w14:val="none"/>
+        </w:rPr>
+        <w:t xml:space="preserve">. </w:t>
+      </w:r>
+      <w:r>
+        <w:rPr>
+          <w:rFonts w:eastAsia="Times New Roman" w:cs="Times New Roman"/>
+          <w:color w:val="000000"/>
+          <w:kern w:val="0"/>
+          <w:lang w:eastAsia="en-GB"/>
+          <w14:ligatures w14:val="none"/>
+        </w:rPr>
+        <w:t>The tasks use different tools, but the guidelines ask for one report. Both are in this report, in the BSBI template</w:t>
+      </w:r>
+      <w:r>
+        <w:rPr>
+          <w:rFonts w:eastAsia="Times New Roman" w:cs="Times New Roman"/>
+          <w:color w:val="000000"/>
+          <w:kern w:val="0"/>
+          <w:lang w:eastAsia="en-GB"/>
+          <w14:ligatures w14:val="none"/>
+        </w:rPr>
+        <w:t>.</w:t>
       </w:r>
     </w:p>
     <w:p>
@@ -4526,7 +4700,27 @@
           <w:lang w:eastAsia="en-GB"/>
           <w14:ligatures w14:val="none"/>
         </w:rPr>
-        <w:t>In Task 1, every object in the simulated room gets a role (obstacle, target, landmark, shelf or charger) that is stored and can be looked up in code. Task 2 applies the idea to a moving robot that reads LIDAR and odometry, switches between behaviour states, and reports what it did and why</w:t>
+        <w:t>In Task 1, each object in the room has a role (obstacle, target, landmark, shelf or charger). The role is stored in code and can be looked up</w:t>
+      </w:r>
+      <w:r>
+        <w:rPr>
+          <w:rFonts w:eastAsia="Times New Roman" w:cs="Times New Roman"/>
+          <w:color w:val="000000"/>
+          <w:kern w:val="0"/>
+          <w:lang w:eastAsia="en-GB"/>
+          <w14:ligatures w14:val="none"/>
+        </w:rPr>
+        <w:t xml:space="preserve">. </w:t>
+      </w:r>
+      <w:r>
+        <w:rPr>
+          <w:rFonts w:eastAsia="Times New Roman" w:cs="Times New Roman"/>
+          <w:color w:val="000000"/>
+          <w:kern w:val="0"/>
+          <w:lang w:eastAsia="en-GB"/>
+          <w14:ligatures w14:val="none"/>
+        </w:rPr>
+        <w:t>Task 2 moves from a fixed scene to a moving robot. It reads LIDAR and odometry, switches between states and logs what it did and why</w:t>
       </w:r>
       <w:r>
         <w:rPr>
@@ -4576,7 +4770,7 @@
       <w:pPr>
         <w:pStyle w:val="Heading1"/>
       </w:pPr>
-      <w:bookmarkStart w:id="5" w:name="_Toc241707426"/>
+      <w:bookmarkStart w:id="5" w:name="_Toc241936873"/>
       <w:r>
         <w:lastRenderedPageBreak/>
         <w:t xml:space="preserve">Task 1: Interactive </w:t>
@@ -4595,7 +4789,7 @@
       <w:pPr>
         <w:pStyle w:val="Heading2"/>
       </w:pPr>
-      <w:bookmarkStart w:id="6" w:name="_Toc241707427"/>
+      <w:bookmarkStart w:id="6" w:name="_Toc241936874"/>
       <w:bookmarkStart w:id="7" w:name="project-definition"/>
       <w:r>
         <w:t>3.1 Project Definition</w:t>
@@ -4653,17 +4847,27 @@
           <w:lang w:eastAsia="en-GB"/>
           <w14:ligatures w14:val="none"/>
         </w:rPr>
-        <w:t xml:space="preserve">. I sketched the room on paper before writing any code. It was a six by four metre space with </w:t>
-      </w:r>
-      <w:r>
-        <w:rPr>
-          <w:rFonts w:eastAsia="Times New Roman" w:cs="Times New Roman"/>
-          <w:color w:val="000000"/>
-          <w:kern w:val="0"/>
-          <w:lang w:eastAsia="en-GB"/>
-          <w14:ligatures w14:val="none"/>
-        </w:rPr>
-        <w:t>one entrance, a central aisle, shelving along the back wall, a charging dock near the entrance and a landmark at each corner. I then turned the sketch into URDF categories and coordinates.</w:t>
+        <w:t xml:space="preserve">. I sketched the room on paper before writing any code. </w:t>
+      </w:r>
+      <w:r>
+        <w:rPr>
+          <w:rFonts w:eastAsia="Times New Roman" w:cs="Times New Roman"/>
+          <w:color w:val="000000"/>
+          <w:kern w:val="0"/>
+          <w:lang w:eastAsia="en-GB"/>
+          <w14:ligatures w14:val="none"/>
+        </w:rPr>
+        <w:t>six by four metres with one entrance, a central aisle, back-wall shelving, a charging dock near the entrance and a landmark at each corner</w:t>
+      </w:r>
+      <w:r>
+        <w:rPr>
+          <w:rFonts w:eastAsia="Times New Roman" w:cs="Times New Roman"/>
+          <w:color w:val="000000"/>
+          <w:kern w:val="0"/>
+          <w:lang w:eastAsia="en-GB"/>
+          <w14:ligatures w14:val="none"/>
+        </w:rPr>
+        <w:t>. I then turned the sketch into URDF categories and coordinates.</w:t>
       </w:r>
     </w:p>
     <w:p>
@@ -4742,7 +4946,7 @@
       <w:pPr>
         <w:pStyle w:val="Heading2"/>
       </w:pPr>
-      <w:bookmarkStart w:id="8" w:name="_Toc241707428"/>
+      <w:bookmarkStart w:id="8" w:name="_Toc241936875"/>
       <w:bookmarkStart w:id="9" w:name="design-and-implementation"/>
       <w:bookmarkEnd w:id="7"/>
       <w:r>
@@ -4836,7 +5040,7 @@
           <w:lang w:eastAsia="en-GB"/>
           <w14:ligatures w14:val="none"/>
         </w:rPr>
-        <w:t xml:space="preserve"> exposes the Bullet physics engine through Python, loads URDF models and includes a CPU renderer (Coumans and Bai, 2021; </w:t>
+        <w:t xml:space="preserve"> gives Python access to the Bullet physics engine. It loads URDF models and has a CPU renderer (Coumans and Bai, 2021; </w:t>
       </w:r>
       <w:proofErr w:type="spellStart"/>
       <w:r>
@@ -4882,6 +5086,36 @@
         </w:rPr>
         <w:t xml:space="preserve">. </w:t>
       </w:r>
+      <w:r>
+        <w:rPr>
+          <w:rFonts w:eastAsia="Times New Roman" w:cs="Times New Roman"/>
+          <w:color w:val="000000"/>
+          <w:kern w:val="0"/>
+          <w:lang w:eastAsia="en-GB"/>
+          <w14:ligatures w14:val="none"/>
+        </w:rPr>
+        <w:t>Collins et al. (2021) reviewed the physics simulators used in robotics</w:t>
+      </w:r>
+      <w:r>
+        <w:rPr>
+          <w:rFonts w:eastAsia="Times New Roman" w:cs="Times New Roman"/>
+          <w:color w:val="000000"/>
+          <w:kern w:val="0"/>
+          <w:lang w:eastAsia="en-GB"/>
+          <w14:ligatures w14:val="none"/>
+        </w:rPr>
+        <w:t xml:space="preserve">. </w:t>
+      </w:r>
+      <w:r>
+        <w:rPr>
+          <w:rFonts w:eastAsia="Times New Roman" w:cs="Times New Roman"/>
+          <w:color w:val="000000"/>
+          <w:kern w:val="0"/>
+          <w:lang w:eastAsia="en-GB"/>
+          <w14:ligatures w14:val="none"/>
+        </w:rPr>
+        <w:t xml:space="preserve">Task 1 only needs a scene and some renders, so </w:t>
+      </w:r>
       <w:proofErr w:type="spellStart"/>
       <w:r>
         <w:rPr>
@@ -4891,7 +5125,7 @@
           <w:lang w:eastAsia="en-GB"/>
           <w14:ligatures w14:val="none"/>
         </w:rPr>
-        <w:t>Collins</w:t>
+        <w:t>PyBullet</w:t>
       </w:r>
       <w:proofErr w:type="spellEnd"/>
       <w:r>
@@ -4902,29 +5136,17 @@
           <w:lang w:eastAsia="en-GB"/>
           <w14:ligatures w14:val="none"/>
         </w:rPr>
-        <w:t xml:space="preserve"> et al. (2021) review physics simulators used in robotics. Task 1 only needs scene building and rendering, so </w:t>
-      </w:r>
-      <w:proofErr w:type="spellStart"/>
-      <w:r>
-        <w:rPr>
-          <w:rFonts w:eastAsia="Times New Roman" w:cs="Times New Roman"/>
-          <w:color w:val="000000"/>
-          <w:kern w:val="0"/>
-          <w:lang w:eastAsia="en-GB"/>
-          <w14:ligatures w14:val="none"/>
-        </w:rPr>
-        <w:t>PyBullet</w:t>
-      </w:r>
-      <w:proofErr w:type="spellEnd"/>
-      <w:r>
-        <w:rPr>
-          <w:rFonts w:eastAsia="Times New Roman" w:cs="Times New Roman"/>
-          <w:color w:val="000000"/>
-          <w:kern w:val="0"/>
-          <w:lang w:eastAsia="en-GB"/>
-          <w14:ligatures w14:val="none"/>
-        </w:rPr>
-        <w:t xml:space="preserve"> was enough.</w:t>
+        <w:t xml:space="preserve"> was enough</w:t>
+      </w:r>
+      <w:r>
+        <w:rPr>
+          <w:rFonts w:eastAsia="Times New Roman" w:cs="Times New Roman"/>
+          <w:color w:val="000000"/>
+          <w:kern w:val="0"/>
+          <w:lang w:eastAsia="en-GB"/>
+          <w14:ligatures w14:val="none"/>
+        </w:rPr>
+        <w:t>.</w:t>
       </w:r>
     </w:p>
     <w:p>
@@ -5090,7 +5312,7 @@
           <w:lang w:eastAsia="en-GB"/>
           <w14:ligatures w14:val="none"/>
         </w:rPr>
-        <w:t>Task 1 is a much smaller hand-made scene that gives up realism in return for full control over the labels.</w:t>
+        <w:t>Task 1 is a small hand-made scene. It is less realistic, but I control every label.</w:t>
       </w:r>
     </w:p>
     <w:p>
@@ -5098,7 +5320,7 @@
         <w:pStyle w:val="Heading2"/>
         <w:spacing w:before="240"/>
       </w:pPr>
-      <w:bookmarkStart w:id="10" w:name="_Toc241707429"/>
+      <w:bookmarkStart w:id="10" w:name="_Toc241936876"/>
       <w:r>
         <w:t>3.3 Design and Implementation</w:t>
       </w:r>
@@ -5123,17 +5345,27 @@
           <w:lang w:eastAsia="en-GB"/>
           <w14:ligatures w14:val="none"/>
         </w:rPr>
-        <w:t xml:space="preserve">The notebook (Task1_PyBullet_Object_Semantics.ipynb) </w:t>
-      </w:r>
-      <w:r>
-        <w:rPr>
-          <w:rFonts w:eastAsia="Times New Roman" w:cs="Times New Roman"/>
-          <w:color w:val="000000"/>
-          <w:kern w:val="0"/>
-          <w:lang w:eastAsia="en-GB"/>
-          <w14:ligatures w14:val="none"/>
-        </w:rPr>
-        <w:t xml:space="preserve">has nine executable cells and is written in Python 3. The setup cell imports </w:t>
+        <w:t>The notebook (Task1_PyBullet_Object_Semantics.ipynb) is written in Python 3 and has nine executable cells.</w:t>
+      </w:r>
+      <w:r>
+        <w:rPr>
+          <w:rFonts w:eastAsia="Times New Roman" w:cs="Times New Roman"/>
+          <w:color w:val="000000"/>
+          <w:kern w:val="0"/>
+          <w:lang w:eastAsia="en-GB"/>
+          <w14:ligatures w14:val="none"/>
+        </w:rPr>
+        <w:t xml:space="preserve"> </w:t>
+      </w:r>
+      <w:r>
+        <w:rPr>
+          <w:rFonts w:eastAsia="Times New Roman" w:cs="Times New Roman"/>
+          <w:color w:val="000000"/>
+          <w:kern w:val="0"/>
+          <w:lang w:eastAsia="en-GB"/>
+          <w14:ligatures w14:val="none"/>
+        </w:rPr>
+        <w:t xml:space="preserve">The setup cell installs </w:t>
       </w:r>
       <w:proofErr w:type="spellStart"/>
       <w:r>
@@ -5155,6 +5387,28 @@
           <w:lang w:eastAsia="en-GB"/>
           <w14:ligatures w14:val="none"/>
         </w:rPr>
+        <w:t xml:space="preserve"> if it is missing, then imports </w:t>
+      </w:r>
+      <w:proofErr w:type="spellStart"/>
+      <w:r>
+        <w:rPr>
+          <w:rFonts w:eastAsia="Times New Roman" w:cs="Times New Roman"/>
+          <w:color w:val="000000"/>
+          <w:kern w:val="0"/>
+          <w:lang w:eastAsia="en-GB"/>
+          <w14:ligatures w14:val="none"/>
+        </w:rPr>
+        <w:t>pybullet</w:t>
+      </w:r>
+      <w:proofErr w:type="spellEnd"/>
+      <w:r>
+        <w:rPr>
+          <w:rFonts w:eastAsia="Times New Roman" w:cs="Times New Roman"/>
+          <w:color w:val="000000"/>
+          <w:kern w:val="0"/>
+          <w:lang w:eastAsia="en-GB"/>
+          <w14:ligatures w14:val="none"/>
+        </w:rPr>
         <w:t xml:space="preserve">, </w:t>
       </w:r>
       <w:proofErr w:type="spellStart"/>
@@ -5199,7 +5453,17 @@
           <w:lang w:eastAsia="en-GB"/>
           <w14:ligatures w14:val="none"/>
         </w:rPr>
-        <w:t xml:space="preserve"> and matplotlib, and installs </w:t>
+        <w:t xml:space="preserve"> and matplotlib</w:t>
+      </w:r>
+      <w:r>
+        <w:rPr>
+          <w:rFonts w:eastAsia="Times New Roman" w:cs="Times New Roman"/>
+          <w:color w:val="000000"/>
+          <w:kern w:val="0"/>
+          <w:lang w:eastAsia="en-GB"/>
+          <w14:ligatures w14:val="none"/>
+        </w:rPr>
+        <w:t xml:space="preserve">. The generation cell writes six URDF files, one each for the obstacle (crate), target zone, landmark, shelf and charging dock, plus the two-wheel robot with a box chassis and two cylindrical wheels. The environment cell connects to </w:t>
       </w:r>
       <w:proofErr w:type="spellStart"/>
       <w:r>
@@ -5210,7 +5474,7 @@
           <w:lang w:eastAsia="en-GB"/>
           <w14:ligatures w14:val="none"/>
         </w:rPr>
-        <w:t>pybullet</w:t>
+        <w:t>PyBullet</w:t>
       </w:r>
       <w:proofErr w:type="spellEnd"/>
       <w:r>
@@ -5221,7 +5485,7 @@
           <w:lang w:eastAsia="en-GB"/>
           <w14:ligatures w14:val="none"/>
         </w:rPr>
-        <w:t xml:space="preserve"> if it is missing. The generation cell writes six URDF files, one each for the obstacle (crate), target zone, landmark, shelf and charging dock, plus the two-wheel robot with a box chassis and two cylindrical wheels. The environment cell connects to </w:t>
+        <w:t xml:space="preserve"> in DIRECT mode, loads a ground plane from </w:t>
       </w:r>
       <w:proofErr w:type="spellStart"/>
       <w:r>
@@ -5232,7 +5496,7 @@
           <w:lang w:eastAsia="en-GB"/>
           <w14:ligatures w14:val="none"/>
         </w:rPr>
-        <w:t>PyBullet</w:t>
+        <w:t>pybullet_data</w:t>
       </w:r>
       <w:proofErr w:type="spellEnd"/>
       <w:r>
@@ -5243,7 +5507,7 @@
           <w:lang w:eastAsia="en-GB"/>
           <w14:ligatures w14:val="none"/>
         </w:rPr>
-        <w:t xml:space="preserve"> in </w:t>
+        <w:t xml:space="preserve"> and places the fourteen objects and </w:t>
       </w:r>
       <w:r>
         <w:rPr>
@@ -5254,39 +5518,47 @@
           <w14:ligatures w14:val="none"/>
         </w:rPr>
         <w:lastRenderedPageBreak/>
-        <w:t xml:space="preserve">DIRECT mode, loads a ground plane from </w:t>
-      </w:r>
-      <w:proofErr w:type="spellStart"/>
-      <w:r>
-        <w:rPr>
-          <w:rFonts w:eastAsia="Times New Roman" w:cs="Times New Roman"/>
-          <w:color w:val="000000"/>
-          <w:kern w:val="0"/>
-          <w:lang w:eastAsia="en-GB"/>
-          <w14:ligatures w14:val="none"/>
-        </w:rPr>
-        <w:t>pybullet_data</w:t>
-      </w:r>
-      <w:proofErr w:type="spellEnd"/>
-      <w:r>
-        <w:rPr>
-          <w:rFonts w:eastAsia="Times New Roman" w:cs="Times New Roman"/>
-          <w:color w:val="000000"/>
-          <w:kern w:val="0"/>
-          <w:lang w:eastAsia="en-GB"/>
-          <w14:ligatures w14:val="none"/>
-        </w:rPr>
-        <w:t xml:space="preserve"> and places the fourteen objects and the robot at the coordinates from my floor sketch. There are four crate obstacles flanking the aisle</w:t>
-      </w:r>
-      <w:r>
-        <w:rPr>
-          <w:rFonts w:eastAsia="Times New Roman" w:cs="Times New Roman"/>
-          <w:color w:val="000000"/>
-          <w:kern w:val="0"/>
-          <w:lang w:eastAsia="en-GB"/>
-          <w14:ligatures w14:val="none"/>
-        </w:rPr>
-        <w:t>, three target zones (pickup, an off-aisle inspection point and drop-off), four corner landmarks, two back-wall shelves and one charging dock. Figure 1 shows the pipeline.</w:t>
+        <w:t xml:space="preserve">the robot at the coordinates from my floor sketch. </w:t>
+      </w:r>
+      <w:r>
+        <w:rPr>
+          <w:rFonts w:eastAsia="Times New Roman" w:cs="Times New Roman"/>
+          <w:color w:val="000000"/>
+          <w:kern w:val="0"/>
+          <w:lang w:eastAsia="en-GB"/>
+          <w14:ligatures w14:val="none"/>
+        </w:rPr>
+        <w:t>The scene has four crates beside the aisle, three target zones (pickup, an off-aisle inspection point and drop-off), four corner landmarks, two back-wall shelves and one charging dock</w:t>
+      </w:r>
+      <w:r>
+        <w:rPr>
+          <w:rFonts w:eastAsia="Times New Roman" w:cs="Times New Roman"/>
+          <w:color w:val="000000"/>
+          <w:kern w:val="0"/>
+          <w:lang w:eastAsia="en-GB"/>
+          <w14:ligatures w14:val="none"/>
+        </w:rPr>
+        <w:t xml:space="preserve">. Figure 1 shows the </w:t>
+      </w:r>
+      <w:r>
+        <w:rPr>
+          <w:rFonts w:eastAsia="Times New Roman" w:cs="Times New Roman"/>
+          <w:color w:val="000000"/>
+          <w:kern w:val="0"/>
+          <w:lang w:eastAsia="en-GB"/>
+          <w14:ligatures w14:val="none"/>
+        </w:rPr>
+        <w:t>steps in order</w:t>
+      </w:r>
+      <w:r>
+        <w:rPr>
+          <w:rFonts w:eastAsia="Times New Roman" w:cs="Times New Roman"/>
+          <w:color w:val="000000"/>
+          <w:kern w:val="0"/>
+          <w:lang w:eastAsia="en-GB"/>
+          <w14:ligatures w14:val="none"/>
+        </w:rPr>
+        <w:t>.</w:t>
       </w:r>
     </w:p>
     <w:p>
@@ -5524,6 +5796,124 @@
           <w14:ligatures w14:val="none"/>
         </w:rPr>
       </w:pPr>
+      <w:r>
+        <w:rPr>
+          <w:rFonts w:eastAsia="Times New Roman" w:cs="Times New Roman"/>
+          <w:color w:val="000000"/>
+          <w:kern w:val="0"/>
+          <w:lang w:eastAsia="en-GB"/>
+          <w14:ligatures w14:val="none"/>
+        </w:rPr>
+        <w:t xml:space="preserve">The rendering cell sets up six camera viewpoints with </w:t>
+      </w:r>
+      <w:proofErr w:type="spellStart"/>
+      <w:r>
+        <w:rPr>
+          <w:rFonts w:eastAsia="Times New Roman" w:cs="Times New Roman"/>
+          <w:color w:val="000000"/>
+          <w:kern w:val="0"/>
+          <w:lang w:eastAsia="en-GB"/>
+          <w14:ligatures w14:val="none"/>
+        </w:rPr>
+        <w:t>computeViewMatrix</w:t>
+      </w:r>
+      <w:proofErr w:type="spellEnd"/>
+      <w:r>
+        <w:rPr>
+          <w:rFonts w:eastAsia="Times New Roman" w:cs="Times New Roman"/>
+          <w:color w:val="000000"/>
+          <w:kern w:val="0"/>
+          <w:lang w:eastAsia="en-GB"/>
+          <w14:ligatures w14:val="none"/>
+        </w:rPr>
+        <w:t xml:space="preserve"> and </w:t>
+      </w:r>
+      <w:proofErr w:type="spellStart"/>
+      <w:r>
+        <w:rPr>
+          <w:rFonts w:eastAsia="Times New Roman" w:cs="Times New Roman"/>
+          <w:color w:val="000000"/>
+          <w:kern w:val="0"/>
+          <w:lang w:eastAsia="en-GB"/>
+          <w14:ligatures w14:val="none"/>
+        </w:rPr>
+        <w:t>computeProjectionMatrixFOV</w:t>
+      </w:r>
+      <w:proofErr w:type="spellEnd"/>
+      <w:r>
+        <w:rPr>
+          <w:rFonts w:eastAsia="Times New Roman" w:cs="Times New Roman"/>
+          <w:color w:val="000000"/>
+          <w:kern w:val="0"/>
+          <w:lang w:eastAsia="en-GB"/>
+          <w14:ligatures w14:val="none"/>
+        </w:rPr>
+        <w:t xml:space="preserve"> (</w:t>
+      </w:r>
+      <w:proofErr w:type="spellStart"/>
+      <w:r>
+        <w:rPr>
+          <w:rFonts w:eastAsia="Times New Roman" w:cs="Times New Roman"/>
+          <w:color w:val="000000"/>
+          <w:kern w:val="0"/>
+          <w:lang w:eastAsia="en-GB"/>
+          <w14:ligatures w14:val="none"/>
+        </w:rPr>
+        <w:t>PyBullet</w:t>
+      </w:r>
+      <w:proofErr w:type="spellEnd"/>
+      <w:r>
+        <w:rPr>
+          <w:rFonts w:eastAsia="Times New Roman" w:cs="Times New Roman"/>
+          <w:color w:val="000000"/>
+          <w:kern w:val="0"/>
+          <w:lang w:eastAsia="en-GB"/>
+          <w14:ligatures w14:val="none"/>
+        </w:rPr>
+        <w:t xml:space="preserve">, 2023). The brief requires three, and I rendered six as an extension. </w:t>
+      </w:r>
+      <w:r>
+        <w:rPr>
+          <w:rFonts w:eastAsia="Times New Roman" w:cs="Times New Roman"/>
+          <w:color w:val="000000"/>
+          <w:kern w:val="0"/>
+          <w:lang w:eastAsia="en-GB"/>
+          <w14:ligatures w14:val="none"/>
+        </w:rPr>
+        <w:t xml:space="preserve">Only the robot moves between renders. Every other object stays fixed. </w:t>
+      </w:r>
+      <w:proofErr w:type="spellStart"/>
+      <w:r>
+        <w:rPr>
+          <w:rFonts w:eastAsia="Times New Roman" w:cs="Times New Roman"/>
+          <w:color w:val="000000"/>
+          <w:kern w:val="0"/>
+          <w:lang w:eastAsia="en-GB"/>
+          <w14:ligatures w14:val="none"/>
+        </w:rPr>
+        <w:t>getCameraImage</w:t>
+      </w:r>
+      <w:proofErr w:type="spellEnd"/>
+      <w:r>
+        <w:rPr>
+          <w:rFonts w:eastAsia="Times New Roman" w:cs="Times New Roman"/>
+          <w:color w:val="000000"/>
+          <w:kern w:val="0"/>
+          <w:lang w:eastAsia="en-GB"/>
+          <w14:ligatures w14:val="none"/>
+        </w:rPr>
+        <w:t xml:space="preserve"> returns a 480 by 360 RGB array for each view</w:t>
+      </w:r>
+      <w:r>
+        <w:rPr>
+          <w:rFonts w:eastAsia="Times New Roman" w:cs="Times New Roman"/>
+          <w:color w:val="000000"/>
+          <w:kern w:val="0"/>
+          <w:lang w:eastAsia="en-GB"/>
+          <w14:ligatures w14:val="none"/>
+        </w:rPr>
+        <w:t>.</w:t>
+      </w:r>
     </w:p>
     <w:p>
       <w:pPr>
@@ -5544,7 +5934,7 @@
           <w:lang w:eastAsia="en-GB"/>
           <w14:ligatures w14:val="none"/>
         </w:rPr>
-        <w:t xml:space="preserve">The rendering cell sets up six camera viewpoints with </w:t>
+        <w:t xml:space="preserve">The tools were Python 3, </w:t>
       </w:r>
       <w:proofErr w:type="spellStart"/>
       <w:r>
@@ -5555,7 +5945,7 @@
           <w:lang w:eastAsia="en-GB"/>
           <w14:ligatures w14:val="none"/>
         </w:rPr>
-        <w:t>computeViewMatrix</w:t>
+        <w:t>PyBullet</w:t>
       </w:r>
       <w:proofErr w:type="spellEnd"/>
       <w:r>
@@ -5566,73 +5956,47 @@
           <w:lang w:eastAsia="en-GB"/>
           <w14:ligatures w14:val="none"/>
         </w:rPr>
-        <w:t xml:space="preserve"> and </w:t>
-      </w:r>
-      <w:proofErr w:type="spellStart"/>
-      <w:r>
-        <w:rPr>
-          <w:rFonts w:eastAsia="Times New Roman" w:cs="Times New Roman"/>
-          <w:color w:val="000000"/>
-          <w:kern w:val="0"/>
-          <w:lang w:eastAsia="en-GB"/>
-          <w14:ligatures w14:val="none"/>
-        </w:rPr>
-        <w:t>computeProjectionMatrixFOV</w:t>
-      </w:r>
-      <w:proofErr w:type="spellEnd"/>
-      <w:r>
-        <w:rPr>
-          <w:rFonts w:eastAsia="Times New Roman" w:cs="Times New Roman"/>
-          <w:color w:val="000000"/>
-          <w:kern w:val="0"/>
-          <w:lang w:eastAsia="en-GB"/>
-          <w14:ligatures w14:val="none"/>
-        </w:rPr>
-        <w:t xml:space="preserve"> (</w:t>
-      </w:r>
-      <w:proofErr w:type="spellStart"/>
-      <w:r>
-        <w:rPr>
-          <w:rFonts w:eastAsia="Times New Roman" w:cs="Times New Roman"/>
-          <w:color w:val="000000"/>
-          <w:kern w:val="0"/>
-          <w:lang w:eastAsia="en-GB"/>
-          <w14:ligatures w14:val="none"/>
-        </w:rPr>
-        <w:t>PyBullet</w:t>
-      </w:r>
-      <w:proofErr w:type="spellEnd"/>
-      <w:r>
-        <w:rPr>
-          <w:rFonts w:eastAsia="Times New Roman" w:cs="Times New Roman"/>
-          <w:color w:val="000000"/>
-          <w:kern w:val="0"/>
-          <w:lang w:eastAsia="en-GB"/>
-          <w14:ligatures w14:val="none"/>
-        </w:rPr>
-        <w:t xml:space="preserve">, 2023). The brief requires three, and I rendered six as an extension. Only the robot moves between renders and every other object stays fixed. </w:t>
-      </w:r>
-      <w:proofErr w:type="spellStart"/>
-      <w:r>
-        <w:rPr>
-          <w:rFonts w:eastAsia="Times New Roman" w:cs="Times New Roman"/>
-          <w:color w:val="000000"/>
-          <w:kern w:val="0"/>
-          <w:lang w:eastAsia="en-GB"/>
-          <w14:ligatures w14:val="none"/>
-        </w:rPr>
-        <w:t>getCameraImage</w:t>
-      </w:r>
-      <w:proofErr w:type="spellEnd"/>
-      <w:r>
-        <w:rPr>
-          <w:rFonts w:eastAsia="Times New Roman" w:cs="Times New Roman"/>
-          <w:color w:val="000000"/>
-          <w:kern w:val="0"/>
-          <w:lang w:eastAsia="en-GB"/>
-          <w14:ligatures w14:val="none"/>
-        </w:rPr>
-        <w:t xml:space="preserve"> then captures a 480 by 360 RGB array for each viewpoint.</w:t>
+        <w:t>, NumPy and Matplotlib</w:t>
+      </w:r>
+      <w:r>
+        <w:rPr>
+          <w:rFonts w:eastAsia="Times New Roman" w:cs="Times New Roman"/>
+          <w:color w:val="000000"/>
+          <w:kern w:val="0"/>
+          <w:lang w:eastAsia="en-GB"/>
+          <w14:ligatures w14:val="none"/>
+        </w:rPr>
+        <w:t>.</w:t>
+      </w:r>
+      <w:r>
+        <w:rPr>
+          <w:rFonts w:eastAsia="Times New Roman" w:cs="Times New Roman"/>
+          <w:color w:val="000000"/>
+          <w:kern w:val="0"/>
+          <w:lang w:eastAsia="en-GB"/>
+          <w14:ligatures w14:val="none"/>
+        </w:rPr>
+        <w:t xml:space="preserve"> The </w:t>
+      </w:r>
+      <w:r>
+        <w:rPr>
+          <w:rFonts w:eastAsia="Times New Roman" w:cs="Times New Roman"/>
+          <w:color w:val="000000"/>
+          <w:kern w:val="0"/>
+          <w:lang w:eastAsia="en-GB"/>
+          <w14:ligatures w14:val="none"/>
+        </w:rPr>
+        <w:t>notebook has no perception model. Roles are set when the scene is built, so it cannot work out a role from an image (see Section 3.6)</w:t>
+      </w:r>
+      <w:r>
+        <w:rPr>
+          <w:rFonts w:eastAsia="Times New Roman" w:cs="Times New Roman"/>
+          <w:color w:val="000000"/>
+          <w:kern w:val="0"/>
+          <w:lang w:eastAsia="en-GB"/>
+          <w14:ligatures w14:val="none"/>
+        </w:rPr>
+        <w:t>.</w:t>
       </w:r>
     </w:p>
     <w:p>
@@ -5646,68 +6010,6 @@
           <w14:ligatures w14:val="none"/>
         </w:rPr>
       </w:pPr>
-      <w:r>
-        <w:rPr>
-          <w:rFonts w:eastAsia="Times New Roman" w:cs="Times New Roman"/>
-          <w:color w:val="000000"/>
-          <w:kern w:val="0"/>
-          <w:lang w:eastAsia="en-GB"/>
-          <w14:ligatures w14:val="none"/>
-        </w:rPr>
-        <w:t xml:space="preserve">I used Python 3, </w:t>
-      </w:r>
-      <w:proofErr w:type="spellStart"/>
-      <w:r>
-        <w:rPr>
-          <w:rFonts w:eastAsia="Times New Roman" w:cs="Times New Roman"/>
-          <w:color w:val="000000"/>
-          <w:kern w:val="0"/>
-          <w:lang w:eastAsia="en-GB"/>
-          <w14:ligatures w14:val="none"/>
-        </w:rPr>
-        <w:t>PyBullet</w:t>
-      </w:r>
-      <w:proofErr w:type="spellEnd"/>
-      <w:r>
-        <w:rPr>
-          <w:rFonts w:eastAsia="Times New Roman" w:cs="Times New Roman"/>
-          <w:color w:val="000000"/>
-          <w:kern w:val="0"/>
-          <w:lang w:eastAsia="en-GB"/>
-          <w14:ligatures w14:val="none"/>
-        </w:rPr>
-        <w:t>, NumPy and Matplotlib.</w:t>
-      </w:r>
-      <w:r>
-        <w:rPr>
-          <w:rFonts w:eastAsia="Times New Roman" w:cs="Times New Roman"/>
-          <w:color w:val="000000"/>
-          <w:kern w:val="0"/>
-          <w:lang w:eastAsia="en-GB"/>
-          <w14:ligatures w14:val="none"/>
-        </w:rPr>
-        <w:t xml:space="preserve"> The </w:t>
-      </w:r>
-      <w:r>
-        <w:rPr>
-          <w:rFonts w:eastAsia="Times New Roman" w:cs="Times New Roman"/>
-          <w:color w:val="000000"/>
-          <w:kern w:val="0"/>
-          <w:lang w:eastAsia="en-GB"/>
-          <w14:ligatures w14:val="none"/>
-        </w:rPr>
-        <w:t>notebook has no perception model. Roles are set when the scene is built, so it cannot work out a role from an image (see Section 3.6)</w:t>
-      </w:r>
-      <w:r>
-        <w:rPr>
-          <w:rFonts w:eastAsia="Times New Roman" w:cs="Times New Roman"/>
-          <w:color w:val="000000"/>
-          <w:kern w:val="0"/>
-          <w:lang w:eastAsia="en-GB"/>
-          <w14:ligatures w14:val="none"/>
-        </w:rPr>
-        <w:t>.</w:t>
-      </w:r>
     </w:p>
     <w:p>
       <w:pPr>
@@ -7053,7 +7355,7 @@
         </w:rPr>
       </w:pPr>
       <w:bookmarkStart w:id="13" w:name="_Toc241062516"/>
-      <w:bookmarkStart w:id="14" w:name="_Toc241707430"/>
+      <w:bookmarkStart w:id="14" w:name="_Toc241936877"/>
       <w:bookmarkStart w:id="15" w:name="execution-and-testing"/>
       <w:bookmarkEnd w:id="9"/>
       <w:r>
@@ -7084,17 +7386,7 @@
           <w:lang w:eastAsia="en-GB"/>
           <w14:ligatures w14:val="none"/>
         </w:rPr>
-        <w:t xml:space="preserve">The system is implemented as a Python Jupyter notebook, </w:t>
-      </w:r>
-      <w:r>
-        <w:rPr>
-          <w:rFonts w:eastAsia="Times New Roman" w:cs="Times New Roman"/>
-          <w:color w:val="000000"/>
-          <w:kern w:val="0"/>
-          <w:lang w:eastAsia="en-GB"/>
-          <w14:ligatures w14:val="none"/>
-        </w:rPr>
-        <w:t xml:space="preserve">and it runs locally or in </w:t>
+        <w:t xml:space="preserve">The system is a Python Jupyter notebook. It runs locally or in </w:t>
       </w:r>
       <w:proofErr w:type="spellStart"/>
       <w:r>
@@ -7146,7 +7438,7 @@
           <w:lang w:eastAsia="en-GB"/>
           <w14:ligatures w14:val="none"/>
         </w:rPr>
-        <w:t xml:space="preserve"> the main parts of the notebook.</w:t>
+        <w:t xml:space="preserve"> the main parts.</w:t>
       </w:r>
     </w:p>
     <w:p>
@@ -8028,7 +8320,7 @@
         <w:pStyle w:val="Heading2"/>
         <w:spacing w:before="240"/>
       </w:pPr>
-      <w:bookmarkStart w:id="16" w:name="_Toc241707431"/>
+      <w:bookmarkStart w:id="16" w:name="_Toc241936878"/>
       <w:r>
         <w:t>3.5 Execution and Testing</w:t>
       </w:r>
@@ -8399,7 +8691,7 @@
           <w:lang w:eastAsia="en-GB"/>
           <w14:ligatures w14:val="none"/>
         </w:rPr>
-        <w:t xml:space="preserve">In cell 8 I moved the robot to (5.5, 0.0, 0.1), next to the drop-off target, and ran all three helper functions. </w:t>
+        <w:t xml:space="preserve">In cell 8 I moved the robot to (5.5, 0.0, 0.1), next to the drop-off target, and ran the three helper functions. </w:t>
       </w:r>
       <w:proofErr w:type="spellStart"/>
       <w:r>
@@ -8443,7 +8735,7 @@
           <w:lang w:eastAsia="en-GB"/>
           <w14:ligatures w14:val="none"/>
         </w:rPr>
-        <w:t xml:space="preserve">("obstacle") returned the four crate obstacles (ids 1 to 4) and </w:t>
+        <w:t xml:space="preserve">("obstacle") returned the four crates (ids 1 to 4). </w:t>
       </w:r>
       <w:proofErr w:type="spellStart"/>
       <w:r>
@@ -8487,14 +8779,14 @@
           <w:lang w:eastAsia="en-GB"/>
           <w14:ligatures w14:val="none"/>
         </w:rPr>
-        <w:t xml:space="preserve"> returned body id 7, the drop-off target at (5.50, 0.00, 0.01), at a distance of 0.092 m.</w:t>
+        <w:t xml:space="preserve"> returned body id 7, the drop-off target at (5.50, 0.00, 0.01), 0.092 m away.</w:t>
       </w:r>
     </w:p>
     <w:p>
       <w:pPr>
         <w:pStyle w:val="Heading2"/>
       </w:pPr>
-      <w:bookmarkStart w:id="18" w:name="_Toc241707432"/>
+      <w:bookmarkStart w:id="18" w:name="_Toc241936879"/>
       <w:bookmarkStart w:id="19" w:name="evaluation-and-reflection"/>
       <w:bookmarkEnd w:id="15"/>
       <w:r>
@@ -8521,17 +8813,57 @@
           <w:lang w:eastAsia="en-GB"/>
           <w14:ligatures w14:val="none"/>
         </w:rPr>
-        <w:t xml:space="preserve">The hardest part was keeping the camera framing consistent while the robot moved. My first version worked out each camera position from the robot's pose. The framing kept shifting, and in one configuration the robot left the frame completely. I changed the cameras to fixed positions based on the room bounds and moved only the robot between renders. </w:t>
-      </w:r>
-      <w:r>
-        <w:rPr>
-          <w:rFonts w:eastAsia="Times New Roman" w:cs="Times New Roman"/>
-          <w:color w:val="000000"/>
-          <w:kern w:val="0"/>
-          <w:lang w:eastAsia="en-GB"/>
-          <w14:ligatures w14:val="none"/>
-        </w:rPr>
-        <w:t>I started with the three views the brief requires, then increased them to six so the objects could be checked from more angles.</w:t>
+        <w:t>The hardest part was keeping the camera framing steady while the robot moved</w:t>
+      </w:r>
+      <w:r>
+        <w:rPr>
+          <w:rFonts w:eastAsia="Times New Roman" w:cs="Times New Roman"/>
+          <w:color w:val="000000"/>
+          <w:kern w:val="0"/>
+          <w:lang w:eastAsia="en-GB"/>
+          <w14:ligatures w14:val="none"/>
+        </w:rPr>
+        <w:t xml:space="preserve">. My first version worked out each camera position from the robot's pose. The framing kept shifting, and in one configuration the robot left the frame completely. </w:t>
+      </w:r>
+      <w:r>
+        <w:rPr>
+          <w:rFonts w:eastAsia="Times New Roman" w:cs="Times New Roman"/>
+          <w:color w:val="000000"/>
+          <w:kern w:val="0"/>
+          <w:lang w:eastAsia="en-GB"/>
+          <w14:ligatures w14:val="none"/>
+        </w:rPr>
+        <w:t>I fixed the cameras at positions based on the room bounds and moved only the robot between render</w:t>
+      </w:r>
+      <w:r>
+        <w:rPr>
+          <w:rFonts w:eastAsia="Times New Roman" w:cs="Times New Roman"/>
+          <w:color w:val="000000"/>
+          <w:kern w:val="0"/>
+          <w:lang w:eastAsia="en-GB"/>
+          <w14:ligatures w14:val="none"/>
+        </w:rPr>
+        <w:t>s</w:t>
+      </w:r>
+      <w:r>
+        <w:rPr>
+          <w:rFonts w:eastAsia="Times New Roman" w:cs="Times New Roman"/>
+          <w:color w:val="000000"/>
+          <w:kern w:val="0"/>
+          <w:lang w:eastAsia="en-GB"/>
+          <w14:ligatures w14:val="none"/>
+        </w:rPr>
+        <w:t xml:space="preserve">. </w:t>
+      </w:r>
+      <w:r>
+        <w:rPr>
+          <w:rFonts w:eastAsia="Times New Roman" w:cs="Times New Roman"/>
+          <w:color w:val="000000"/>
+          <w:kern w:val="0"/>
+          <w:lang w:eastAsia="en-GB"/>
+          <w14:ligatures w14:val="none"/>
+        </w:rPr>
+        <w:t>I began with the three views the brief asks for, then went to six so I could check the objects from more angles.</w:t>
       </w:r>
       <w:r>
         <w:rPr>
@@ -8551,7 +8883,37 @@
           <w:lang w:eastAsia="en-GB"/>
           <w14:ligatures w14:val="none"/>
         </w:rPr>
-        <w:t>I also tried assigning roles by matching URDF filenames to role strings when the objects were loaded. I rejected this because it was more error-prone. Passing the role explicitly in SCENE_LAYOUT keeps every role in one place where it is easy to check.</w:t>
+        <w:t>I also tried matching URDF filenames to role strings when loading objects. I dropped it because it was easy to get wrong</w:t>
+      </w:r>
+      <w:r>
+        <w:rPr>
+          <w:rFonts w:eastAsia="Times New Roman" w:cs="Times New Roman"/>
+          <w:color w:val="000000"/>
+          <w:kern w:val="0"/>
+          <w:lang w:eastAsia="en-GB"/>
+          <w14:ligatures w14:val="none"/>
+        </w:rPr>
+        <w:t>.</w:t>
+      </w:r>
+      <w:r>
+        <w:rPr>
+          <w:rFonts w:eastAsia="Times New Roman" w:cs="Times New Roman"/>
+          <w:color w:val="000000"/>
+          <w:kern w:val="0"/>
+          <w:lang w:eastAsia="en-GB"/>
+          <w14:ligatures w14:val="none"/>
+        </w:rPr>
+        <w:t xml:space="preserve"> </w:t>
+      </w:r>
+      <w:r>
+        <w:rPr>
+          <w:rFonts w:eastAsia="Times New Roman" w:cs="Times New Roman"/>
+          <w:color w:val="000000"/>
+          <w:kern w:val="0"/>
+          <w:lang w:eastAsia="en-GB"/>
+          <w14:ligatures w14:val="none"/>
+        </w:rPr>
+        <w:t>Setting each role in SCENE_LAYOUT keeps all roles in one place, so they are easy to check.</w:t>
       </w:r>
     </w:p>
     <w:p>
@@ -8584,7 +8946,17 @@
           <w14:ligatures w14:val="none"/>
         </w:rPr>
         <w:lastRenderedPageBreak/>
-        <w:t xml:space="preserve">so this was acceptable for Task 1. An improvement would be to train a lightweight classifier on </w:t>
+        <w:t xml:space="preserve">so this was acceptable for Task 1. </w:t>
+      </w:r>
+      <w:r>
+        <w:rPr>
+          <w:rFonts w:eastAsia="Times New Roman" w:cs="Times New Roman"/>
+          <w:color w:val="000000"/>
+          <w:kern w:val="0"/>
+          <w:lang w:eastAsia="en-GB"/>
+          <w14:ligatures w14:val="none"/>
+        </w:rPr>
+        <w:t xml:space="preserve">I could train a small classifier on </w:t>
       </w:r>
       <w:proofErr w:type="spellStart"/>
       <w:r>
@@ -8606,7 +8978,49 @@
           <w:lang w:eastAsia="en-GB"/>
           <w14:ligatures w14:val="none"/>
         </w:rPr>
-        <w:t xml:space="preserve"> RGB-D (McCormac et al., 2017) to predict a role from the images captured in Section 3.5. In a real warehouse, a wrong role could mean the robot drives into an obstacle or ignores a target, so I kept the link between geometry and role explicit.</w:t>
+        <w:t xml:space="preserve"> RGB-D (McCormac et al., 2017) to predict roles from the Section 3.5 images.</w:t>
+      </w:r>
+      <w:r>
+        <w:rPr>
+          <w:rFonts w:eastAsia="Times New Roman" w:cs="Times New Roman"/>
+          <w:color w:val="000000"/>
+          <w:kern w:val="0"/>
+          <w:lang w:eastAsia="en-GB"/>
+          <w14:ligatures w14:val="none"/>
+        </w:rPr>
+        <w:t xml:space="preserve"> </w:t>
+      </w:r>
+      <w:r>
+        <w:rPr>
+          <w:rFonts w:eastAsia="Times New Roman" w:cs="Times New Roman"/>
+          <w:color w:val="000000"/>
+          <w:kern w:val="0"/>
+          <w:lang w:eastAsia="en-GB"/>
+          <w14:ligatures w14:val="none"/>
+        </w:rPr>
+        <w:t xml:space="preserve">In a real warehouse, a wrong role could make the robot hit an obstacle or ignore a target. </w:t>
+      </w:r>
+      <w:proofErr w:type="gramStart"/>
+      <w:r>
+        <w:rPr>
+          <w:rFonts w:eastAsia="Times New Roman" w:cs="Times New Roman"/>
+          <w:color w:val="000000"/>
+          <w:kern w:val="0"/>
+          <w:lang w:eastAsia="en-GB"/>
+          <w14:ligatures w14:val="none"/>
+        </w:rPr>
+        <w:t>So</w:t>
+      </w:r>
+      <w:proofErr w:type="gramEnd"/>
+      <w:r>
+        <w:rPr>
+          <w:rFonts w:eastAsia="Times New Roman" w:cs="Times New Roman"/>
+          <w:color w:val="000000"/>
+          <w:kern w:val="0"/>
+          <w:lang w:eastAsia="en-GB"/>
+          <w14:ligatures w14:val="none"/>
+        </w:rPr>
+        <w:t xml:space="preserve"> I kept the link between geometry and role clear.</w:t>
       </w:r>
     </w:p>
     <w:p>
@@ -8642,7 +9056,7 @@
       <w:pPr>
         <w:pStyle w:val="Heading1"/>
       </w:pPr>
-      <w:bookmarkStart w:id="21" w:name="_Toc241707433"/>
+      <w:bookmarkStart w:id="21" w:name="_Toc241936880"/>
       <w:r>
         <w:lastRenderedPageBreak/>
         <w:t>Task 2: Goal-Oriented Autonomous Robot with Monitoring (ROS2)</w:t>
@@ -8653,7 +9067,7 @@
       <w:pPr>
         <w:pStyle w:val="Heading2"/>
       </w:pPr>
-      <w:bookmarkStart w:id="22" w:name="_Toc241707434"/>
+      <w:bookmarkStart w:id="22" w:name="_Toc241936881"/>
       <w:bookmarkStart w:id="23" w:name="project-definition-1"/>
       <w:r>
         <w:t>4.1 Project Definition</w:t>
@@ -8679,7 +9093,67 @@
           <w:lang w:eastAsia="en-GB"/>
           <w14:ligatures w14:val="none"/>
         </w:rPr>
-        <w:t>The use case for Task 2 is a warehouse inspection patrol robot. A TurtleBot3 starts at the charging dock, visits a closed loop of four checkpoints around a warehouse bay, avoids pallet obstacles on the way, accepts simple operator commands and reports on its own performance. I chose this scenario because one mission covers goal navigation, obstacle avoidance, keyboard interaction and monitoring.</w:t>
+        <w:t>Task 2 uses a warehouse inspection patrol robot</w:t>
+      </w:r>
+      <w:r>
+        <w:rPr>
+          <w:rFonts w:eastAsia="Times New Roman" w:cs="Times New Roman"/>
+          <w:color w:val="000000"/>
+          <w:kern w:val="0"/>
+          <w:lang w:eastAsia="en-GB"/>
+          <w14:ligatures w14:val="none"/>
+        </w:rPr>
+        <w:t>.</w:t>
+      </w:r>
+      <w:r>
+        <w:rPr>
+          <w:rFonts w:eastAsia="Times New Roman" w:cs="Times New Roman"/>
+          <w:color w:val="000000"/>
+          <w:kern w:val="0"/>
+          <w:lang w:eastAsia="en-GB"/>
+          <w14:ligatures w14:val="none"/>
+        </w:rPr>
+        <w:t xml:space="preserve"> </w:t>
+      </w:r>
+      <w:r>
+        <w:rPr>
+          <w:rFonts w:eastAsia="Times New Roman" w:cs="Times New Roman"/>
+          <w:color w:val="000000"/>
+          <w:kern w:val="0"/>
+          <w:lang w:eastAsia="en-GB"/>
+          <w14:ligatures w14:val="none"/>
+        </w:rPr>
+        <w:t>A TurtleBot3 starts at the charging dock and drives a loop of four checkpoints around a warehouse bay. It avoids pallets on the way, takes simple operator commands and reports its own performance</w:t>
+      </w:r>
+      <w:r>
+        <w:rPr>
+          <w:rFonts w:eastAsia="Times New Roman" w:cs="Times New Roman"/>
+          <w:color w:val="000000"/>
+          <w:kern w:val="0"/>
+          <w:lang w:eastAsia="en-GB"/>
+          <w14:ligatures w14:val="none"/>
+        </w:rPr>
+        <w:t xml:space="preserve">. I </w:t>
+      </w:r>
+      <w:r>
+        <w:rPr>
+          <w:rFonts w:eastAsia="Times New Roman" w:cs="Times New Roman"/>
+          <w:color w:val="000000"/>
+          <w:kern w:val="0"/>
+          <w:lang w:eastAsia="en-GB"/>
+          <w14:ligatures w14:val="none"/>
+        </w:rPr>
+        <w:t>chose it because one mission covers navigation, obstacle avoidance, keyboard control and monitoring</w:t>
+      </w:r>
+      <w:r>
+        <w:rPr>
+          <w:rFonts w:eastAsia="Times New Roman" w:cs="Times New Roman"/>
+          <w:color w:val="000000"/>
+          <w:kern w:val="0"/>
+          <w:lang w:eastAsia="en-GB"/>
+          <w14:ligatures w14:val="none"/>
+        </w:rPr>
+        <w:t>.</w:t>
       </w:r>
     </w:p>
     <w:p>
@@ -8723,7 +9197,7 @@
           <w:lang w:eastAsia="en-GB"/>
           <w14:ligatures w14:val="none"/>
         </w:rPr>
-        <w:t>, targets TheConstruct.ai running ROS2 Humble (Open-Source Robotics Foundation, 2024) with Gazebo Classic and the standard TurtleBot3 stack (ROBOTIS, 2023). I developed and tested it on TheConstruct.ai (</w:t>
+        <w:t>, is built for TheConstruct.ai, which runs ROS2 Humble (Open-Source Robotics Foundation, 2024) with Gazebo Classic and the standard TurtleBot3 stack (ROBOTIS, 2023). I built and tested it on TheConstruct.ai (</w:t>
       </w:r>
       <w:proofErr w:type="spellStart"/>
       <w:r>
@@ -8811,7 +9285,7 @@
           <w:lang w:eastAsia="en-GB"/>
           <w14:ligatures w14:val="none"/>
         </w:rPr>
-        <w:t xml:space="preserve">/1051220), workspace ros2_ws. The free tier does not give a permanent shareable URL, so I made the project public under the title </w:t>
+        <w:t xml:space="preserve">/1051220), workspace ros2_ws. The free tier gives no permanent shareable URL, so I made the project public under the title </w:t>
       </w:r>
       <w:proofErr w:type="spellStart"/>
       <w:r>
@@ -8833,7 +9307,27 @@
           <w:lang w:eastAsia="en-GB"/>
           <w14:ligatures w14:val="none"/>
         </w:rPr>
-        <w:t xml:space="preserve">, which is the unique name the brief asks for. I also used a local Ubuntu 24.04 workspace with ROS2 Jazzy and Gazebo Harmonic (Open Robotics, 2024) to view the LIDAR rays, the camera feed and the planned-path toggle outside the browser. The GitHub folder holds this Jazzy and Harmonic version. The </w:t>
+        <w:t>, the unique name the brief asks for. I also used a local Ubuntu 24.04 workspace with ROS2 Jazzy and Gazebo Harmonic (Open Robotics, 2024) to view the LIDAR rays, camera feed and planned-path toggle outside the browser</w:t>
+      </w:r>
+      <w:r>
+        <w:rPr>
+          <w:rFonts w:eastAsia="Times New Roman" w:cs="Times New Roman"/>
+          <w:color w:val="000000"/>
+          <w:kern w:val="0"/>
+          <w:lang w:eastAsia="en-GB"/>
+          <w14:ligatures w14:val="none"/>
+        </w:rPr>
+        <w:t xml:space="preserve">. </w:t>
+      </w:r>
+      <w:r>
+        <w:rPr>
+          <w:rFonts w:eastAsia="Times New Roman" w:cs="Times New Roman"/>
+          <w:color w:val="000000"/>
+          <w:kern w:val="0"/>
+          <w:lang w:eastAsia="en-GB"/>
+          <w14:ligatures w14:val="none"/>
+        </w:rPr>
+        <w:t xml:space="preserve">The GitHub folder holds this Jazzy and Harmonic version. The </w:t>
       </w:r>
       <w:proofErr w:type="spellStart"/>
       <w:r>
@@ -8855,7 +9349,7 @@
           <w:lang w:eastAsia="en-GB"/>
           <w14:ligatures w14:val="none"/>
         </w:rPr>
-        <w:t xml:space="preserve"> copy uses a Gazebo Classic launch file and world. The local build was an extra check and not the submission platform.</w:t>
+        <w:t xml:space="preserve"> copy uses a Gazebo Classic launch file and world. </w:t>
       </w:r>
     </w:p>
     <w:p>
@@ -8994,7 +9488,7 @@
       <w:pPr>
         <w:pStyle w:val="Heading2"/>
       </w:pPr>
-      <w:bookmarkStart w:id="24" w:name="_Toc241707435"/>
+      <w:bookmarkStart w:id="24" w:name="_Toc241936882"/>
       <w:bookmarkStart w:id="25" w:name="design-and-implementation-1"/>
       <w:bookmarkEnd w:id="23"/>
       <w:r>
@@ -9043,8 +9537,62 @@
           <w:lang w:eastAsia="en-GB"/>
           <w14:ligatures w14:val="none"/>
         </w:rPr>
-        <w:t xml:space="preserve"> and Ögren (2018) describe finite state machines as becoming brittle as a system grows, which is why behaviour trees are now common in larger robot software. This patrol mission has one goal and a handful of states, so I kept a finite state machine because it is easier to read and to log. For avoidance, the Bug algorithms and the vector field histogram steer from local sensor data (Siegwart, </w:t>
-      </w:r>
+        <w:t xml:space="preserve"> and Ögren (2018) describe finite state machines as becoming brittle as a system grows, which is why behaviour trees are now common in larger robot software. This patrol mission has one goal and a handful of states, so I kept a finite state machine because it is easier to read and to log. For avoidance, the Bug algorithms and the vector field histogram steer from local sensor data (Siegwart, Nourbakhsh and </w:t>
+      </w:r>
+      <w:proofErr w:type="spellStart"/>
+      <w:r>
+        <w:rPr>
+          <w:rFonts w:eastAsia="Times New Roman" w:cs="Times New Roman"/>
+          <w:color w:val="000000"/>
+          <w:kern w:val="0"/>
+          <w:lang w:eastAsia="en-GB"/>
+          <w14:ligatures w14:val="none"/>
+        </w:rPr>
+        <w:t>Scaramuzza</w:t>
+      </w:r>
+      <w:proofErr w:type="spellEnd"/>
+      <w:r>
+        <w:rPr>
+          <w:rFonts w:eastAsia="Times New Roman" w:cs="Times New Roman"/>
+          <w:color w:val="000000"/>
+          <w:kern w:val="0"/>
+          <w:lang w:eastAsia="en-GB"/>
+          <w14:ligatures w14:val="none"/>
+        </w:rPr>
+        <w:t xml:space="preserve">, 2011; Borenstein and Koren, 1991). </w:t>
+      </w:r>
+      <w:r>
+        <w:rPr>
+          <w:rFonts w:eastAsia="Times New Roman" w:cs="Times New Roman"/>
+          <w:color w:val="000000"/>
+          <w:kern w:val="0"/>
+          <w:lang w:eastAsia="en-GB"/>
+          <w14:ligatures w14:val="none"/>
+        </w:rPr>
+        <w:t>My escape-heading probe is a much simpler relative of that idea</w:t>
+      </w:r>
+      <w:r>
+        <w:rPr>
+          <w:rFonts w:eastAsia="Times New Roman" w:cs="Times New Roman"/>
+          <w:color w:val="000000"/>
+          <w:kern w:val="0"/>
+          <w:lang w:eastAsia="en-GB"/>
+          <w14:ligatures w14:val="none"/>
+        </w:rPr>
+        <w:t>.</w:t>
+      </w:r>
+    </w:p>
+    <w:p>
+      <w:pPr>
+        <w:spacing w:after="180" w:line="360" w:lineRule="auto"/>
+        <w:rPr>
+          <w:rFonts w:eastAsia="Times New Roman" w:cs="Times New Roman"/>
+          <w:color w:val="000000"/>
+          <w:kern w:val="0"/>
+          <w:lang w:eastAsia="en-GB"/>
+          <w14:ligatures w14:val="none"/>
+        </w:rPr>
+      </w:pPr>
       <w:r>
         <w:rPr>
           <w:rFonts w:eastAsia="Times New Roman" w:cs="Times New Roman"/>
@@ -9054,70 +9602,6 @@
           <w14:ligatures w14:val="none"/>
         </w:rPr>
         <w:lastRenderedPageBreak/>
-        <w:t xml:space="preserve">Nourbakhsh and </w:t>
-      </w:r>
-      <w:proofErr w:type="spellStart"/>
-      <w:r>
-        <w:rPr>
-          <w:rFonts w:eastAsia="Times New Roman" w:cs="Times New Roman"/>
-          <w:color w:val="000000"/>
-          <w:kern w:val="0"/>
-          <w:lang w:eastAsia="en-GB"/>
-          <w14:ligatures w14:val="none"/>
-        </w:rPr>
-        <w:t>Scaramuzza</w:t>
-      </w:r>
-      <w:proofErr w:type="spellEnd"/>
-      <w:r>
-        <w:rPr>
-          <w:rFonts w:eastAsia="Times New Roman" w:cs="Times New Roman"/>
-          <w:color w:val="000000"/>
-          <w:kern w:val="0"/>
-          <w:lang w:eastAsia="en-GB"/>
-          <w14:ligatures w14:val="none"/>
-        </w:rPr>
-        <w:t xml:space="preserve">, 2011; Borenstein and Koren, 1991). </w:t>
-      </w:r>
-      <w:r>
-        <w:rPr>
-          <w:rFonts w:eastAsia="Times New Roman" w:cs="Times New Roman"/>
-          <w:color w:val="000000"/>
-          <w:kern w:val="0"/>
-          <w:lang w:eastAsia="en-GB"/>
-          <w14:ligatures w14:val="none"/>
-        </w:rPr>
-        <w:t>My escape-heading probe is a much simpler relative of that idea</w:t>
-      </w:r>
-      <w:r>
-        <w:rPr>
-          <w:rFonts w:eastAsia="Times New Roman" w:cs="Times New Roman"/>
-          <w:color w:val="000000"/>
-          <w:kern w:val="0"/>
-          <w:lang w:eastAsia="en-GB"/>
-          <w14:ligatures w14:val="none"/>
-        </w:rPr>
-        <w:t>.</w:t>
-      </w:r>
-    </w:p>
-    <w:p>
-      <w:pPr>
-        <w:spacing w:after="180" w:line="360" w:lineRule="auto"/>
-        <w:rPr>
-          <w:rFonts w:eastAsia="Times New Roman" w:cs="Times New Roman"/>
-          <w:color w:val="000000"/>
-          <w:kern w:val="0"/>
-          <w:lang w:eastAsia="en-GB"/>
-          <w14:ligatures w14:val="none"/>
-        </w:rPr>
-      </w:pPr>
-      <w:r>
-        <w:rPr>
-          <w:rFonts w:eastAsia="Times New Roman" w:cs="Times New Roman"/>
-          <w:color w:val="000000"/>
-          <w:kern w:val="0"/>
-          <w:lang w:eastAsia="en-GB"/>
-          <w14:ligatures w14:val="none"/>
-        </w:rPr>
         <w:t xml:space="preserve">The package contains four ROS2 nodes (Quigley, Gerkey and Smart, 2015), summarised in Table 2. </w:t>
       </w:r>
       <w:proofErr w:type="spellStart"/>
@@ -10129,51 +10613,17 @@
           <w:lang w:eastAsia="en-GB"/>
           <w14:ligatures w14:val="none"/>
         </w:rPr>
-        <w:t xml:space="preserve"> implements six states. The brief's minimum is five, and I added PLANNING ahead of NAVIGATE. Table 3 lists each state's trigger and behaviour as defined in the </w:t>
-      </w:r>
-      <w:proofErr w:type="spellStart"/>
-      <w:r>
-        <w:rPr>
-          <w:rFonts w:eastAsia="Times New Roman" w:cs="Times New Roman"/>
-          <w:color w:val="000000"/>
-          <w:kern w:val="0"/>
-          <w:lang w:eastAsia="en-GB"/>
-          <w14:ligatures w14:val="none"/>
-        </w:rPr>
-        <w:t>MissionState</w:t>
-      </w:r>
-      <w:proofErr w:type="spellEnd"/>
-      <w:r>
-        <w:rPr>
-          <w:rFonts w:eastAsia="Times New Roman" w:cs="Times New Roman"/>
-          <w:color w:val="000000"/>
-          <w:kern w:val="0"/>
-          <w:lang w:eastAsia="en-GB"/>
-          <w14:ligatures w14:val="none"/>
-        </w:rPr>
-        <w:t xml:space="preserve"> </w:t>
-      </w:r>
-      <w:proofErr w:type="spellStart"/>
-      <w:r>
-        <w:rPr>
-          <w:rFonts w:eastAsia="Times New Roman" w:cs="Times New Roman"/>
-          <w:color w:val="000000"/>
-          <w:kern w:val="0"/>
-          <w:lang w:eastAsia="en-GB"/>
-          <w14:ligatures w14:val="none"/>
-        </w:rPr>
-        <w:t>enum</w:t>
-      </w:r>
-      <w:proofErr w:type="spellEnd"/>
-      <w:r>
-        <w:rPr>
-          <w:rFonts w:eastAsia="Times New Roman" w:cs="Times New Roman"/>
-          <w:color w:val="000000"/>
-          <w:kern w:val="0"/>
-          <w:lang w:eastAsia="en-GB"/>
-          <w14:ligatures w14:val="none"/>
-        </w:rPr>
-        <w:t>. Figure 4 shows the transitions.</w:t>
+        <w:t xml:space="preserve"> implements six states. The brief's minimum is five, and I added PLANNING ahead of NAVIGATE. </w:t>
+      </w:r>
+      <w:r>
+        <w:rPr>
+          <w:rFonts w:eastAsia="Times New Roman" w:cs="Times New Roman"/>
+          <w:color w:val="000000"/>
+          <w:kern w:val="0"/>
+          <w:lang w:eastAsia="en-GB"/>
+          <w14:ligatures w14:val="none"/>
+        </w:rPr>
+        <w:t>Table 3 lists each state and Figure 4 shows the transitions.</w:t>
       </w:r>
     </w:p>
     <w:p>
@@ -10680,7 +11130,6 @@
                 <w:sz w:val="22"/>
                 <w:szCs w:val="22"/>
               </w:rPr>
-              <w:lastRenderedPageBreak/>
               <w:t>AVOID_OBSTACLE</w:t>
             </w:r>
           </w:p>
@@ -10703,7 +11152,15 @@
                 <w:sz w:val="22"/>
                 <w:szCs w:val="22"/>
               </w:rPr>
-              <w:t>Forward clearance below 0.32 m for three consecutive control cycles, or an odometry-based stall</w:t>
+              <w:t xml:space="preserve">Forward clearance below 0.32 m for three consecutive control </w:t>
+            </w:r>
+            <w:r>
+              <w:rPr>
+                <w:sz w:val="22"/>
+                <w:szCs w:val="22"/>
+              </w:rPr>
+              <w:lastRenderedPageBreak/>
+              <w:t>cycles, or an odometry-based stall</w:t>
             </w:r>
           </w:p>
         </w:tc>
@@ -10725,7 +11182,16 @@
                 <w:sz w:val="22"/>
                 <w:szCs w:val="22"/>
               </w:rPr>
-              <w:t>Reverses if closer than 0.20 m (REVERSE), then rotates to a LIDAR-probed clear heading (ORIENT)</w:t>
+              <w:lastRenderedPageBreak/>
+              <w:t xml:space="preserve">Reverses if closer than 0.20 m (REVERSE), then rotates to a </w:t>
+            </w:r>
+            <w:r>
+              <w:rPr>
+                <w:sz w:val="22"/>
+                <w:szCs w:val="22"/>
+              </w:rPr>
+              <w:lastRenderedPageBreak/>
+              <w:t>LIDAR-probed clear heading (ORIENT)</w:t>
             </w:r>
           </w:p>
         </w:tc>
@@ -10752,6 +11218,7 @@
                 <w:sz w:val="22"/>
                 <w:szCs w:val="22"/>
               </w:rPr>
+              <w:lastRenderedPageBreak/>
               <w:t>REPLAN</w:t>
             </w:r>
           </w:p>
@@ -11150,9 +11617,32 @@
     </w:p>
     <w:p>
       <w:pPr>
+        <w:spacing w:after="160"/>
+        <w:jc w:val="left"/>
+        <w:rPr>
+          <w:rFonts w:eastAsia="Times New Roman" w:cs="Times New Roman"/>
+          <w:color w:val="000000"/>
+          <w:kern w:val="0"/>
+          <w:lang w:eastAsia="en-GB"/>
+          <w14:ligatures w14:val="none"/>
+        </w:rPr>
+      </w:pPr>
+      <w:r>
+        <w:rPr>
+          <w:rFonts w:eastAsia="Times New Roman" w:cs="Times New Roman"/>
+          <w:color w:val="000000"/>
+          <w:kern w:val="0"/>
+          <w:lang w:eastAsia="en-GB"/>
+          <w14:ligatures w14:val="none"/>
+        </w:rPr>
+        <w:br w:type="page"/>
+      </w:r>
+    </w:p>
+    <w:p>
+      <w:pPr>
         <w:pStyle w:val="Heading2"/>
       </w:pPr>
-      <w:bookmarkStart w:id="30" w:name="_Toc241707436"/>
+      <w:bookmarkStart w:id="30" w:name="_Toc241936883"/>
       <w:bookmarkStart w:id="31" w:name="execution-and-testing-1"/>
       <w:bookmarkEnd w:id="25"/>
       <w:r>
@@ -11280,7 +11770,17 @@
           <w:lang w:eastAsia="en-GB"/>
           <w14:ligatures w14:val="none"/>
         </w:rPr>
-        <w:t>. After setting</w:t>
+        <w:t xml:space="preserve">. </w:t>
+      </w:r>
+      <w:r>
+        <w:rPr>
+          <w:rFonts w:eastAsia="Times New Roman" w:cs="Times New Roman"/>
+          <w:color w:val="000000"/>
+          <w:kern w:val="0"/>
+          <w:lang w:eastAsia="en-GB"/>
+          <w14:ligatures w14:val="none"/>
+        </w:rPr>
+        <w:t>I set</w:t>
       </w:r>
       <w:r>
         <w:rPr>
@@ -11316,7 +11816,27 @@
           <w:lang w:eastAsia="en-GB"/>
           <w14:ligatures w14:val="none"/>
         </w:rPr>
-        <w:t xml:space="preserve"> I ran </w:t>
+        <w:t xml:space="preserve">, </w:t>
+      </w:r>
+      <w:r>
+        <w:rPr>
+          <w:rFonts w:eastAsia="Times New Roman" w:cs="Times New Roman"/>
+          <w:color w:val="000000"/>
+          <w:kern w:val="0"/>
+          <w:lang w:eastAsia="en-GB"/>
+          <w14:ligatures w14:val="none"/>
+        </w:rPr>
+        <w:t>then</w:t>
+      </w:r>
+      <w:r>
+        <w:rPr>
+          <w:rFonts w:eastAsia="Times New Roman" w:cs="Times New Roman"/>
+          <w:color w:val="000000"/>
+          <w:kern w:val="0"/>
+          <w:lang w:eastAsia="en-GB"/>
+          <w14:ligatures w14:val="none"/>
+        </w:rPr>
+        <w:t xml:space="preserve"> ran </w:t>
       </w:r>
       <w:r>
         <w:rPr>
@@ -12024,7 +12544,17 @@
           <w:lang w:eastAsia="en-GB"/>
           <w14:ligatures w14:val="none"/>
         </w:rPr>
-        <w:t xml:space="preserve"> capture. Reading oldest to newest, it records AVOID_OBSTACLE, REPLAN, AVOID_OBSTACLE, IDLE, PLANNING, NAVIGATE and finally MISSION_COMPLETE</w:t>
+        <w:t xml:space="preserve"> capture. </w:t>
+      </w:r>
+      <w:r>
+        <w:rPr>
+          <w:rFonts w:eastAsia="Times New Roman" w:cs="Times New Roman"/>
+          <w:color w:val="000000"/>
+          <w:kern w:val="0"/>
+          <w:lang w:eastAsia="en-GB"/>
+          <w14:ligatures w14:val="none"/>
+        </w:rPr>
+        <w:t>Oldest to newest, the capture shows AVOID_OBSTACLE, REPLAN, AVOID_OBSTACLE, IDLE, PLANNING, NAVIGATE and finally MISSION_COMPLETE</w:t>
       </w:r>
       <w:r>
         <w:rPr>
@@ -12044,7 +12574,49 @@
           <w:lang w:eastAsia="en-GB"/>
           <w14:ligatures w14:val="none"/>
         </w:rPr>
-        <w:t>The code only returns to IDLE from AVOID_OBSTACLE after ten failed avoidance attempts, so the mission most likely aborted and I restarted it with s. It then planned again and reached MISSION_COMPLETE.</w:t>
+        <w:t xml:space="preserve">The code only goes from AVOID_OBSTACLE back to IDLE after ten failed avoidance attempts. </w:t>
+      </w:r>
+      <w:proofErr w:type="gramStart"/>
+      <w:r>
+        <w:rPr>
+          <w:rFonts w:eastAsia="Times New Roman" w:cs="Times New Roman"/>
+          <w:color w:val="000000"/>
+          <w:kern w:val="0"/>
+          <w:lang w:eastAsia="en-GB"/>
+          <w14:ligatures w14:val="none"/>
+        </w:rPr>
+        <w:t>So</w:t>
+      </w:r>
+      <w:proofErr w:type="gramEnd"/>
+      <w:r>
+        <w:rPr>
+          <w:rFonts w:eastAsia="Times New Roman" w:cs="Times New Roman"/>
+          <w:color w:val="000000"/>
+          <w:kern w:val="0"/>
+          <w:lang w:eastAsia="en-GB"/>
+          <w14:ligatures w14:val="none"/>
+        </w:rPr>
+        <w:t xml:space="preserve"> the mission most likely aborted, and I restarted it with s.</w:t>
+      </w:r>
+      <w:r>
+        <w:rPr>
+          <w:rFonts w:eastAsia="Times New Roman" w:cs="Times New Roman"/>
+          <w:color w:val="000000"/>
+          <w:kern w:val="0"/>
+          <w:lang w:eastAsia="en-GB"/>
+          <w14:ligatures w14:val="none"/>
+        </w:rPr>
+        <w:t xml:space="preserve"> </w:t>
+      </w:r>
+      <w:r>
+        <w:rPr>
+          <w:rFonts w:eastAsia="Times New Roman" w:cs="Times New Roman"/>
+          <w:color w:val="000000"/>
+          <w:kern w:val="0"/>
+          <w:lang w:eastAsia="en-GB"/>
+          <w14:ligatures w14:val="none"/>
+        </w:rPr>
+        <w:t>It then planned again and reached MISSION_COMPLETE.</w:t>
       </w:r>
     </w:p>
     <w:p>
@@ -12233,16 +12805,16 @@
           <w14:ligatures w14:val="none"/>
         </w:rPr>
         <w:drawing>
-          <wp:inline distT="0" distB="0" distL="0" distR="0" wp14:anchorId="02FB3075" wp14:editId="797EA9CE">
+          <wp:inline distT="0" distB="0" distL="0" distR="0" wp14:anchorId="02FB3075" wp14:editId="2C2D6839">
             <wp:extent cx="5334000" cy="2552103"/>
             <wp:effectExtent l="0" t="0" r="0" b="0"/>
-            <wp:docPr id="45" name="Picture" descr="Figure 9. monitor_node’s mission summary, captured shortly before MISSION_COMPLETE."/>
+            <wp:docPr id="45" name="Picture" descr="Figure 9. monitor_node’s mission summary, captured while the mission was in progress."/>
             <wp:cNvGraphicFramePr/>
             <a:graphic xmlns:a="http://schemas.openxmlformats.org/drawingml/2006/main">
               <a:graphicData uri="http://schemas.openxmlformats.org/drawingml/2006/picture">
                 <pic:pic xmlns:pic="http://schemas.openxmlformats.org/drawingml/2006/picture">
                   <pic:nvPicPr>
-                    <pic:cNvPr id="46" name="Picture" descr="/home/claude/work/screenshots/construct_monitor_summary_metrics.png"/>
+                    <pic:cNvPr id="45" name="Picture" descr="Figure 9. monitor_node’s mission summary, captured while the mission was in progress."/>
                     <pic:cNvPicPr>
                       <a:picLocks noChangeAspect="1" noChangeArrowheads="1"/>
                     </pic:cNvPicPr>
@@ -13773,7 +14345,7 @@
           <w:lang w:eastAsia="en-GB"/>
           <w14:ligatures w14:val="none"/>
         </w:rPr>
-        <w:t xml:space="preserve"> browser window. Figure 10 shows the LIDAR rays near a pallet obstacle with the forward camera feed beside them. This is the sensing data the AVOID_OBSTACLE logic in Section 4.2 works from.</w:t>
+        <w:t xml:space="preserve"> browser window. Figure 10 shows the LIDAR rays near a pallet obstacle with the forward camera feed beside them. </w:t>
       </w:r>
     </w:p>
     <w:p>
@@ -13943,7 +14515,7 @@
       <w:pPr>
         <w:pStyle w:val="Heading2"/>
       </w:pPr>
-      <w:bookmarkStart w:id="40" w:name="_Toc241707437"/>
+      <w:bookmarkStart w:id="40" w:name="_Toc241936884"/>
       <w:bookmarkStart w:id="41" w:name="evaluation-and-reflection-1"/>
       <w:bookmarkEnd w:id="31"/>
       <w:r>
@@ -14137,53 +14709,6 @@
         <w:spacing w:after="180" w:line="360" w:lineRule="auto"/>
         <w:rPr>
           <w:rFonts w:eastAsia="Times New Roman" w:cs="Times New Roman"/>
-          <w:color w:val="000000"/>
-          <w:kern w:val="0"/>
-          <w:lang w:eastAsia="en-GB"/>
-          <w14:ligatures w14:val="none"/>
-        </w:rPr>
-      </w:pPr>
-      <w:r>
-        <w:rPr>
-          <w:rFonts w:eastAsia="Times New Roman" w:cs="Times New Roman"/>
-          <w:color w:val="000000"/>
-          <w:kern w:val="0"/>
-          <w:lang w:eastAsia="en-GB"/>
-          <w14:ligatures w14:val="none"/>
-        </w:rPr>
-        <w:t xml:space="preserve">Explicit states, reactive avoidance with an odometry backup and constant logging are easy to explain to warehouse staff (Siegwart, Nourbakhsh and </w:t>
-      </w:r>
-      <w:proofErr w:type="spellStart"/>
-      <w:r>
-        <w:rPr>
-          <w:rFonts w:eastAsia="Times New Roman" w:cs="Times New Roman"/>
-          <w:color w:val="000000"/>
-          <w:kern w:val="0"/>
-          <w:lang w:eastAsia="en-GB"/>
-          <w14:ligatures w14:val="none"/>
-        </w:rPr>
-        <w:t>Scaramuzza</w:t>
-      </w:r>
-      <w:proofErr w:type="spellEnd"/>
-      <w:r>
-        <w:rPr>
-          <w:rFonts w:eastAsia="Times New Roman" w:cs="Times New Roman"/>
-          <w:color w:val="000000"/>
-          <w:kern w:val="0"/>
-          <w:lang w:eastAsia="en-GB"/>
-          <w14:ligatures w14:val="none"/>
-        </w:rPr>
-        <w:t>, 2011). The figures in Table 4 are the kind an operator could check.</w:t>
-      </w:r>
-    </w:p>
-    <w:bookmarkEnd w:id="20"/>
-    <w:bookmarkEnd w:id="41"/>
-    <w:p>
-      <w:pPr>
-        <w:spacing w:after="160"/>
-        <w:jc w:val="left"/>
-        <w:rPr>
-          <w:rFonts w:eastAsia="Times New Roman" w:cs="Times New Roman"/>
           <w:b/>
           <w:bCs/>
           <w:color w:val="000000"/>
@@ -14195,16 +14720,46 @@
         </w:rPr>
       </w:pPr>
       <w:r>
-        <w:br w:type="page"/>
-      </w:r>
+        <w:rPr>
+          <w:rFonts w:eastAsia="Times New Roman" w:cs="Times New Roman"/>
+          <w:color w:val="000000"/>
+          <w:kern w:val="0"/>
+          <w:lang w:eastAsia="en-GB"/>
+          <w14:ligatures w14:val="none"/>
+        </w:rPr>
+        <w:t xml:space="preserve">Explicit states, reactive avoidance with an odometry backup and constant logging are easy to explain to warehouse staff (Siegwart, Nourbakhsh and </w:t>
+      </w:r>
+      <w:proofErr w:type="spellStart"/>
+      <w:r>
+        <w:rPr>
+          <w:rFonts w:eastAsia="Times New Roman" w:cs="Times New Roman"/>
+          <w:color w:val="000000"/>
+          <w:kern w:val="0"/>
+          <w:lang w:eastAsia="en-GB"/>
+          <w14:ligatures w14:val="none"/>
+        </w:rPr>
+        <w:t>Scaramuzza</w:t>
+      </w:r>
+      <w:proofErr w:type="spellEnd"/>
+      <w:r>
+        <w:rPr>
+          <w:rFonts w:eastAsia="Times New Roman" w:cs="Times New Roman"/>
+          <w:color w:val="000000"/>
+          <w:kern w:val="0"/>
+          <w:lang w:eastAsia="en-GB"/>
+          <w14:ligatures w14:val="none"/>
+        </w:rPr>
+        <w:t>, 2011). The figures in Table 4 are the kind an operator could check.</w:t>
+      </w:r>
+      <w:bookmarkEnd w:id="20"/>
+      <w:bookmarkEnd w:id="41"/>
     </w:p>
     <w:p>
       <w:pPr>
         <w:pStyle w:val="Heading1"/>
       </w:pPr>
-      <w:bookmarkStart w:id="42" w:name="_Toc241707438"/>
-      <w:r>
-        <w:lastRenderedPageBreak/>
+      <w:bookmarkStart w:id="42" w:name="_Toc241936885"/>
+      <w:r>
         <w:t>Combined Evaluation and Reflection</w:t>
       </w:r>
       <w:bookmarkEnd w:id="42"/>
@@ -14329,7 +14884,7 @@
       <w:pPr>
         <w:pStyle w:val="Heading1"/>
       </w:pPr>
-      <w:bookmarkStart w:id="43" w:name="_Toc241707439"/>
+      <w:bookmarkStart w:id="43" w:name="_Toc241936886"/>
       <w:r>
         <w:lastRenderedPageBreak/>
         <w:t>Concluding Remarks</w:t>
@@ -14458,7 +15013,7 @@
       <w:pPr>
         <w:pStyle w:val="Heading1"/>
       </w:pPr>
-      <w:bookmarkStart w:id="44" w:name="_Toc241707440"/>
+      <w:bookmarkStart w:id="44" w:name="_Toc241936887"/>
       <w:r>
         <w:lastRenderedPageBreak/>
         <w:t>Acknowledgement</w:t>
@@ -14480,27 +15035,43 @@
         <w:rPr>
           <w:rFonts w:cs="Times New Roman"/>
         </w:rPr>
-        <w:t xml:space="preserve">Perplexity AI (2026) was used to </w:t>
-      </w:r>
-      <w:proofErr w:type="spellStart"/>
+        <w:t xml:space="preserve">Perplexity AI (2026) was used </w:t>
+      </w:r>
       <w:r>
         <w:rPr>
           <w:rFonts w:cs="Times New Roman"/>
         </w:rPr>
-        <w:t>to</w:t>
-      </w:r>
-      <w:proofErr w:type="spellEnd"/>
+        <w:t>to support literature searching</w:t>
+      </w:r>
       <w:r>
         <w:rPr>
           <w:rFonts w:cs="Times New Roman"/>
         </w:rPr>
-        <w:t xml:space="preserve"> support literature searching and to identify potentially relevant academic sources</w:t>
+        <w:t>,</w:t>
       </w:r>
       <w:r>
         <w:rPr>
           <w:rFonts w:cs="Times New Roman"/>
         </w:rPr>
-        <w:t xml:space="preserve">. </w:t>
+        <w:t xml:space="preserve"> </w:t>
+      </w:r>
+      <w:r>
+        <w:rPr>
+          <w:rFonts w:cs="Times New Roman"/>
+        </w:rPr>
+        <w:t>identify potentially relevant academic sources, and assist with grammar correction and word-limit reduction during editing.</w:t>
+      </w:r>
+      <w:r>
+        <w:rPr>
+          <w:rFonts w:cs="Times New Roman"/>
+        </w:rPr>
+        <w:t xml:space="preserve"> </w:t>
+      </w:r>
+      <w:r>
+        <w:rPr>
+          <w:rFonts w:cs="Times New Roman"/>
+        </w:rPr>
+        <w:t xml:space="preserve"> </w:t>
       </w:r>
       <w:r>
         <w:rPr>
@@ -14561,7 +15132,7 @@
       <w:pPr>
         <w:pStyle w:val="Heading1"/>
       </w:pPr>
-      <w:bookmarkStart w:id="45" w:name="_Toc241707441"/>
+      <w:bookmarkStart w:id="45" w:name="_Toc241936888"/>
       <w:r>
         <w:lastRenderedPageBreak/>
         <w:t>References</w:t>
@@ -17133,6 +17704,17 @@
       <w:lang w:val="en-GB"/>
     </w:rPr>
   </w:style>
+  <w:style w:type="paragraph" w:styleId="NormalWeb">
+    <w:name w:val="Normal (Web)"/>
+    <w:basedOn w:val="Normal"/>
+    <w:uiPriority w:val="99"/>
+    <w:semiHidden/>
+    <w:unhideWhenUsed/>
+    <w:rsid w:val="00667A64"/>
+    <w:rPr>
+      <w:rFonts w:cs="Times New Roman"/>
+    </w:rPr>
+  </w:style>
 </w:styles>
 </file>
 

</xml_diff>

<commit_message>
Update references in Robotics Software and Programming report: revise access dates for consistency and accuracy.
</commit_message>
<xml_diff>
--- a/Sem2/Robotics Software and Programming/Report.docx
+++ b/Sem2/Robotics Software and Programming/Report.docx
@@ -3224,7 +3224,21 @@
             <w:rStyle w:val="Hyperlink"/>
             <w:noProof/>
           </w:rPr>
-          <w:t>Figure 5: TheConstruct.ai Rosject XctZpczWOA: file explorer, mission_controller.py in the code editor, the live Simulation panel, and monitor_node’s summary stream in the shell.</w:t>
+          <w:t xml:space="preserve">Figure 5: TheConstruct.ai Rosject </w:t>
+        </w:r>
+        <w:r>
+          <w:rPr>
+            <w:rStyle w:val="Hyperlink"/>
+            <w:noProof/>
+          </w:rPr>
+          <w:t>X</w:t>
+        </w:r>
+        <w:r>
+          <w:rPr>
+            <w:rStyle w:val="Hyperlink"/>
+            <w:noProof/>
+          </w:rPr>
+          <w:t>ctZpczWOA: file explorer, mission_controller.py in the code editor, the live Simulation panel, and monitor_node’s summary stream in the shell.</w:t>
         </w:r>
         <w:r>
           <w:rPr>
@@ -15280,27 +15294,27 @@
           <w:lang w:eastAsia="en-GB"/>
           <w14:ligatures w14:val="none"/>
         </w:rPr>
-        <w:t xml:space="preserve"> [Accessed 2</w:t>
-      </w:r>
-      <w:r>
-        <w:rPr>
-          <w:rFonts w:eastAsia="Times New Roman" w:cs="Times New Roman"/>
-          <w:color w:val="000000"/>
-          <w:kern w:val="0"/>
-          <w:lang w:eastAsia="en-GB"/>
-          <w14:ligatures w14:val="none"/>
-        </w:rPr>
-        <w:t>0</w:t>
-      </w:r>
-      <w:r>
-        <w:rPr>
-          <w:rFonts w:eastAsia="Times New Roman" w:cs="Times New Roman"/>
-          <w:color w:val="000000"/>
-          <w:kern w:val="0"/>
-          <w:lang w:eastAsia="en-GB"/>
-          <w14:ligatures w14:val="none"/>
-        </w:rPr>
-        <w:t xml:space="preserve"> September 2026]</w:t>
+        <w:t xml:space="preserve"> [</w:t>
+      </w:r>
+      <w:r>
+        <w:rPr>
+          <w:rFonts w:eastAsia="Times New Roman" w:cs="Times New Roman"/>
+          <w:color w:val="000000"/>
+          <w:kern w:val="0"/>
+          <w:lang w:eastAsia="en-GB"/>
+          <w14:ligatures w14:val="none"/>
+        </w:rPr>
+        <w:t>Accessed 08 October 2026</w:t>
+      </w:r>
+      <w:r>
+        <w:rPr>
+          <w:rFonts w:eastAsia="Times New Roman" w:cs="Times New Roman"/>
+          <w:color w:val="000000"/>
+          <w:kern w:val="0"/>
+          <w:lang w:eastAsia="en-GB"/>
+          <w14:ligatures w14:val="none"/>
+        </w:rPr>
+        <w:t>]</w:t>
       </w:r>
     </w:p>
     <w:p>
@@ -15366,7 +15380,27 @@
           <w:lang w:eastAsia="en-GB"/>
           <w14:ligatures w14:val="none"/>
         </w:rPr>
-        <w:t xml:space="preserve"> [Accessed 20 September 2026]</w:t>
+        <w:t xml:space="preserve"> [</w:t>
+      </w:r>
+      <w:r>
+        <w:rPr>
+          <w:rFonts w:eastAsia="Times New Roman" w:cs="Times New Roman"/>
+          <w:color w:val="000000"/>
+          <w:kern w:val="0"/>
+          <w:lang w:eastAsia="en-GB"/>
+          <w14:ligatures w14:val="none"/>
+        </w:rPr>
+        <w:t>Accessed 08 October 2026</w:t>
+      </w:r>
+      <w:r>
+        <w:rPr>
+          <w:rFonts w:eastAsia="Times New Roman" w:cs="Times New Roman"/>
+          <w:color w:val="000000"/>
+          <w:kern w:val="0"/>
+          <w:lang w:eastAsia="en-GB"/>
+          <w14:ligatures w14:val="none"/>
+        </w:rPr>
+        <w:t>]</w:t>
       </w:r>
     </w:p>
     <w:p>
@@ -15444,27 +15478,27 @@
           <w:lang w:eastAsia="en-GB"/>
           <w14:ligatures w14:val="none"/>
         </w:rPr>
-        <w:t xml:space="preserve"> [Accessed 2</w:t>
-      </w:r>
-      <w:r>
-        <w:rPr>
-          <w:rFonts w:eastAsia="Times New Roman" w:cs="Times New Roman"/>
-          <w:color w:val="000000"/>
-          <w:kern w:val="0"/>
-          <w:lang w:eastAsia="en-GB"/>
-          <w14:ligatures w14:val="none"/>
-        </w:rPr>
-        <w:t>0</w:t>
-      </w:r>
-      <w:r>
-        <w:rPr>
-          <w:rFonts w:eastAsia="Times New Roman" w:cs="Times New Roman"/>
-          <w:color w:val="000000"/>
-          <w:kern w:val="0"/>
-          <w:lang w:eastAsia="en-GB"/>
-          <w14:ligatures w14:val="none"/>
-        </w:rPr>
-        <w:t xml:space="preserve"> September 2026]</w:t>
+        <w:t xml:space="preserve"> [</w:t>
+      </w:r>
+      <w:r>
+        <w:rPr>
+          <w:rFonts w:eastAsia="Times New Roman" w:cs="Times New Roman"/>
+          <w:color w:val="000000"/>
+          <w:kern w:val="0"/>
+          <w:lang w:eastAsia="en-GB"/>
+          <w14:ligatures w14:val="none"/>
+        </w:rPr>
+        <w:t>Accessed 08 October 2026</w:t>
+      </w:r>
+      <w:r>
+        <w:rPr>
+          <w:rFonts w:eastAsia="Times New Roman" w:cs="Times New Roman"/>
+          <w:color w:val="000000"/>
+          <w:kern w:val="0"/>
+          <w:lang w:eastAsia="en-GB"/>
+          <w14:ligatures w14:val="none"/>
+        </w:rPr>
+        <w:t>]</w:t>
       </w:r>
     </w:p>
     <w:p>
@@ -15616,7 +15650,27 @@
           <w:lang w:eastAsia="en-GB"/>
           <w14:ligatures w14:val="none"/>
         </w:rPr>
-        <w:t xml:space="preserve"> [Accessed 20 September 2026]</w:t>
+        <w:t xml:space="preserve"> [</w:t>
+      </w:r>
+      <w:r>
+        <w:rPr>
+          <w:rFonts w:eastAsia="Times New Roman" w:cs="Times New Roman"/>
+          <w:color w:val="000000"/>
+          <w:kern w:val="0"/>
+          <w:lang w:eastAsia="en-GB"/>
+          <w14:ligatures w14:val="none"/>
+        </w:rPr>
+        <w:t>Accessed 08 October 2026</w:t>
+      </w:r>
+      <w:r>
+        <w:rPr>
+          <w:rFonts w:eastAsia="Times New Roman" w:cs="Times New Roman"/>
+          <w:color w:val="000000"/>
+          <w:kern w:val="0"/>
+          <w:lang w:eastAsia="en-GB"/>
+          <w14:ligatures w14:val="none"/>
+        </w:rPr>
+        <w:t>]</w:t>
       </w:r>
     </w:p>
     <w:p>
@@ -15660,7 +15714,27 @@
           <w:lang w:eastAsia="en-GB"/>
           <w14:ligatures w14:val="none"/>
         </w:rPr>
-        <w:t xml:space="preserve"> [Accessed 20 September 2026]</w:t>
+        <w:t xml:space="preserve"> [</w:t>
+      </w:r>
+      <w:r>
+        <w:rPr>
+          <w:rFonts w:eastAsia="Times New Roman" w:cs="Times New Roman"/>
+          <w:color w:val="000000"/>
+          <w:kern w:val="0"/>
+          <w:lang w:eastAsia="en-GB"/>
+          <w14:ligatures w14:val="none"/>
+        </w:rPr>
+        <w:t>Accessed 08 October 2026</w:t>
+      </w:r>
+      <w:r>
+        <w:rPr>
+          <w:rFonts w:eastAsia="Times New Roman" w:cs="Times New Roman"/>
+          <w:color w:val="000000"/>
+          <w:kern w:val="0"/>
+          <w:lang w:eastAsia="en-GB"/>
+          <w14:ligatures w14:val="none"/>
+        </w:rPr>
+        <w:t>]</w:t>
       </w:r>
     </w:p>
     <w:p>
@@ -15700,19 +15774,19 @@
         <w:rPr>
           <w:rFonts w:ascii="Times New Roman" w:hAnsi="Times New Roman" w:cs="Times New Roman"/>
         </w:rPr>
-        <w:t xml:space="preserve"> [online] Available from https://www.perplexity.ai [Accessed </w:t>
+        <w:t xml:space="preserve"> [online] Available from https://www.perplexity.ai [</w:t>
       </w:r>
       <w:r>
         <w:rPr>
           <w:rFonts w:ascii="Times New Roman" w:hAnsi="Times New Roman" w:cs="Times New Roman"/>
         </w:rPr>
-        <w:t>20</w:t>
+        <w:t>Accessed 08 October 2026</w:t>
       </w:r>
       <w:r>
         <w:rPr>
           <w:rFonts w:ascii="Times New Roman" w:hAnsi="Times New Roman" w:cs="Times New Roman"/>
         </w:rPr>
-        <w:t xml:space="preserve"> September 2026]</w:t>
+        <w:t>]</w:t>
       </w:r>
     </w:p>
     <w:p>
@@ -15797,7 +15871,23 @@
           <w:color w:val="000000"/>
           <w:lang w:eastAsia="en-GB"/>
         </w:rPr>
-        <w:t xml:space="preserve"> [Accessed 20 September 2026]</w:t>
+        <w:t xml:space="preserve"> [</w:t>
+      </w:r>
+      <w:r>
+        <w:rPr>
+          <w:rFonts w:ascii="Times New Roman" w:eastAsia="Times New Roman" w:hAnsi="Times New Roman" w:cs="Times New Roman"/>
+          <w:color w:val="000000"/>
+          <w:lang w:eastAsia="en-GB"/>
+        </w:rPr>
+        <w:t>Accessed 08 October 2026</w:t>
+      </w:r>
+      <w:r>
+        <w:rPr>
+          <w:rFonts w:ascii="Times New Roman" w:eastAsia="Times New Roman" w:hAnsi="Times New Roman" w:cs="Times New Roman"/>
+          <w:color w:val="000000"/>
+          <w:lang w:eastAsia="en-GB"/>
+        </w:rPr>
+        <w:t>]</w:t>
       </w:r>
     </w:p>
     <w:p>
@@ -15863,7 +15953,27 @@
           <w:lang w:eastAsia="en-GB"/>
           <w14:ligatures w14:val="none"/>
         </w:rPr>
-        <w:t xml:space="preserve"> [Accessed 20 September 2026]</w:t>
+        <w:t xml:space="preserve"> [</w:t>
+      </w:r>
+      <w:r>
+        <w:rPr>
+          <w:rFonts w:eastAsia="Times New Roman" w:cs="Times New Roman"/>
+          <w:color w:val="000000"/>
+          <w:kern w:val="0"/>
+          <w:lang w:eastAsia="en-GB"/>
+          <w14:ligatures w14:val="none"/>
+        </w:rPr>
+        <w:t>Accessed 08 October 2026</w:t>
+      </w:r>
+      <w:r>
+        <w:rPr>
+          <w:rFonts w:eastAsia="Times New Roman" w:cs="Times New Roman"/>
+          <w:color w:val="000000"/>
+          <w:kern w:val="0"/>
+          <w:lang w:eastAsia="en-GB"/>
+          <w14:ligatures w14:val="none"/>
+        </w:rPr>
+        <w:t>]</w:t>
       </w:r>
     </w:p>
     <w:p>
@@ -15963,7 +16073,27 @@
           <w:lang w:eastAsia="en-GB"/>
           <w14:ligatures w14:val="none"/>
         </w:rPr>
-        <w:t xml:space="preserve"> [Accessed 20 September 2026]</w:t>
+        <w:t xml:space="preserve"> [</w:t>
+      </w:r>
+      <w:r>
+        <w:rPr>
+          <w:rFonts w:eastAsia="Times New Roman" w:cs="Times New Roman"/>
+          <w:color w:val="000000"/>
+          <w:kern w:val="0"/>
+          <w:lang w:eastAsia="en-GB"/>
+          <w14:ligatures w14:val="none"/>
+        </w:rPr>
+        <w:t>Accessed 08 October 2026</w:t>
+      </w:r>
+      <w:r>
+        <w:rPr>
+          <w:rFonts w:eastAsia="Times New Roman" w:cs="Times New Roman"/>
+          <w:color w:val="000000"/>
+          <w:kern w:val="0"/>
+          <w:lang w:eastAsia="en-GB"/>
+          <w14:ligatures w14:val="none"/>
+        </w:rPr>
+        <w:t>]</w:t>
       </w:r>
     </w:p>
     <w:sectPr>

</xml_diff>